<commit_message>
planning - add frontend
</commit_message>
<xml_diff>
--- a/planning.docx
+++ b/planning.docx
@@ -72,6 +72,7 @@
           <w:rtl/>
         </w:rPr>
       </w:pPr>
+      <w:proofErr w:type="spellStart"/>
       <w:r>
         <w:rPr>
           <w:rFonts w:asciiTheme="minorBidi" w:hAnsiTheme="minorBidi"/>
@@ -83,6 +84,7 @@
         </w:rPr>
         <w:t>SportShop</w:t>
       </w:r>
+      <w:proofErr w:type="spellEnd"/>
       <w:r>
         <w:rPr>
           <w:rFonts w:asciiTheme="minorBidi" w:hAnsiTheme="minorBidi"/>
@@ -349,12 +351,14 @@
           <w:rtl/>
         </w:rPr>
       </w:pPr>
+      <w:proofErr w:type="spellStart"/>
       <w:r>
         <w:rPr>
           <w:rFonts w:ascii="David" w:hAnsi="David" w:cs="David"/>
         </w:rPr>
         <w:t>SportShop</w:t>
       </w:r>
+      <w:proofErr w:type="spellEnd"/>
       <w:r>
         <w:rPr>
           <w:rFonts w:ascii="David" w:hAnsi="David" w:cs="David"/>
@@ -2231,11 +2235,19 @@
           <w:rFonts w:ascii="David" w:hAnsi="David" w:cs="David"/>
         </w:rPr>
       </w:pPr>
-      <w:r>
-        <w:rPr>
-          <w:rFonts w:ascii="David" w:hAnsi="David" w:cs="David"/>
-        </w:rPr>
-        <w:t>Bcrypt + JWT + Refresh Tokens</w:t>
+      <w:proofErr w:type="spellStart"/>
+      <w:r>
+        <w:rPr>
+          <w:rFonts w:ascii="David" w:hAnsi="David" w:cs="David"/>
+        </w:rPr>
+        <w:t>Bcrypt</w:t>
+      </w:r>
+      <w:proofErr w:type="spellEnd"/>
+      <w:r>
+        <w:rPr>
+          <w:rFonts w:ascii="David" w:hAnsi="David" w:cs="David"/>
+        </w:rPr>
+        <w:t xml:space="preserve"> + JWT + Refresh Tokens</w:t>
       </w:r>
       <w:r>
         <w:rPr>
@@ -3941,12 +3953,14 @@
         </w:rPr>
         <w:t xml:space="preserve">מכיל את </w:t>
       </w:r>
+      <w:proofErr w:type="spellStart"/>
       <w:r>
         <w:rPr>
           <w:rFonts w:ascii="David" w:hAnsi="David" w:cs="David"/>
         </w:rPr>
         <w:t>application.yaml</w:t>
       </w:r>
+      <w:proofErr w:type="spellEnd"/>
       <w:r>
         <w:rPr>
           <w:rFonts w:ascii="David" w:hAnsi="David" w:cs="David" w:hint="cs"/>
@@ -3992,12 +4006,14 @@
         </w:rPr>
         <w:t xml:space="preserve"> (</w:t>
       </w:r>
+      <w:proofErr w:type="spellStart"/>
       <w:r>
         <w:rPr>
           <w:rFonts w:ascii="David" w:hAnsi="David" w:cs="David"/>
         </w:rPr>
         <w:t>messages.properties</w:t>
       </w:r>
+      <w:proofErr w:type="spellEnd"/>
       <w:r>
         <w:rPr>
           <w:rFonts w:ascii="David" w:hAnsi="David" w:cs="David" w:hint="cs"/>
@@ -4196,12 +4212,14 @@
           <w:rFonts w:ascii="David" w:hAnsi="David" w:cs="David"/>
         </w:rPr>
       </w:pPr>
+      <w:proofErr w:type="spellStart"/>
       <w:r>
         <w:rPr>
           <w:rFonts w:ascii="David" w:hAnsi="David" w:cs="David"/>
         </w:rPr>
         <w:t>Dockerfile</w:t>
       </w:r>
+      <w:proofErr w:type="spellEnd"/>
       <w:r>
         <w:rPr>
           <w:rFonts w:ascii="David" w:hAnsi="David" w:cs="David" w:hint="cs"/>
@@ -4276,12 +4294,28 @@
           <w:rFonts w:ascii="David" w:hAnsi="David" w:cs="David"/>
         </w:rPr>
       </w:pPr>
-      <w:r>
-        <w:rPr>
-          <w:rFonts w:ascii="David" w:hAnsi="David" w:cs="David"/>
-        </w:rPr>
-        <w:t>.env.example</w:t>
-      </w:r>
+      <w:proofErr w:type="gramStart"/>
+      <w:r>
+        <w:rPr>
+          <w:rFonts w:ascii="David" w:hAnsi="David" w:cs="David"/>
+        </w:rPr>
+        <w:t>.</w:t>
+      </w:r>
+      <w:proofErr w:type="spellStart"/>
+      <w:r>
+        <w:rPr>
+          <w:rFonts w:ascii="David" w:hAnsi="David" w:cs="David"/>
+        </w:rPr>
+        <w:t>env</w:t>
+      </w:r>
+      <w:proofErr w:type="gramEnd"/>
+      <w:r>
+        <w:rPr>
+          <w:rFonts w:ascii="David" w:hAnsi="David" w:cs="David"/>
+        </w:rPr>
+        <w:t>.example</w:t>
+      </w:r>
+      <w:proofErr w:type="spellEnd"/>
       <w:r>
         <w:rPr>
           <w:rFonts w:ascii="David" w:hAnsi="David" w:cs="David" w:hint="cs"/>
@@ -4321,8 +4355,30 @@
         <w:rPr>
           <w:rFonts w:ascii="David" w:hAnsi="David" w:cs="David"/>
         </w:rPr>
-        <w:t>.github\workflows\release.yml</w:t>
-      </w:r>
+        <w:t>.</w:t>
+      </w:r>
+      <w:proofErr w:type="spellStart"/>
+      <w:r>
+        <w:rPr>
+          <w:rFonts w:ascii="David" w:hAnsi="David" w:cs="David"/>
+        </w:rPr>
+        <w:t>github</w:t>
+      </w:r>
+      <w:proofErr w:type="spellEnd"/>
+      <w:r>
+        <w:rPr>
+          <w:rFonts w:ascii="David" w:hAnsi="David" w:cs="David"/>
+        </w:rPr>
+        <w:t>\workflows\</w:t>
+      </w:r>
+      <w:proofErr w:type="spellStart"/>
+      <w:r>
+        <w:rPr>
+          <w:rFonts w:ascii="David" w:hAnsi="David" w:cs="David"/>
+        </w:rPr>
+        <w:t>release.yml</w:t>
+      </w:r>
+      <w:proofErr w:type="spellEnd"/>
       <w:r>
         <w:rPr>
           <w:rFonts w:ascii="David" w:hAnsi="David" w:cs="David" w:hint="cs"/>
@@ -4737,12 +4793,14 @@
         </w:rPr>
         <w:t xml:space="preserve"> השונים בתוך ה</w:t>
       </w:r>
+      <w:proofErr w:type="spellStart"/>
       <w:r>
         <w:rPr>
           <w:rFonts w:ascii="David" w:hAnsi="David" w:cs="David"/>
         </w:rPr>
         <w:t>application.yaml</w:t>
       </w:r>
+      <w:proofErr w:type="spellEnd"/>
       <w:r>
         <w:rPr>
           <w:rFonts w:ascii="David" w:hAnsi="David" w:cs="David" w:hint="cs"/>
@@ -4771,12 +4829,14 @@
           <w:rFonts w:ascii="David" w:hAnsi="David" w:cs="David"/>
         </w:rPr>
       </w:pPr>
+      <w:proofErr w:type="spellStart"/>
       <w:r>
         <w:rPr>
           <w:rFonts w:ascii="David" w:hAnsi="David" w:cs="David"/>
         </w:rPr>
         <w:t>SeedImagesBootstrap</w:t>
       </w:r>
+      <w:proofErr w:type="spellEnd"/>
       <w:r>
         <w:rPr>
           <w:rFonts w:ascii="David" w:hAnsi="David" w:cs="David" w:hint="cs"/>
@@ -4832,12 +4892,14 @@
           <w:rFonts w:ascii="David" w:hAnsi="David" w:cs="David"/>
         </w:rPr>
       </w:pPr>
+      <w:proofErr w:type="spellStart"/>
       <w:r>
         <w:rPr>
           <w:rFonts w:ascii="David" w:hAnsi="David" w:cs="David"/>
         </w:rPr>
         <w:t>ImageResponseHeadersFilter</w:t>
       </w:r>
+      <w:proofErr w:type="spellEnd"/>
       <w:r>
         <w:rPr>
           <w:rFonts w:ascii="David" w:hAnsi="David" w:cs="David" w:hint="cs"/>
@@ -4893,12 +4955,14 @@
           <w:rFonts w:ascii="David" w:hAnsi="David" w:cs="David"/>
         </w:rPr>
       </w:pPr>
+      <w:proofErr w:type="spellStart"/>
       <w:r>
         <w:rPr>
           <w:rFonts w:ascii="David" w:hAnsi="David" w:cs="David"/>
         </w:rPr>
         <w:t>TraceIdResponseHeaderFilter</w:t>
       </w:r>
+      <w:proofErr w:type="spellEnd"/>
       <w:r>
         <w:rPr>
           <w:rFonts w:ascii="David" w:hAnsi="David" w:cs="David" w:hint="cs"/>
@@ -4986,12 +5050,14 @@
           <w:rFonts w:ascii="David" w:hAnsi="David" w:cs="David"/>
         </w:rPr>
       </w:pPr>
+      <w:proofErr w:type="spellStart"/>
       <w:r>
         <w:rPr>
           <w:rFonts w:ascii="David" w:hAnsi="David" w:cs="David"/>
         </w:rPr>
         <w:t>SecurityConfig</w:t>
       </w:r>
+      <w:proofErr w:type="spellEnd"/>
       <w:r>
         <w:rPr>
           <w:rFonts w:ascii="David" w:hAnsi="David" w:cs="David" w:hint="cs"/>
@@ -5093,12 +5159,14 @@
           <w:rFonts w:ascii="David" w:hAnsi="David" w:cs="David"/>
         </w:rPr>
       </w:pPr>
+      <w:proofErr w:type="spellStart"/>
       <w:r>
         <w:rPr>
           <w:rFonts w:ascii="David" w:hAnsi="David" w:cs="David"/>
         </w:rPr>
         <w:t>WebMvcConfig</w:t>
       </w:r>
+      <w:proofErr w:type="spellEnd"/>
       <w:r>
         <w:rPr>
           <w:rFonts w:ascii="David" w:hAnsi="David" w:cs="David" w:hint="cs"/>
@@ -5131,26 +5199,41 @@
           <w:rFonts w:ascii="David" w:hAnsi="David" w:cs="David" w:hint="cs"/>
           <w:rtl/>
         </w:rPr>
-        <w:t xml:space="preserve"> +</w:t>
-      </w:r>
-      <w:r>
-        <w:rPr>
-          <w:rFonts w:ascii="David" w:hAnsi="David" w:cs="David"/>
-        </w:rPr>
-        <w:t xml:space="preserve"> </w:t>
-      </w:r>
-      <w:r>
-        <w:rPr>
-          <w:rFonts w:ascii="David" w:hAnsi="David" w:cs="David" w:hint="cs"/>
-          <w:rtl/>
-        </w:rPr>
-        <w:t xml:space="preserve"> </w:t>
-      </w:r>
-      <w:r>
-        <w:rPr>
-          <w:rFonts w:ascii="David" w:hAnsi="David" w:cs="David"/>
-        </w:rPr>
-        <w:t>RESOURCE HANDLER</w:t>
+        <w:t xml:space="preserve"> </w:t>
+      </w:r>
+      <w:proofErr w:type="gramStart"/>
+      <w:r>
+        <w:rPr>
+          <w:rFonts w:ascii="David" w:hAnsi="David" w:cs="David" w:hint="cs"/>
+          <w:rtl/>
+        </w:rPr>
+        <w:t>+</w:t>
+      </w:r>
+      <w:r>
+        <w:rPr>
+          <w:rFonts w:ascii="David" w:hAnsi="David" w:cs="David"/>
+        </w:rPr>
+        <w:t xml:space="preserve"> </w:t>
+      </w:r>
+      <w:r>
+        <w:rPr>
+          <w:rFonts w:ascii="David" w:hAnsi="David" w:cs="David" w:hint="cs"/>
+          <w:rtl/>
+        </w:rPr>
+        <w:t xml:space="preserve"> </w:t>
+      </w:r>
+      <w:r>
+        <w:rPr>
+          <w:rFonts w:ascii="David" w:hAnsi="David" w:cs="David"/>
+        </w:rPr>
+        <w:t>RESOURCE</w:t>
+      </w:r>
+      <w:proofErr w:type="gramEnd"/>
+      <w:r>
+        <w:rPr>
+          <w:rFonts w:ascii="David" w:hAnsi="David" w:cs="David"/>
+        </w:rPr>
+        <w:t xml:space="preserve"> HANDLER</w:t>
       </w:r>
       <w:r>
         <w:rPr>
@@ -5513,12 +5596,14 @@
           <w:bCs/>
         </w:rPr>
       </w:pPr>
+      <w:proofErr w:type="spellStart"/>
       <w:r>
         <w:rPr>
           <w:rFonts w:ascii="David" w:hAnsi="David" w:cs="David"/>
         </w:rPr>
         <w:t>ApiError</w:t>
       </w:r>
+      <w:proofErr w:type="spellEnd"/>
       <w:r>
         <w:rPr>
           <w:rFonts w:ascii="David" w:hAnsi="David" w:cs="David" w:hint="cs"/>
@@ -5553,12 +5638,14 @@
           <w:rFonts w:ascii="David" w:hAnsi="David" w:cs="David"/>
         </w:rPr>
       </w:pPr>
+      <w:proofErr w:type="spellStart"/>
       <w:r>
         <w:rPr>
           <w:rFonts w:ascii="David" w:hAnsi="David" w:cs="David"/>
         </w:rPr>
         <w:t>GlobalExceptionHandler</w:t>
       </w:r>
+      <w:proofErr w:type="spellEnd"/>
       <w:r>
         <w:rPr>
           <w:rFonts w:ascii="David" w:hAnsi="David" w:cs="David" w:hint="cs"/>
@@ -5607,12 +5694,14 @@
         </w:rPr>
         <w:t xml:space="preserve"> ובעוד תקלות שונות + טיפול גנרי לתפיסת כלל התקלות באמצעות מתודת </w:t>
       </w:r>
+      <w:proofErr w:type="spellStart"/>
       <w:r>
         <w:rPr>
           <w:rFonts w:ascii="David" w:hAnsi="David" w:cs="David"/>
         </w:rPr>
         <w:t>handleAny</w:t>
       </w:r>
+      <w:proofErr w:type="spellEnd"/>
       <w:r>
         <w:rPr>
           <w:rFonts w:ascii="David" w:hAnsi="David" w:cs="David" w:hint="cs"/>
@@ -5631,7 +5720,7 @@
         <w:bidi/>
         <w:spacing w:line="276" w:lineRule="auto"/>
         <w:rPr>
-          <w:rFonts w:ascii="David" w:hAnsi="David" w:cs="David" w:hint="cs"/>
+          <w:rFonts w:ascii="David" w:hAnsi="David" w:cs="David"/>
           <w:rtl/>
         </w:rPr>
       </w:pPr>
@@ -6370,12 +6459,14 @@
         </w:rPr>
         <w:t xml:space="preserve"> ל</w:t>
       </w:r>
+      <w:proofErr w:type="spellStart"/>
       <w:r>
         <w:rPr>
           <w:rFonts w:ascii="David" w:hAnsi="David" w:cs="David"/>
         </w:rPr>
         <w:t>UsernamePasswordAuthenticationToken</w:t>
       </w:r>
+      <w:proofErr w:type="spellEnd"/>
       <w:r>
         <w:rPr>
           <w:rFonts w:ascii="David" w:hAnsi="David" w:cs="David" w:hint="cs"/>
@@ -6414,7 +6505,7 @@
         <w:bidi/>
         <w:spacing w:line="276" w:lineRule="auto"/>
         <w:rPr>
-          <w:rFonts w:ascii="David" w:hAnsi="David" w:cs="David" w:hint="cs"/>
+          <w:rFonts w:ascii="David" w:hAnsi="David" w:cs="David"/>
           <w:rtl/>
         </w:rPr>
       </w:pPr>
@@ -6506,12 +6597,14 @@
           <w:rFonts w:ascii="David" w:hAnsi="David" w:cs="David"/>
         </w:rPr>
       </w:pPr>
+      <w:proofErr w:type="spellStart"/>
       <w:r>
         <w:rPr>
           <w:rFonts w:ascii="David" w:hAnsi="David" w:cs="David"/>
         </w:rPr>
         <w:t>AuthService</w:t>
       </w:r>
+      <w:proofErr w:type="spellEnd"/>
       <w:r>
         <w:rPr>
           <w:rFonts w:ascii="David" w:hAnsi="David" w:cs="David" w:hint="cs"/>
@@ -6606,12 +6699,14 @@
           <w:rFonts w:ascii="David" w:hAnsi="David" w:cs="David"/>
         </w:rPr>
       </w:pPr>
+      <w:proofErr w:type="spellStart"/>
       <w:r>
         <w:rPr>
           <w:rFonts w:ascii="David" w:hAnsi="David" w:cs="David"/>
         </w:rPr>
         <w:t>CartService</w:t>
       </w:r>
+      <w:proofErr w:type="spellEnd"/>
       <w:r>
         <w:rPr>
           <w:rFonts w:ascii="David" w:hAnsi="David" w:cs="David" w:hint="cs"/>
@@ -6744,12 +6839,14 @@
           <w:rFonts w:ascii="David" w:hAnsi="David" w:cs="David"/>
         </w:rPr>
       </w:pPr>
+      <w:proofErr w:type="spellStart"/>
       <w:r>
         <w:rPr>
           <w:rFonts w:ascii="David" w:hAnsi="David" w:cs="David"/>
         </w:rPr>
         <w:t>CheckoutService</w:t>
       </w:r>
+      <w:proofErr w:type="spellEnd"/>
       <w:r>
         <w:rPr>
           <w:rFonts w:ascii="David" w:hAnsi="David" w:cs="David" w:hint="cs"/>
@@ -6867,12 +6964,14 @@
           <w:rFonts w:ascii="David" w:hAnsi="David" w:cs="David"/>
         </w:rPr>
       </w:pPr>
+      <w:proofErr w:type="spellStart"/>
       <w:r>
         <w:rPr>
           <w:rFonts w:ascii="David" w:hAnsi="David" w:cs="David"/>
         </w:rPr>
         <w:t>CookieService</w:t>
       </w:r>
+      <w:proofErr w:type="spellEnd"/>
       <w:r>
         <w:rPr>
           <w:rFonts w:ascii="David" w:hAnsi="David" w:cs="David" w:hint="cs"/>
@@ -6947,12 +7046,14 @@
           <w:rFonts w:ascii="David" w:hAnsi="David" w:cs="David"/>
         </w:rPr>
       </w:pPr>
+      <w:proofErr w:type="spellStart"/>
       <w:r>
         <w:rPr>
           <w:rFonts w:ascii="David" w:hAnsi="David" w:cs="David"/>
         </w:rPr>
         <w:t>ImageStorageService</w:t>
       </w:r>
+      <w:proofErr w:type="spellEnd"/>
       <w:r>
         <w:rPr>
           <w:rFonts w:ascii="David" w:hAnsi="David" w:cs="David" w:hint="cs"/>
@@ -7027,12 +7128,14 @@
         </w:rPr>
         <w:t xml:space="preserve">, ווידוא תוכן ע"י מחלקת עזר </w:t>
       </w:r>
+      <w:proofErr w:type="spellStart"/>
       <w:r>
         <w:rPr>
           <w:rFonts w:ascii="David" w:hAnsi="David" w:cs="David"/>
         </w:rPr>
         <w:t>ImageMimeDetector</w:t>
       </w:r>
+      <w:proofErr w:type="spellEnd"/>
       <w:r>
         <w:rPr>
           <w:rFonts w:ascii="David" w:hAnsi="David" w:cs="David" w:hint="cs"/>
@@ -7054,12 +7157,14 @@
           <w:rFonts w:ascii="David" w:hAnsi="David" w:cs="David"/>
         </w:rPr>
       </w:pPr>
+      <w:proofErr w:type="spellStart"/>
       <w:r>
         <w:rPr>
           <w:rFonts w:ascii="David" w:hAnsi="David" w:cs="David"/>
         </w:rPr>
         <w:t>JwtService</w:t>
       </w:r>
+      <w:proofErr w:type="spellEnd"/>
       <w:r>
         <w:rPr>
           <w:rFonts w:ascii="David" w:hAnsi="David" w:cs="David" w:hint="cs"/>
@@ -7121,12 +7226,14 @@
           <w:rFonts w:ascii="David" w:hAnsi="David" w:cs="David"/>
         </w:rPr>
       </w:pPr>
+      <w:proofErr w:type="spellStart"/>
       <w:r>
         <w:rPr>
           <w:rFonts w:ascii="David" w:hAnsi="David" w:cs="David"/>
         </w:rPr>
         <w:t>MockPaymentProcessor</w:t>
       </w:r>
+      <w:proofErr w:type="spellEnd"/>
       <w:r>
         <w:rPr>
           <w:rFonts w:ascii="David" w:hAnsi="David" w:cs="David" w:hint="cs"/>
@@ -7189,12 +7296,14 @@
           <w:rFonts w:ascii="David" w:hAnsi="David" w:cs="David"/>
         </w:rPr>
       </w:pPr>
+      <w:proofErr w:type="spellStart"/>
       <w:r>
         <w:rPr>
           <w:rFonts w:ascii="David" w:hAnsi="David" w:cs="David"/>
         </w:rPr>
         <w:t>OrderNumberGenerator</w:t>
       </w:r>
+      <w:proofErr w:type="spellEnd"/>
       <w:r>
         <w:rPr>
           <w:rFonts w:ascii="David" w:hAnsi="David" w:cs="David" w:hint="cs"/>
@@ -7230,12 +7339,14 @@
           <w:rFonts w:ascii="David" w:hAnsi="David" w:cs="David"/>
         </w:rPr>
       </w:pPr>
+      <w:proofErr w:type="spellStart"/>
       <w:r>
         <w:rPr>
           <w:rFonts w:ascii="David" w:hAnsi="David" w:cs="David"/>
         </w:rPr>
         <w:t>OrderService</w:t>
       </w:r>
+      <w:proofErr w:type="spellEnd"/>
       <w:r>
         <w:rPr>
           <w:rFonts w:ascii="David" w:hAnsi="David" w:cs="David" w:hint="cs"/>
@@ -7271,12 +7382,14 @@
           <w:rFonts w:ascii="David" w:hAnsi="David" w:cs="David"/>
         </w:rPr>
       </w:pPr>
+      <w:proofErr w:type="spellStart"/>
       <w:r>
         <w:rPr>
           <w:rFonts w:ascii="David" w:hAnsi="David" w:cs="David"/>
         </w:rPr>
         <w:t>PaginationService</w:t>
       </w:r>
+      <w:proofErr w:type="spellEnd"/>
       <w:r>
         <w:rPr>
           <w:rFonts w:ascii="David" w:hAnsi="David" w:cs="David" w:hint="cs"/>
@@ -7325,12 +7438,14 @@
           <w:rFonts w:ascii="David" w:hAnsi="David" w:cs="David"/>
         </w:rPr>
       </w:pPr>
+      <w:proofErr w:type="spellStart"/>
       <w:r>
         <w:rPr>
           <w:rFonts w:ascii="David" w:hAnsi="David" w:cs="David"/>
         </w:rPr>
         <w:t>ProductService</w:t>
       </w:r>
+      <w:proofErr w:type="spellEnd"/>
       <w:r>
         <w:rPr>
           <w:rFonts w:ascii="David" w:hAnsi="David" w:cs="David" w:hint="cs"/>
@@ -7393,12 +7508,14 @@
           <w:rFonts w:ascii="David" w:hAnsi="David" w:cs="David"/>
         </w:rPr>
       </w:pPr>
+      <w:proofErr w:type="spellStart"/>
       <w:r>
         <w:rPr>
           <w:rFonts w:ascii="David" w:hAnsi="David" w:cs="David"/>
         </w:rPr>
         <w:t>StockService</w:t>
       </w:r>
+      <w:proofErr w:type="spellEnd"/>
       <w:r>
         <w:rPr>
           <w:rFonts w:ascii="David" w:hAnsi="David" w:cs="David" w:hint="cs"/>
@@ -7476,12 +7593,14 @@
           <w:rFonts w:ascii="David" w:hAnsi="David" w:cs="David"/>
         </w:rPr>
       </w:pPr>
+      <w:proofErr w:type="spellStart"/>
       <w:r>
         <w:rPr>
           <w:rFonts w:ascii="David" w:hAnsi="David" w:cs="David"/>
         </w:rPr>
         <w:t>UserService</w:t>
       </w:r>
+      <w:proofErr w:type="spellEnd"/>
       <w:r>
         <w:rPr>
           <w:rFonts w:ascii="David" w:hAnsi="David" w:cs="David" w:hint="cs"/>
@@ -7587,6 +7706,7 @@
         </w:rPr>
         <w:t xml:space="preserve"> </w:t>
       </w:r>
+      <w:proofErr w:type="spellStart"/>
       <w:r>
         <w:rPr>
           <w:rFonts w:ascii="David" w:hAnsi="David" w:cs="David"/>
@@ -7595,6 +7715,7 @@
         </w:rPr>
         <w:t>SportshopApplication</w:t>
       </w:r>
+      <w:proofErr w:type="spellEnd"/>
       <w:r>
         <w:rPr>
           <w:rFonts w:ascii="David" w:hAnsi="David" w:cs="David" w:hint="cs"/>
@@ -7697,8 +7818,30 @@
         <w:rPr>
           <w:rFonts w:ascii="David" w:hAnsi="David" w:cs="David"/>
         </w:rPr>
-        <w:t>.github\workflows\release.yml</w:t>
-      </w:r>
+        <w:t>.</w:t>
+      </w:r>
+      <w:proofErr w:type="spellStart"/>
+      <w:r>
+        <w:rPr>
+          <w:rFonts w:ascii="David" w:hAnsi="David" w:cs="David"/>
+        </w:rPr>
+        <w:t>github</w:t>
+      </w:r>
+      <w:proofErr w:type="spellEnd"/>
+      <w:r>
+        <w:rPr>
+          <w:rFonts w:ascii="David" w:hAnsi="David" w:cs="David"/>
+        </w:rPr>
+        <w:t>\workflows\</w:t>
+      </w:r>
+      <w:proofErr w:type="spellStart"/>
+      <w:r>
+        <w:rPr>
+          <w:rFonts w:ascii="David" w:hAnsi="David" w:cs="David"/>
+        </w:rPr>
+        <w:t>release.yml</w:t>
+      </w:r>
+      <w:proofErr w:type="spellEnd"/>
       <w:r>
         <w:rPr>
           <w:rFonts w:ascii="David" w:hAnsi="David" w:cs="David" w:hint="cs"/>
@@ -7731,14 +7874,7 @@
           <w:rFonts w:ascii="David" w:hAnsi="David" w:cs="David" w:hint="cs"/>
           <w:rtl/>
         </w:rPr>
-        <w:t xml:space="preserve"> והעלאה</w:t>
-      </w:r>
-      <w:r>
-        <w:rPr>
-          <w:rFonts w:ascii="David" w:hAnsi="David" w:cs="David" w:hint="cs"/>
-          <w:rtl/>
-        </w:rPr>
-        <w:t xml:space="preserve"> עם גרסא רלוונטית של ה</w:t>
+        <w:t xml:space="preserve"> והעלאה עם גרסא רלוונטית של ה</w:t>
       </w:r>
       <w:r>
         <w:rPr>
@@ -7777,14 +7913,7 @@
           <w:rFonts w:ascii="David" w:hAnsi="David" w:cs="David" w:hint="cs"/>
           <w:rtl/>
         </w:rPr>
-        <w:t>.</w:t>
-      </w:r>
-      <w:r>
-        <w:rPr>
-          <w:rFonts w:ascii="David" w:hAnsi="David" w:cs="David" w:hint="cs"/>
-          <w:rtl/>
-        </w:rPr>
-        <w:t xml:space="preserve"> בצד שרת נדרש ב</w:t>
+        <w:t>. בצד שרת נדרש ב</w:t>
       </w:r>
       <w:r>
         <w:rPr>
@@ -7926,6 +8055,2821 @@
         </w:rPr>
         <w:t>.</w:t>
       </w:r>
+    </w:p>
+    <w:p>
+      <w:pPr>
+        <w:bidi/>
+        <w:spacing w:line="276" w:lineRule="auto"/>
+        <w:rPr>
+          <w:rFonts w:ascii="David" w:hAnsi="David" w:cs="David"/>
+        </w:rPr>
+      </w:pPr>
+    </w:p>
+    <w:p>
+      <w:pPr>
+        <w:bidi/>
+        <w:spacing w:line="276" w:lineRule="auto"/>
+        <w:rPr>
+          <w:rFonts w:ascii="David" w:hAnsi="David" w:cs="David"/>
+          <w:u w:val="single"/>
+          <w:rtl/>
+        </w:rPr>
+      </w:pPr>
+      <w:r>
+        <w:rPr>
+          <w:rFonts w:ascii="David" w:hAnsi="David" w:cs="David" w:hint="cs"/>
+          <w:u w:val="single"/>
+          <w:rtl/>
+        </w:rPr>
+        <w:lastRenderedPageBreak/>
+        <w:t>צד לקוח</w:t>
+      </w:r>
+      <w:r>
+        <w:rPr>
+          <w:rFonts w:ascii="David" w:hAnsi="David" w:cs="David" w:hint="cs"/>
+          <w:u w:val="single"/>
+          <w:rtl/>
+        </w:rPr>
+        <w:t>:</w:t>
+      </w:r>
+    </w:p>
+    <w:p>
+      <w:pPr>
+        <w:pStyle w:val="ListParagraph"/>
+        <w:numPr>
+          <w:ilvl w:val="0"/>
+          <w:numId w:val="13"/>
+        </w:numPr>
+        <w:bidi/>
+        <w:spacing w:line="276" w:lineRule="auto"/>
+        <w:rPr>
+          <w:rFonts w:ascii="David" w:hAnsi="David" w:cs="David"/>
+          <w:b/>
+          <w:bCs/>
+        </w:rPr>
+      </w:pPr>
+      <w:r>
+        <w:rPr>
+          <w:rFonts w:ascii="David" w:hAnsi="David" w:cs="David" w:hint="cs"/>
+          <w:b/>
+          <w:bCs/>
+          <w:rtl/>
+        </w:rPr>
+        <w:t>קבצים כלליים:</w:t>
+      </w:r>
+    </w:p>
+    <w:p>
+      <w:pPr>
+        <w:pStyle w:val="ListParagraph"/>
+        <w:numPr>
+          <w:ilvl w:val="0"/>
+          <w:numId w:val="14"/>
+        </w:numPr>
+        <w:bidi/>
+        <w:spacing w:line="276" w:lineRule="auto"/>
+        <w:rPr>
+          <w:rFonts w:ascii="David" w:hAnsi="David" w:cs="David"/>
+        </w:rPr>
+      </w:pPr>
+      <w:proofErr w:type="spellStart"/>
+      <w:proofErr w:type="gramStart"/>
+      <w:r>
+        <w:rPr>
+          <w:rFonts w:ascii="David" w:hAnsi="David" w:cs="David"/>
+        </w:rPr>
+        <w:t>package</w:t>
+      </w:r>
+      <w:r>
+        <w:rPr>
+          <w:rFonts w:ascii="David" w:hAnsi="David" w:cs="David"/>
+        </w:rPr>
+        <w:t>.</w:t>
+      </w:r>
+      <w:r>
+        <w:rPr>
+          <w:rFonts w:ascii="David" w:hAnsi="David" w:cs="David"/>
+        </w:rPr>
+        <w:t>json</w:t>
+      </w:r>
+      <w:proofErr w:type="spellEnd"/>
+      <w:proofErr w:type="gramEnd"/>
+      <w:r>
+        <w:rPr>
+          <w:rFonts w:ascii="David" w:hAnsi="David" w:cs="David"/>
+        </w:rPr>
+        <w:t xml:space="preserve"> + package-</w:t>
+      </w:r>
+      <w:proofErr w:type="spellStart"/>
+      <w:proofErr w:type="gramStart"/>
+      <w:r>
+        <w:rPr>
+          <w:rFonts w:ascii="David" w:hAnsi="David" w:cs="David"/>
+        </w:rPr>
+        <w:t>lock.json</w:t>
+      </w:r>
+      <w:proofErr w:type="spellEnd"/>
+      <w:proofErr w:type="gramEnd"/>
+      <w:r>
+        <w:rPr>
+          <w:rFonts w:ascii="David" w:hAnsi="David" w:cs="David" w:hint="cs"/>
+          <w:rtl/>
+        </w:rPr>
+        <w:t xml:space="preserve"> </w:t>
+      </w:r>
+      <w:r>
+        <w:rPr>
+          <w:rFonts w:ascii="David" w:hAnsi="David" w:cs="David"/>
+          <w:rtl/>
+        </w:rPr>
+        <w:t>–</w:t>
+      </w:r>
+      <w:r>
+        <w:rPr>
+          <w:rFonts w:ascii="David" w:hAnsi="David" w:cs="David" w:hint="cs"/>
+          <w:rtl/>
+        </w:rPr>
+        <w:t xml:space="preserve"> קובץ </w:t>
+      </w:r>
+      <w:r>
+        <w:rPr>
+          <w:rFonts w:ascii="David" w:hAnsi="David" w:cs="David" w:hint="cs"/>
+          <w:rtl/>
+        </w:rPr>
+        <w:t xml:space="preserve">הגדרות של </w:t>
+      </w:r>
+      <w:r>
+        <w:rPr>
+          <w:rFonts w:ascii="David" w:hAnsi="David" w:cs="David"/>
+        </w:rPr>
+        <w:t>DEPENDENCIES</w:t>
+      </w:r>
+      <w:r>
+        <w:rPr>
+          <w:rFonts w:ascii="David" w:hAnsi="David" w:cs="David" w:hint="cs"/>
+          <w:rtl/>
+        </w:rPr>
+        <w:t xml:space="preserve"> וסקריפטים להרצה של הפרוייקט.</w:t>
+      </w:r>
+    </w:p>
+    <w:p>
+      <w:pPr>
+        <w:pStyle w:val="ListParagraph"/>
+        <w:numPr>
+          <w:ilvl w:val="0"/>
+          <w:numId w:val="14"/>
+        </w:numPr>
+        <w:bidi/>
+        <w:spacing w:line="276" w:lineRule="auto"/>
+        <w:rPr>
+          <w:rFonts w:ascii="David" w:hAnsi="David" w:cs="David"/>
+        </w:rPr>
+      </w:pPr>
+      <w:proofErr w:type="spellStart"/>
+      <w:r>
+        <w:rPr>
+          <w:rFonts w:ascii="David" w:hAnsi="David" w:cs="David"/>
+        </w:rPr>
+        <w:t>Dockerfile</w:t>
+      </w:r>
+      <w:proofErr w:type="spellEnd"/>
+      <w:r>
+        <w:rPr>
+          <w:rFonts w:ascii="David" w:hAnsi="David" w:cs="David"/>
+        </w:rPr>
+        <w:t xml:space="preserve"> + </w:t>
+      </w:r>
+      <w:proofErr w:type="spellStart"/>
+      <w:r>
+        <w:rPr>
+          <w:rFonts w:ascii="David" w:hAnsi="David" w:cs="David"/>
+        </w:rPr>
+        <w:t>Caddyfile</w:t>
+      </w:r>
+      <w:proofErr w:type="spellEnd"/>
+      <w:r>
+        <w:rPr>
+          <w:rFonts w:ascii="David" w:hAnsi="David" w:cs="David"/>
+        </w:rPr>
+        <w:t xml:space="preserve"> + entrypoint.sh</w:t>
+      </w:r>
+      <w:r>
+        <w:rPr>
+          <w:rFonts w:ascii="David" w:hAnsi="David" w:cs="David" w:hint="cs"/>
+          <w:rtl/>
+        </w:rPr>
+        <w:t xml:space="preserve"> </w:t>
+      </w:r>
+      <w:r>
+        <w:rPr>
+          <w:rFonts w:ascii="David" w:hAnsi="David" w:cs="David"/>
+          <w:rtl/>
+        </w:rPr>
+        <w:t>–</w:t>
+      </w:r>
+      <w:r>
+        <w:rPr>
+          <w:rFonts w:ascii="David" w:hAnsi="David" w:cs="David" w:hint="cs"/>
+          <w:rtl/>
+        </w:rPr>
+        <w:t xml:space="preserve"> בונה</w:t>
+      </w:r>
+      <w:r>
+        <w:rPr>
+          <w:rFonts w:ascii="David" w:hAnsi="David" w:cs="David" w:hint="cs"/>
+          <w:rtl/>
+        </w:rPr>
+        <w:t xml:space="preserve"> ומריץ</w:t>
+      </w:r>
+      <w:r>
+        <w:rPr>
+          <w:rFonts w:ascii="David" w:hAnsi="David" w:cs="David" w:hint="cs"/>
+          <w:rtl/>
+        </w:rPr>
+        <w:t xml:space="preserve"> </w:t>
+      </w:r>
+      <w:r>
+        <w:rPr>
+          <w:rFonts w:ascii="David" w:hAnsi="David" w:cs="David"/>
+        </w:rPr>
+        <w:t>DOCKER IMAGE</w:t>
+      </w:r>
+      <w:r>
+        <w:rPr>
+          <w:rFonts w:ascii="David" w:hAnsi="David" w:cs="David" w:hint="cs"/>
+          <w:rtl/>
+        </w:rPr>
+        <w:t xml:space="preserve"> בתהליך ה</w:t>
+      </w:r>
+      <w:r>
+        <w:rPr>
+          <w:rFonts w:ascii="David" w:hAnsi="David" w:cs="David"/>
+        </w:rPr>
+        <w:t>CI</w:t>
+      </w:r>
+      <w:r>
+        <w:rPr>
+          <w:rFonts w:ascii="David" w:hAnsi="David" w:cs="David" w:hint="cs"/>
+          <w:rtl/>
+        </w:rPr>
+        <w:t xml:space="preserve"> ב</w:t>
+      </w:r>
+      <w:r>
+        <w:rPr>
+          <w:rFonts w:ascii="David" w:hAnsi="David" w:cs="David"/>
+        </w:rPr>
+        <w:t>GITHUB</w:t>
+      </w:r>
+      <w:r>
+        <w:rPr>
+          <w:rFonts w:ascii="David" w:hAnsi="David" w:cs="David" w:hint="cs"/>
+          <w:rtl/>
+        </w:rPr>
+        <w:t xml:space="preserve"> </w:t>
+      </w:r>
+      <w:r>
+        <w:rPr>
+          <w:rFonts w:ascii="David" w:hAnsi="David" w:cs="David"/>
+          <w:rtl/>
+        </w:rPr>
+        <w:t>–</w:t>
+      </w:r>
+      <w:r>
+        <w:rPr>
+          <w:rFonts w:ascii="David" w:hAnsi="David" w:cs="David" w:hint="cs"/>
+          <w:rtl/>
+        </w:rPr>
+        <w:t xml:space="preserve"> הסקריפט הופך משתני סביבה מלהיות עם קידומת של </w:t>
+      </w:r>
+      <w:r>
+        <w:rPr>
+          <w:rFonts w:ascii="David" w:hAnsi="David" w:cs="David"/>
+        </w:rPr>
+        <w:t>APP_</w:t>
+      </w:r>
+      <w:r>
+        <w:rPr>
+          <w:rFonts w:ascii="David" w:hAnsi="David" w:cs="David" w:hint="cs"/>
+          <w:rtl/>
+        </w:rPr>
+        <w:t xml:space="preserve"> להיות חסרי קידומת, ומפעיל את ה</w:t>
+      </w:r>
+      <w:r>
+        <w:rPr>
+          <w:rFonts w:ascii="David" w:hAnsi="David" w:cs="David"/>
+        </w:rPr>
+        <w:t>CADDY</w:t>
+      </w:r>
+      <w:r>
+        <w:rPr>
+          <w:rFonts w:ascii="David" w:hAnsi="David" w:cs="David" w:hint="cs"/>
+          <w:rtl/>
+        </w:rPr>
+        <w:t xml:space="preserve"> </w:t>
+      </w:r>
+      <w:r>
+        <w:rPr>
+          <w:rFonts w:ascii="David" w:hAnsi="David" w:cs="David"/>
+          <w:rtl/>
+        </w:rPr>
+        <w:t>–</w:t>
+      </w:r>
+      <w:r>
+        <w:rPr>
+          <w:rFonts w:ascii="David" w:hAnsi="David" w:cs="David" w:hint="cs"/>
+          <w:rtl/>
+        </w:rPr>
+        <w:t xml:space="preserve"> </w:t>
+      </w:r>
+      <w:r>
+        <w:rPr>
+          <w:rFonts w:ascii="David" w:hAnsi="David" w:cs="David"/>
+        </w:rPr>
+        <w:t>REVERSE PROXY</w:t>
+      </w:r>
+      <w:r>
+        <w:rPr>
+          <w:rFonts w:ascii="David" w:hAnsi="David" w:cs="David" w:hint="cs"/>
+          <w:rtl/>
+        </w:rPr>
+        <w:t xml:space="preserve"> שמריץ את הפרוייקט עם </w:t>
+      </w:r>
+      <w:r>
+        <w:rPr>
+          <w:rFonts w:ascii="David" w:hAnsi="David" w:cs="David"/>
+        </w:rPr>
+        <w:t>HTTPS</w:t>
+      </w:r>
+      <w:r>
+        <w:rPr>
+          <w:rFonts w:ascii="David" w:hAnsi="David" w:cs="David" w:hint="cs"/>
+          <w:rtl/>
+        </w:rPr>
+        <w:t xml:space="preserve"> כאשר כל קריאה מלבד </w:t>
+      </w:r>
+      <w:r>
+        <w:rPr>
+          <w:rFonts w:ascii="David" w:hAnsi="David" w:cs="David"/>
+        </w:rPr>
+        <w:t>/</w:t>
+      </w:r>
+      <w:proofErr w:type="spellStart"/>
+      <w:r>
+        <w:rPr>
+          <w:rFonts w:ascii="David" w:hAnsi="David" w:cs="David"/>
+        </w:rPr>
+        <w:t>api</w:t>
+      </w:r>
+      <w:proofErr w:type="spellEnd"/>
+      <w:r>
+        <w:rPr>
+          <w:rFonts w:ascii="David" w:hAnsi="David" w:cs="David" w:hint="cs"/>
+          <w:rtl/>
+        </w:rPr>
+        <w:t xml:space="preserve"> ו-</w:t>
+      </w:r>
+      <w:r>
+        <w:rPr>
+          <w:rFonts w:ascii="David" w:hAnsi="David" w:cs="David"/>
+        </w:rPr>
+        <w:t>/images</w:t>
+      </w:r>
+      <w:r>
+        <w:rPr>
+          <w:rFonts w:ascii="David" w:hAnsi="David" w:cs="David" w:hint="cs"/>
+          <w:rtl/>
+        </w:rPr>
+        <w:t xml:space="preserve"> מגיעות לצד הלקוח.</w:t>
+      </w:r>
+    </w:p>
+    <w:p>
+      <w:pPr>
+        <w:pStyle w:val="ListParagraph"/>
+        <w:numPr>
+          <w:ilvl w:val="0"/>
+          <w:numId w:val="14"/>
+        </w:numPr>
+        <w:bidi/>
+        <w:spacing w:line="276" w:lineRule="auto"/>
+        <w:rPr>
+          <w:rFonts w:ascii="David" w:hAnsi="David" w:cs="David"/>
+        </w:rPr>
+      </w:pPr>
+      <w:proofErr w:type="gramStart"/>
+      <w:r>
+        <w:rPr>
+          <w:rFonts w:ascii="David" w:hAnsi="David" w:cs="David"/>
+        </w:rPr>
+        <w:t>.</w:t>
+      </w:r>
+      <w:proofErr w:type="spellStart"/>
+      <w:r>
+        <w:rPr>
+          <w:rFonts w:ascii="David" w:hAnsi="David" w:cs="David"/>
+        </w:rPr>
+        <w:t>env</w:t>
+      </w:r>
+      <w:proofErr w:type="gramEnd"/>
+      <w:r>
+        <w:rPr>
+          <w:rFonts w:ascii="David" w:hAnsi="David" w:cs="David"/>
+        </w:rPr>
+        <w:t>.example</w:t>
+      </w:r>
+      <w:proofErr w:type="spellEnd"/>
+      <w:r>
+        <w:rPr>
+          <w:rFonts w:ascii="David" w:hAnsi="David" w:cs="David" w:hint="cs"/>
+          <w:rtl/>
+        </w:rPr>
+        <w:t xml:space="preserve"> </w:t>
+      </w:r>
+      <w:r>
+        <w:rPr>
+          <w:rFonts w:ascii="David" w:hAnsi="David" w:cs="David"/>
+          <w:rtl/>
+        </w:rPr>
+        <w:t>–</w:t>
+      </w:r>
+      <w:r>
+        <w:rPr>
+          <w:rFonts w:ascii="David" w:hAnsi="David" w:cs="David" w:hint="cs"/>
+          <w:rtl/>
+        </w:rPr>
+        <w:t xml:space="preserve"> קובץ דוגמא ליצירת קובץ סביבה עם משתני סביבה רלוונטים לפרוייקט.</w:t>
+      </w:r>
+    </w:p>
+    <w:p>
+      <w:pPr>
+        <w:pStyle w:val="ListParagraph"/>
+        <w:numPr>
+          <w:ilvl w:val="0"/>
+          <w:numId w:val="14"/>
+        </w:numPr>
+        <w:bidi/>
+        <w:spacing w:line="276" w:lineRule="auto"/>
+        <w:rPr>
+          <w:rFonts w:ascii="David" w:hAnsi="David" w:cs="David"/>
+        </w:rPr>
+      </w:pPr>
+      <w:r>
+        <w:rPr>
+          <w:rFonts w:ascii="David" w:hAnsi="David" w:cs="David"/>
+        </w:rPr>
+        <w:t>.</w:t>
+      </w:r>
+      <w:proofErr w:type="spellStart"/>
+      <w:r>
+        <w:rPr>
+          <w:rFonts w:ascii="David" w:hAnsi="David" w:cs="David"/>
+        </w:rPr>
+        <w:t>github</w:t>
+      </w:r>
+      <w:proofErr w:type="spellEnd"/>
+      <w:r>
+        <w:rPr>
+          <w:rFonts w:ascii="David" w:hAnsi="David" w:cs="David"/>
+        </w:rPr>
+        <w:t>\workflows\</w:t>
+      </w:r>
+      <w:proofErr w:type="spellStart"/>
+      <w:r>
+        <w:rPr>
+          <w:rFonts w:ascii="David" w:hAnsi="David" w:cs="David"/>
+        </w:rPr>
+        <w:t>release.yml</w:t>
+      </w:r>
+      <w:proofErr w:type="spellEnd"/>
+      <w:r>
+        <w:rPr>
+          <w:rFonts w:ascii="David" w:hAnsi="David" w:cs="David" w:hint="cs"/>
+          <w:rtl/>
+        </w:rPr>
+        <w:t xml:space="preserve"> </w:t>
+      </w:r>
+      <w:r>
+        <w:rPr>
+          <w:rFonts w:ascii="David" w:hAnsi="David" w:cs="David"/>
+          <w:rtl/>
+        </w:rPr>
+        <w:t>–</w:t>
+      </w:r>
+      <w:r>
+        <w:rPr>
+          <w:rFonts w:ascii="David" w:hAnsi="David" w:cs="David" w:hint="cs"/>
+          <w:rtl/>
+        </w:rPr>
+        <w:t xml:space="preserve"> קובץ המגדיר את ה</w:t>
+      </w:r>
+      <w:r>
+        <w:rPr>
+          <w:rFonts w:ascii="David" w:hAnsi="David" w:cs="David"/>
+        </w:rPr>
+        <w:t>CI</w:t>
+      </w:r>
+      <w:r>
+        <w:rPr>
+          <w:rFonts w:ascii="David" w:hAnsi="David" w:cs="David" w:hint="cs"/>
+          <w:rtl/>
+        </w:rPr>
+        <w:t xml:space="preserve"> </w:t>
+      </w:r>
+      <w:r>
+        <w:rPr>
+          <w:rFonts w:ascii="David" w:hAnsi="David" w:cs="David"/>
+          <w:rtl/>
+        </w:rPr>
+        <w:t>–</w:t>
+      </w:r>
+      <w:r>
+        <w:rPr>
+          <w:rFonts w:ascii="David" w:hAnsi="David" w:cs="David" w:hint="cs"/>
+          <w:rtl/>
+        </w:rPr>
+        <w:t xml:space="preserve"> בניית הפרוייקט וה</w:t>
+      </w:r>
+      <w:r>
+        <w:rPr>
+          <w:rFonts w:ascii="David" w:hAnsi="David" w:cs="David"/>
+        </w:rPr>
+        <w:t>DOCKER IMAGE</w:t>
+      </w:r>
+      <w:r>
+        <w:rPr>
+          <w:rFonts w:ascii="David" w:hAnsi="David" w:cs="David" w:hint="cs"/>
+          <w:rtl/>
+        </w:rPr>
+        <w:t xml:space="preserve"> והעלאה ל</w:t>
+      </w:r>
+      <w:r>
+        <w:rPr>
+          <w:rFonts w:ascii="David" w:hAnsi="David" w:cs="David"/>
+        </w:rPr>
+        <w:t>REGISTY</w:t>
+      </w:r>
+      <w:r>
+        <w:rPr>
+          <w:rFonts w:ascii="David" w:hAnsi="David" w:cs="David" w:hint="cs"/>
+          <w:rtl/>
+        </w:rPr>
+        <w:t xml:space="preserve"> של </w:t>
+      </w:r>
+      <w:r>
+        <w:rPr>
+          <w:rFonts w:ascii="David" w:hAnsi="David" w:cs="David"/>
+        </w:rPr>
+        <w:t>GITHUB</w:t>
+      </w:r>
+      <w:r>
+        <w:rPr>
+          <w:rFonts w:ascii="David" w:hAnsi="David" w:cs="David" w:hint="cs"/>
+          <w:rtl/>
+        </w:rPr>
+        <w:t>.</w:t>
+      </w:r>
+    </w:p>
+    <w:p>
+      <w:pPr>
+        <w:pStyle w:val="ListParagraph"/>
+        <w:numPr>
+          <w:ilvl w:val="0"/>
+          <w:numId w:val="14"/>
+        </w:numPr>
+        <w:bidi/>
+        <w:spacing w:line="276" w:lineRule="auto"/>
+        <w:rPr>
+          <w:rFonts w:ascii="David" w:hAnsi="David" w:cs="David"/>
+        </w:rPr>
+      </w:pPr>
+      <w:r>
+        <w:rPr>
+          <w:rFonts w:ascii="David" w:hAnsi="David" w:cs="David" w:hint="cs"/>
+          <w:rtl/>
+        </w:rPr>
+        <w:t xml:space="preserve">מספר נוסף של קבצי קונפיגורציה (כמו </w:t>
+      </w:r>
+      <w:r>
+        <w:rPr>
+          <w:rFonts w:ascii="David" w:hAnsi="David" w:cs="David"/>
+        </w:rPr>
+        <w:t>VITE</w:t>
+      </w:r>
+      <w:r>
+        <w:rPr>
+          <w:rFonts w:ascii="David" w:hAnsi="David" w:cs="David" w:hint="cs"/>
+          <w:rtl/>
+        </w:rPr>
+        <w:t xml:space="preserve">, </w:t>
+      </w:r>
+      <w:r>
+        <w:rPr>
+          <w:rFonts w:ascii="David" w:hAnsi="David" w:cs="David"/>
+        </w:rPr>
+        <w:t>TSCONFIG</w:t>
+      </w:r>
+      <w:r>
+        <w:rPr>
+          <w:rFonts w:ascii="David" w:hAnsi="David" w:cs="David" w:hint="cs"/>
+          <w:rtl/>
+        </w:rPr>
+        <w:t xml:space="preserve">, </w:t>
+      </w:r>
+      <w:r>
+        <w:rPr>
+          <w:rFonts w:ascii="David" w:hAnsi="David" w:cs="David"/>
+        </w:rPr>
+        <w:t>PRETTIER</w:t>
+      </w:r>
+      <w:r>
+        <w:rPr>
+          <w:rFonts w:ascii="David" w:hAnsi="David" w:cs="David" w:hint="cs"/>
+          <w:rtl/>
+        </w:rPr>
+        <w:t>, וכדומה).</w:t>
+      </w:r>
+    </w:p>
+    <w:p>
+      <w:pPr>
+        <w:bidi/>
+        <w:spacing w:line="276" w:lineRule="auto"/>
+        <w:rPr>
+          <w:rFonts w:ascii="David" w:hAnsi="David" w:cs="David"/>
+          <w:rtl/>
+        </w:rPr>
+      </w:pPr>
+    </w:p>
+    <w:p>
+      <w:pPr>
+        <w:pStyle w:val="ListParagraph"/>
+        <w:numPr>
+          <w:ilvl w:val="0"/>
+          <w:numId w:val="13"/>
+        </w:numPr>
+        <w:bidi/>
+        <w:spacing w:line="276" w:lineRule="auto"/>
+        <w:rPr>
+          <w:rFonts w:ascii="David" w:hAnsi="David" w:cs="David"/>
+          <w:b/>
+          <w:bCs/>
+        </w:rPr>
+      </w:pPr>
+      <w:r>
+        <w:rPr>
+          <w:rFonts w:ascii="David" w:hAnsi="David" w:cs="David"/>
+          <w:b/>
+          <w:bCs/>
+        </w:rPr>
+        <w:t>i</w:t>
+      </w:r>
+      <w:r>
+        <w:rPr>
+          <w:rFonts w:ascii="David" w:hAnsi="David" w:cs="David"/>
+          <w:b/>
+          <w:bCs/>
+        </w:rPr>
+        <w:t xml:space="preserve">ndex.html + </w:t>
+      </w:r>
+      <w:proofErr w:type="spellStart"/>
+      <w:r>
+        <w:rPr>
+          <w:rFonts w:ascii="David" w:hAnsi="David" w:cs="David"/>
+          <w:b/>
+          <w:bCs/>
+        </w:rPr>
+        <w:t>main.tsx</w:t>
+      </w:r>
+      <w:proofErr w:type="spellEnd"/>
+      <w:r>
+        <w:rPr>
+          <w:rFonts w:ascii="David" w:hAnsi="David" w:cs="David" w:hint="cs"/>
+          <w:b/>
+          <w:bCs/>
+          <w:rtl/>
+        </w:rPr>
+        <w:t>:</w:t>
+      </w:r>
+    </w:p>
+    <w:p>
+      <w:pPr>
+        <w:pStyle w:val="ListParagraph"/>
+        <w:bidi/>
+        <w:spacing w:line="276" w:lineRule="auto"/>
+        <w:rPr>
+          <w:rFonts w:ascii="David" w:hAnsi="David" w:cs="David"/>
+          <w:rtl/>
+        </w:rPr>
+      </w:pPr>
+      <w:r>
+        <w:rPr>
+          <w:rFonts w:ascii="David" w:hAnsi="David" w:cs="David" w:hint="cs"/>
+          <w:rtl/>
+        </w:rPr>
+        <w:t>מריצים את הפרוייקט.</w:t>
+      </w:r>
+    </w:p>
+    <w:p>
+      <w:pPr>
+        <w:pStyle w:val="ListParagraph"/>
+        <w:bidi/>
+        <w:spacing w:line="276" w:lineRule="auto"/>
+        <w:rPr>
+          <w:rFonts w:ascii="David" w:hAnsi="David" w:cs="David"/>
+          <w:rtl/>
+        </w:rPr>
+      </w:pPr>
+    </w:p>
+    <w:p>
+      <w:pPr>
+        <w:pStyle w:val="ListParagraph"/>
+        <w:numPr>
+          <w:ilvl w:val="0"/>
+          <w:numId w:val="13"/>
+        </w:numPr>
+        <w:bidi/>
+        <w:spacing w:line="276" w:lineRule="auto"/>
+        <w:rPr>
+          <w:rFonts w:ascii="David" w:hAnsi="David" w:cs="David"/>
+          <w:b/>
+          <w:bCs/>
+        </w:rPr>
+      </w:pPr>
+      <w:proofErr w:type="spellStart"/>
+      <w:r>
+        <w:rPr>
+          <w:rFonts w:ascii="David" w:hAnsi="David" w:cs="David"/>
+          <w:b/>
+          <w:bCs/>
+        </w:rPr>
+        <w:t>config.ts</w:t>
+      </w:r>
+      <w:proofErr w:type="spellEnd"/>
+      <w:r>
+        <w:rPr>
+          <w:rFonts w:ascii="David" w:hAnsi="David" w:cs="David" w:hint="cs"/>
+          <w:b/>
+          <w:bCs/>
+          <w:rtl/>
+        </w:rPr>
+        <w:t>:</w:t>
+      </w:r>
+    </w:p>
+    <w:p>
+      <w:pPr>
+        <w:pStyle w:val="ListParagraph"/>
+        <w:bidi/>
+        <w:spacing w:line="276" w:lineRule="auto"/>
+        <w:rPr>
+          <w:rFonts w:ascii="David" w:hAnsi="David" w:cs="David"/>
+          <w:rtl/>
+        </w:rPr>
+      </w:pPr>
+      <w:r>
+        <w:rPr>
+          <w:rFonts w:ascii="David" w:hAnsi="David" w:cs="David" w:hint="cs"/>
+          <w:rtl/>
+        </w:rPr>
+        <w:t xml:space="preserve">טיפול במשתני סביבה בהתאם לסוג ההרצה </w:t>
+      </w:r>
+      <w:r>
+        <w:rPr>
+          <w:rFonts w:ascii="David" w:hAnsi="David" w:cs="David"/>
+          <w:rtl/>
+        </w:rPr>
+        <w:t>–</w:t>
+      </w:r>
+      <w:r>
+        <w:rPr>
+          <w:rFonts w:ascii="David" w:hAnsi="David" w:cs="David" w:hint="cs"/>
+          <w:rtl/>
+        </w:rPr>
+        <w:t xml:space="preserve"> לוקאלי או </w:t>
+      </w:r>
+      <w:r>
+        <w:rPr>
+          <w:rFonts w:ascii="David" w:hAnsi="David" w:cs="David"/>
+        </w:rPr>
+        <w:t>DOCKER</w:t>
+      </w:r>
+      <w:r>
+        <w:rPr>
+          <w:rFonts w:ascii="David" w:hAnsi="David" w:cs="David" w:hint="cs"/>
+          <w:rtl/>
+        </w:rPr>
+        <w:t>.</w:t>
+      </w:r>
+    </w:p>
+    <w:p>
+      <w:pPr>
+        <w:pStyle w:val="ListParagraph"/>
+        <w:bidi/>
+        <w:spacing w:line="276" w:lineRule="auto"/>
+        <w:rPr>
+          <w:rFonts w:ascii="David" w:hAnsi="David" w:cs="David"/>
+          <w:rtl/>
+        </w:rPr>
+      </w:pPr>
+    </w:p>
+    <w:p>
+      <w:pPr>
+        <w:pStyle w:val="ListParagraph"/>
+        <w:numPr>
+          <w:ilvl w:val="0"/>
+          <w:numId w:val="13"/>
+        </w:numPr>
+        <w:bidi/>
+        <w:spacing w:line="276" w:lineRule="auto"/>
+        <w:rPr>
+          <w:rFonts w:ascii="David" w:hAnsi="David" w:cs="David"/>
+          <w:b/>
+          <w:bCs/>
+        </w:rPr>
+      </w:pPr>
+      <w:r>
+        <w:rPr>
+          <w:rFonts w:ascii="David" w:hAnsi="David" w:cs="David"/>
+          <w:b/>
+          <w:bCs/>
+        </w:rPr>
+        <w:t>styles</w:t>
+      </w:r>
+      <w:r>
+        <w:rPr>
+          <w:rFonts w:ascii="David" w:hAnsi="David" w:cs="David" w:hint="cs"/>
+          <w:b/>
+          <w:bCs/>
+          <w:rtl/>
+        </w:rPr>
+        <w:t>:</w:t>
+      </w:r>
+    </w:p>
+    <w:p>
+      <w:pPr>
+        <w:pStyle w:val="ListParagraph"/>
+        <w:bidi/>
+        <w:spacing w:line="276" w:lineRule="auto"/>
+        <w:rPr>
+          <w:rFonts w:ascii="David" w:hAnsi="David" w:cs="David"/>
+        </w:rPr>
+      </w:pPr>
+      <w:r>
+        <w:rPr>
+          <w:rFonts w:ascii="David" w:hAnsi="David" w:cs="David" w:hint="cs"/>
+          <w:rtl/>
+        </w:rPr>
+        <w:t xml:space="preserve">הגדרה של </w:t>
+      </w:r>
+      <w:r>
+        <w:rPr>
+          <w:rFonts w:ascii="David" w:hAnsi="David" w:cs="David"/>
+        </w:rPr>
+        <w:t>CSS</w:t>
+      </w:r>
+      <w:r>
+        <w:rPr>
+          <w:rFonts w:ascii="David" w:hAnsi="David" w:cs="David" w:hint="cs"/>
+          <w:rtl/>
+        </w:rPr>
+        <w:t xml:space="preserve"> ומאפייני עיצוב משותפים.</w:t>
+      </w:r>
+    </w:p>
+    <w:p>
+      <w:pPr>
+        <w:pStyle w:val="ListParagraph"/>
+        <w:bidi/>
+        <w:spacing w:line="276" w:lineRule="auto"/>
+        <w:rPr>
+          <w:rFonts w:ascii="David" w:hAnsi="David" w:cs="David"/>
+        </w:rPr>
+      </w:pPr>
+    </w:p>
+    <w:p>
+      <w:pPr>
+        <w:pStyle w:val="ListParagraph"/>
+        <w:numPr>
+          <w:ilvl w:val="0"/>
+          <w:numId w:val="13"/>
+        </w:numPr>
+        <w:bidi/>
+        <w:spacing w:line="276" w:lineRule="auto"/>
+        <w:rPr>
+          <w:rFonts w:ascii="David" w:hAnsi="David" w:cs="David"/>
+          <w:b/>
+          <w:bCs/>
+        </w:rPr>
+      </w:pPr>
+      <w:proofErr w:type="spellStart"/>
+      <w:r>
+        <w:rPr>
+          <w:rFonts w:ascii="David" w:hAnsi="David" w:cs="David"/>
+          <w:b/>
+          <w:bCs/>
+        </w:rPr>
+        <w:t>src</w:t>
+      </w:r>
+      <w:proofErr w:type="spellEnd"/>
+      <w:r>
+        <w:rPr>
+          <w:rFonts w:ascii="David" w:hAnsi="David" w:cs="David"/>
+          <w:b/>
+          <w:bCs/>
+        </w:rPr>
+        <w:t>/app</w:t>
+      </w:r>
+      <w:r>
+        <w:rPr>
+          <w:rFonts w:ascii="David" w:hAnsi="David" w:cs="David" w:hint="cs"/>
+          <w:b/>
+          <w:bCs/>
+          <w:rtl/>
+        </w:rPr>
+        <w:t>:</w:t>
+      </w:r>
+    </w:p>
+    <w:p>
+      <w:pPr>
+        <w:pStyle w:val="ListParagraph"/>
+        <w:bidi/>
+        <w:spacing w:line="276" w:lineRule="auto"/>
+        <w:rPr>
+          <w:rFonts w:ascii="David" w:hAnsi="David" w:cs="David"/>
+          <w:rtl/>
+        </w:rPr>
+      </w:pPr>
+      <w:r>
+        <w:rPr>
+          <w:rFonts w:ascii="David" w:hAnsi="David" w:cs="David" w:hint="cs"/>
+          <w:rtl/>
+        </w:rPr>
+        <w:t xml:space="preserve">הגדרת </w:t>
+      </w:r>
+      <w:r>
+        <w:rPr>
+          <w:rFonts w:ascii="David" w:hAnsi="David" w:cs="David"/>
+        </w:rPr>
+        <w:t>ROUTER</w:t>
+      </w:r>
+      <w:r>
+        <w:rPr>
+          <w:rFonts w:ascii="David" w:hAnsi="David" w:cs="David" w:hint="cs"/>
+          <w:rtl/>
+        </w:rPr>
+        <w:t>, ומעטפות לשאר האפליקציה.</w:t>
+      </w:r>
+    </w:p>
+    <w:p>
+      <w:pPr>
+        <w:pStyle w:val="ListParagraph"/>
+        <w:bidi/>
+        <w:spacing w:line="276" w:lineRule="auto"/>
+        <w:rPr>
+          <w:rFonts w:ascii="David" w:hAnsi="David" w:cs="David"/>
+          <w:rtl/>
+        </w:rPr>
+      </w:pPr>
+    </w:p>
+    <w:p>
+      <w:pPr>
+        <w:pStyle w:val="ListParagraph"/>
+        <w:numPr>
+          <w:ilvl w:val="0"/>
+          <w:numId w:val="13"/>
+        </w:numPr>
+        <w:bidi/>
+        <w:spacing w:line="276" w:lineRule="auto"/>
+        <w:rPr>
+          <w:rFonts w:ascii="David" w:hAnsi="David" w:cs="David"/>
+          <w:b/>
+          <w:bCs/>
+        </w:rPr>
+      </w:pPr>
+      <w:proofErr w:type="spellStart"/>
+      <w:r>
+        <w:rPr>
+          <w:rFonts w:ascii="David" w:hAnsi="David" w:cs="David"/>
+          <w:b/>
+          <w:bCs/>
+        </w:rPr>
+        <w:t>src</w:t>
+      </w:r>
+      <w:proofErr w:type="spellEnd"/>
+      <w:r>
+        <w:rPr>
+          <w:rFonts w:ascii="David" w:hAnsi="David" w:cs="David"/>
+          <w:b/>
+          <w:bCs/>
+        </w:rPr>
+        <w:t>/</w:t>
+      </w:r>
+      <w:r>
+        <w:rPr>
+          <w:rFonts w:ascii="David" w:hAnsi="David" w:cs="David"/>
+          <w:b/>
+          <w:bCs/>
+        </w:rPr>
+        <w:t>assets</w:t>
+      </w:r>
+      <w:r>
+        <w:rPr>
+          <w:rFonts w:ascii="David" w:hAnsi="David" w:cs="David" w:hint="cs"/>
+          <w:b/>
+          <w:bCs/>
+          <w:rtl/>
+        </w:rPr>
+        <w:t>:</w:t>
+      </w:r>
+    </w:p>
+    <w:p>
+      <w:pPr>
+        <w:pStyle w:val="ListParagraph"/>
+        <w:bidi/>
+        <w:spacing w:line="276" w:lineRule="auto"/>
+        <w:rPr>
+          <w:rFonts w:ascii="David" w:hAnsi="David" w:cs="David"/>
+          <w:rtl/>
+        </w:rPr>
+      </w:pPr>
+      <w:r>
+        <w:rPr>
+          <w:rFonts w:ascii="David" w:hAnsi="David" w:cs="David" w:hint="cs"/>
+          <w:rtl/>
+        </w:rPr>
+        <w:t>לוגואים.</w:t>
+      </w:r>
+    </w:p>
+    <w:p>
+      <w:pPr>
+        <w:pStyle w:val="ListParagraph"/>
+        <w:bidi/>
+        <w:spacing w:line="276" w:lineRule="auto"/>
+        <w:rPr>
+          <w:rFonts w:ascii="David" w:hAnsi="David" w:cs="David" w:hint="cs"/>
+          <w:rtl/>
+        </w:rPr>
+      </w:pPr>
+    </w:p>
+    <w:p>
+      <w:pPr>
+        <w:pStyle w:val="ListParagraph"/>
+        <w:numPr>
+          <w:ilvl w:val="0"/>
+          <w:numId w:val="13"/>
+        </w:numPr>
+        <w:bidi/>
+        <w:spacing w:line="276" w:lineRule="auto"/>
+        <w:rPr>
+          <w:rFonts w:ascii="David" w:hAnsi="David" w:cs="David"/>
+          <w:b/>
+          <w:bCs/>
+        </w:rPr>
+      </w:pPr>
+      <w:proofErr w:type="spellStart"/>
+      <w:r>
+        <w:rPr>
+          <w:rFonts w:ascii="David" w:hAnsi="David" w:cs="David"/>
+          <w:b/>
+          <w:bCs/>
+        </w:rPr>
+        <w:t>src</w:t>
+      </w:r>
+      <w:proofErr w:type="spellEnd"/>
+      <w:r>
+        <w:rPr>
+          <w:rFonts w:ascii="David" w:hAnsi="David" w:cs="David"/>
+          <w:b/>
+          <w:bCs/>
+        </w:rPr>
+        <w:t>/</w:t>
+      </w:r>
+      <w:r>
+        <w:rPr>
+          <w:rFonts w:ascii="David" w:hAnsi="David" w:cs="David"/>
+          <w:b/>
+          <w:bCs/>
+        </w:rPr>
+        <w:t>components</w:t>
+      </w:r>
+      <w:r>
+        <w:rPr>
+          <w:rFonts w:ascii="David" w:hAnsi="David" w:cs="David" w:hint="cs"/>
+          <w:b/>
+          <w:bCs/>
+          <w:rtl/>
+        </w:rPr>
+        <w:t>:</w:t>
+      </w:r>
+    </w:p>
+    <w:p>
+      <w:pPr>
+        <w:pStyle w:val="ListParagraph"/>
+        <w:bidi/>
+        <w:spacing w:line="276" w:lineRule="auto"/>
+        <w:rPr>
+          <w:rFonts w:ascii="David" w:hAnsi="David" w:cs="David"/>
+          <w:rtl/>
+        </w:rPr>
+      </w:pPr>
+      <w:r>
+        <w:rPr>
+          <w:rFonts w:ascii="David" w:hAnsi="David" w:cs="David" w:hint="cs"/>
+          <w:rtl/>
+        </w:rPr>
+        <w:t>מכיל קומפוננטות עיקריות לצורך שימוש חוזר בהם במספר מקומות שונים כחלק מהאפליקציה. קיממות קומפוננטות עבור סוגי שדות שונים (</w:t>
+      </w:r>
+      <w:r>
+        <w:rPr>
+          <w:rFonts w:ascii="David" w:hAnsi="David" w:cs="David"/>
+        </w:rPr>
+        <w:t>INPUT</w:t>
+      </w:r>
+      <w:r>
+        <w:rPr>
+          <w:rFonts w:ascii="David" w:hAnsi="David" w:cs="David" w:hint="cs"/>
+          <w:rtl/>
+        </w:rPr>
+        <w:t xml:space="preserve">, </w:t>
+      </w:r>
+      <w:r>
+        <w:rPr>
+          <w:rFonts w:ascii="David" w:hAnsi="David" w:cs="David"/>
+        </w:rPr>
+        <w:t>DROPDOWN</w:t>
+      </w:r>
+      <w:r>
+        <w:rPr>
+          <w:rFonts w:ascii="David" w:hAnsi="David" w:cs="David" w:hint="cs"/>
+          <w:rtl/>
+        </w:rPr>
+        <w:t xml:space="preserve"> ועוד), עבור </w:t>
+      </w:r>
+      <w:r>
+        <w:rPr>
+          <w:rFonts w:ascii="David" w:hAnsi="David" w:cs="David"/>
+        </w:rPr>
+        <w:t>MODAL</w:t>
+      </w:r>
+      <w:r>
+        <w:rPr>
+          <w:rFonts w:ascii="David" w:hAnsi="David" w:cs="David" w:hint="cs"/>
+          <w:rtl/>
+        </w:rPr>
+        <w:t xml:space="preserve">, עבור </w:t>
+      </w:r>
+      <w:r>
+        <w:rPr>
+          <w:rFonts w:ascii="David" w:hAnsi="David" w:cs="David"/>
+        </w:rPr>
+        <w:t>PAGINATION</w:t>
+      </w:r>
+      <w:r>
+        <w:rPr>
+          <w:rFonts w:ascii="David" w:hAnsi="David" w:cs="David" w:hint="cs"/>
+          <w:rtl/>
+        </w:rPr>
+        <w:t xml:space="preserve">, עבור הגנות של </w:t>
+      </w:r>
+      <w:r>
+        <w:rPr>
+          <w:rFonts w:ascii="David" w:hAnsi="David" w:cs="David"/>
+        </w:rPr>
+        <w:t>ADMIN</w:t>
+      </w:r>
+      <w:r>
+        <w:rPr>
+          <w:rFonts w:ascii="David" w:hAnsi="David" w:cs="David" w:hint="cs"/>
+          <w:rtl/>
+        </w:rPr>
+        <w:t xml:space="preserve"> או משתמש,</w:t>
+      </w:r>
+      <w:r>
+        <w:rPr>
+          <w:rFonts w:ascii="David" w:hAnsi="David" w:cs="David" w:hint="cs"/>
+          <w:rtl/>
+        </w:rPr>
+        <w:t xml:space="preserve"> </w:t>
+      </w:r>
+      <w:r>
+        <w:rPr>
+          <w:rFonts w:ascii="David" w:hAnsi="David" w:cs="David"/>
+        </w:rPr>
+        <w:t>NAVBAR</w:t>
+      </w:r>
+      <w:r>
+        <w:rPr>
+          <w:rFonts w:ascii="David" w:hAnsi="David" w:cs="David" w:hint="cs"/>
+          <w:rtl/>
+        </w:rPr>
+        <w:t>,</w:t>
+      </w:r>
+      <w:r>
+        <w:rPr>
+          <w:rFonts w:ascii="David" w:hAnsi="David" w:cs="David" w:hint="cs"/>
+          <w:rtl/>
+        </w:rPr>
+        <w:t xml:space="preserve"> וכדומה.</w:t>
+      </w:r>
+    </w:p>
+    <w:p>
+      <w:pPr>
+        <w:pStyle w:val="ListParagraph"/>
+        <w:bidi/>
+        <w:spacing w:line="276" w:lineRule="auto"/>
+        <w:rPr>
+          <w:rFonts w:ascii="David" w:hAnsi="David" w:cs="David"/>
+          <w:rtl/>
+        </w:rPr>
+      </w:pPr>
+    </w:p>
+    <w:p>
+      <w:pPr>
+        <w:pStyle w:val="ListParagraph"/>
+        <w:numPr>
+          <w:ilvl w:val="0"/>
+          <w:numId w:val="13"/>
+        </w:numPr>
+        <w:bidi/>
+        <w:spacing w:line="276" w:lineRule="auto"/>
+        <w:rPr>
+          <w:rFonts w:ascii="David" w:hAnsi="David" w:cs="David"/>
+          <w:b/>
+          <w:bCs/>
+        </w:rPr>
+      </w:pPr>
+      <w:proofErr w:type="spellStart"/>
+      <w:r>
+        <w:rPr>
+          <w:rFonts w:ascii="David" w:hAnsi="David" w:cs="David"/>
+          <w:b/>
+          <w:bCs/>
+        </w:rPr>
+        <w:t>src</w:t>
+      </w:r>
+      <w:proofErr w:type="spellEnd"/>
+      <w:r>
+        <w:rPr>
+          <w:rFonts w:ascii="David" w:hAnsi="David" w:cs="David"/>
+          <w:b/>
+          <w:bCs/>
+        </w:rPr>
+        <w:t>/</w:t>
+      </w:r>
+      <w:r>
+        <w:rPr>
+          <w:rFonts w:ascii="David" w:hAnsi="David" w:cs="David"/>
+          <w:b/>
+          <w:bCs/>
+        </w:rPr>
+        <w:t>features</w:t>
+      </w:r>
+      <w:r>
+        <w:rPr>
+          <w:rFonts w:ascii="David" w:hAnsi="David" w:cs="David" w:hint="cs"/>
+          <w:b/>
+          <w:bCs/>
+          <w:rtl/>
+        </w:rPr>
+        <w:t>:</w:t>
+      </w:r>
+    </w:p>
+    <w:p>
+      <w:pPr>
+        <w:pStyle w:val="ListParagraph"/>
+        <w:bidi/>
+        <w:spacing w:line="276" w:lineRule="auto"/>
+        <w:rPr>
+          <w:rFonts w:ascii="David" w:hAnsi="David" w:cs="David"/>
+          <w:rtl/>
+        </w:rPr>
+      </w:pPr>
+      <w:r>
+        <w:rPr>
+          <w:rFonts w:ascii="David" w:hAnsi="David" w:cs="David" w:hint="cs"/>
+          <w:rtl/>
+        </w:rPr>
+        <w:t xml:space="preserve">מכיל את הפיתוח הספציפי הקשור לכל פיצ'ר. בתוך כל פיצ'ר קיים המבנה הבא: </w:t>
+      </w:r>
+    </w:p>
+    <w:p>
+      <w:pPr>
+        <w:pStyle w:val="ListParagraph"/>
+        <w:numPr>
+          <w:ilvl w:val="0"/>
+          <w:numId w:val="17"/>
+        </w:numPr>
+        <w:bidi/>
+        <w:spacing w:line="276" w:lineRule="auto"/>
+        <w:rPr>
+          <w:rFonts w:ascii="David" w:hAnsi="David" w:cs="David"/>
+        </w:rPr>
+      </w:pPr>
+      <w:proofErr w:type="spellStart"/>
+      <w:r>
+        <w:rPr>
+          <w:rFonts w:ascii="David" w:hAnsi="David" w:cs="David"/>
+        </w:rPr>
+        <w:t>api.ts</w:t>
+      </w:r>
+      <w:proofErr w:type="spellEnd"/>
+      <w:r>
+        <w:rPr>
+          <w:rFonts w:ascii="David" w:hAnsi="David" w:cs="David" w:hint="cs"/>
+          <w:rtl/>
+        </w:rPr>
+        <w:t>: מכיל את קריאות ה</w:t>
+      </w:r>
+      <w:r>
+        <w:rPr>
+          <w:rFonts w:ascii="David" w:hAnsi="David" w:cs="David"/>
+        </w:rPr>
+        <w:t>API</w:t>
+      </w:r>
+      <w:r>
+        <w:rPr>
+          <w:rFonts w:ascii="David" w:hAnsi="David" w:cs="David" w:hint="cs"/>
+          <w:rtl/>
+        </w:rPr>
+        <w:t xml:space="preserve"> עבור הפיצ'ר.</w:t>
+      </w:r>
+    </w:p>
+    <w:p>
+      <w:pPr>
+        <w:pStyle w:val="ListParagraph"/>
+        <w:numPr>
+          <w:ilvl w:val="0"/>
+          <w:numId w:val="17"/>
+        </w:numPr>
+        <w:bidi/>
+        <w:spacing w:line="276" w:lineRule="auto"/>
+        <w:rPr>
+          <w:rFonts w:ascii="David" w:hAnsi="David" w:cs="David"/>
+        </w:rPr>
+      </w:pPr>
+      <w:proofErr w:type="spellStart"/>
+      <w:r>
+        <w:rPr>
+          <w:rFonts w:ascii="David" w:hAnsi="David" w:cs="David"/>
+        </w:rPr>
+        <w:t>index.ts</w:t>
+      </w:r>
+      <w:proofErr w:type="spellEnd"/>
+      <w:r>
+        <w:rPr>
+          <w:rFonts w:ascii="David" w:hAnsi="David" w:cs="David" w:hint="cs"/>
+          <w:rtl/>
+        </w:rPr>
+        <w:t xml:space="preserve">: מכיל </w:t>
+      </w:r>
+      <w:r>
+        <w:rPr>
+          <w:rFonts w:ascii="David" w:hAnsi="David" w:cs="David"/>
+        </w:rPr>
+        <w:t>EXPORT</w:t>
+      </w:r>
+      <w:r>
+        <w:rPr>
+          <w:rFonts w:ascii="David" w:hAnsi="David" w:cs="David" w:hint="cs"/>
+          <w:rtl/>
+        </w:rPr>
+        <w:t xml:space="preserve"> עבור קומפוננטות רלוונטיות שצריך לייבא ממקומות אחרים.</w:t>
+      </w:r>
+    </w:p>
+    <w:p>
+      <w:pPr>
+        <w:pStyle w:val="ListParagraph"/>
+        <w:numPr>
+          <w:ilvl w:val="0"/>
+          <w:numId w:val="17"/>
+        </w:numPr>
+        <w:bidi/>
+        <w:spacing w:line="276" w:lineRule="auto"/>
+        <w:rPr>
+          <w:rFonts w:ascii="David" w:hAnsi="David" w:cs="David"/>
+        </w:rPr>
+      </w:pPr>
+      <w:r>
+        <w:rPr>
+          <w:rFonts w:ascii="David" w:hAnsi="David" w:cs="David" w:hint="cs"/>
+          <w:rtl/>
+        </w:rPr>
+        <w:t xml:space="preserve"> </w:t>
+      </w:r>
+      <w:proofErr w:type="spellStart"/>
+      <w:r>
+        <w:rPr>
+          <w:rFonts w:ascii="David" w:hAnsi="David" w:cs="David"/>
+        </w:rPr>
+        <w:t>queries</w:t>
+      </w:r>
+      <w:r>
+        <w:rPr>
+          <w:rFonts w:ascii="David" w:hAnsi="David" w:cs="David"/>
+        </w:rPr>
+        <w:t>.ts</w:t>
+      </w:r>
+      <w:proofErr w:type="spellEnd"/>
+      <w:r>
+        <w:rPr>
+          <w:rFonts w:ascii="David" w:hAnsi="David" w:cs="David" w:hint="cs"/>
+          <w:rtl/>
+        </w:rPr>
+        <w:t>:</w:t>
+      </w:r>
+      <w:r>
+        <w:rPr>
+          <w:rFonts w:ascii="David" w:hAnsi="David" w:cs="David" w:hint="cs"/>
+          <w:rtl/>
+        </w:rPr>
+        <w:t xml:space="preserve"> מכיל </w:t>
+      </w:r>
+      <w:r>
+        <w:rPr>
+          <w:rFonts w:ascii="David" w:hAnsi="David" w:cs="David"/>
+        </w:rPr>
+        <w:t>REACT QUERIES</w:t>
+      </w:r>
+      <w:r>
+        <w:rPr>
+          <w:rFonts w:ascii="David" w:hAnsi="David" w:cs="David" w:hint="cs"/>
+          <w:rtl/>
+        </w:rPr>
+        <w:t xml:space="preserve"> עבור ה</w:t>
+      </w:r>
+      <w:r>
+        <w:rPr>
+          <w:rFonts w:ascii="David" w:hAnsi="David" w:cs="David"/>
+        </w:rPr>
+        <w:t>API</w:t>
+      </w:r>
+      <w:r>
+        <w:rPr>
+          <w:rFonts w:ascii="David" w:hAnsi="David" w:cs="David" w:hint="cs"/>
+          <w:rtl/>
+        </w:rPr>
+        <w:t xml:space="preserve"> הרלוונטים עבור הפיצ'ר </w:t>
+      </w:r>
+      <w:r>
+        <w:rPr>
+          <w:rFonts w:ascii="David" w:hAnsi="David" w:cs="David"/>
+          <w:rtl/>
+        </w:rPr>
+        <w:t>–</w:t>
+      </w:r>
+      <w:r>
+        <w:rPr>
+          <w:rFonts w:ascii="David" w:hAnsi="David" w:cs="David" w:hint="cs"/>
+          <w:rtl/>
+        </w:rPr>
+        <w:t xml:space="preserve"> מאפשר תחזוקה קלה של התמודדות עם תקלות, המתנה, וכדומה </w:t>
+      </w:r>
+      <w:r>
+        <w:rPr>
+          <w:rFonts w:ascii="David" w:hAnsi="David" w:cs="David"/>
+          <w:rtl/>
+        </w:rPr>
+        <w:t>–</w:t>
+      </w:r>
+      <w:r>
+        <w:rPr>
+          <w:rFonts w:ascii="David" w:hAnsi="David" w:cs="David" w:hint="cs"/>
+          <w:rtl/>
+        </w:rPr>
+        <w:t xml:space="preserve"> מעטפת לקריאות ל</w:t>
+      </w:r>
+      <w:r>
+        <w:rPr>
+          <w:rFonts w:ascii="David" w:hAnsi="David" w:cs="David"/>
+        </w:rPr>
+        <w:t>API</w:t>
+      </w:r>
+      <w:r>
+        <w:rPr>
+          <w:rFonts w:ascii="David" w:hAnsi="David" w:cs="David" w:hint="cs"/>
+          <w:rtl/>
+        </w:rPr>
+        <w:t xml:space="preserve"> המסייעת לתחזוקה.</w:t>
+      </w:r>
+    </w:p>
+    <w:p>
+      <w:pPr>
+        <w:pStyle w:val="ListParagraph"/>
+        <w:numPr>
+          <w:ilvl w:val="0"/>
+          <w:numId w:val="17"/>
+        </w:numPr>
+        <w:bidi/>
+        <w:spacing w:line="276" w:lineRule="auto"/>
+        <w:rPr>
+          <w:rFonts w:ascii="David" w:hAnsi="David" w:cs="David"/>
+        </w:rPr>
+      </w:pPr>
+      <w:proofErr w:type="spellStart"/>
+      <w:r>
+        <w:rPr>
+          <w:rFonts w:ascii="David" w:hAnsi="David" w:cs="David"/>
+        </w:rPr>
+        <w:t>schema</w:t>
+      </w:r>
+      <w:r>
+        <w:rPr>
+          <w:rFonts w:ascii="David" w:hAnsi="David" w:cs="David"/>
+        </w:rPr>
+        <w:t>.ts</w:t>
+      </w:r>
+      <w:proofErr w:type="spellEnd"/>
+      <w:r>
+        <w:rPr>
+          <w:rFonts w:ascii="David" w:hAnsi="David" w:cs="David" w:hint="cs"/>
+          <w:rtl/>
+        </w:rPr>
+        <w:t>:</w:t>
+      </w:r>
+      <w:r>
+        <w:rPr>
+          <w:rFonts w:ascii="David" w:hAnsi="David" w:cs="David" w:hint="cs"/>
+          <w:rtl/>
+        </w:rPr>
+        <w:t xml:space="preserve"> מכיל מבנים ומודלים רלוונטים.</w:t>
+      </w:r>
+    </w:p>
+    <w:p>
+      <w:pPr>
+        <w:pStyle w:val="ListParagraph"/>
+        <w:numPr>
+          <w:ilvl w:val="0"/>
+          <w:numId w:val="17"/>
+        </w:numPr>
+        <w:bidi/>
+        <w:spacing w:line="276" w:lineRule="auto"/>
+        <w:rPr>
+          <w:rFonts w:ascii="David" w:hAnsi="David" w:cs="David"/>
+        </w:rPr>
+      </w:pPr>
+      <w:proofErr w:type="spellStart"/>
+      <w:r>
+        <w:rPr>
+          <w:rFonts w:ascii="David" w:hAnsi="David" w:cs="David"/>
+        </w:rPr>
+        <w:t>filters.ts</w:t>
+      </w:r>
+      <w:proofErr w:type="spellEnd"/>
+      <w:r>
+        <w:rPr>
+          <w:rFonts w:ascii="David" w:hAnsi="David" w:cs="David" w:hint="cs"/>
+          <w:rtl/>
+        </w:rPr>
+        <w:t xml:space="preserve">: רלוונטי רק בחלק מהפיצ'רים </w:t>
+      </w:r>
+      <w:r>
+        <w:rPr>
+          <w:rFonts w:ascii="David" w:hAnsi="David" w:cs="David"/>
+          <w:rtl/>
+        </w:rPr>
+        <w:t>–</w:t>
+      </w:r>
+      <w:r>
+        <w:rPr>
+          <w:rFonts w:ascii="David" w:hAnsi="David" w:cs="David" w:hint="cs"/>
+          <w:rtl/>
+        </w:rPr>
+        <w:t xml:space="preserve"> מכיל פילטרים אפשריים עבור חיפושים.</w:t>
+      </w:r>
+    </w:p>
+    <w:p>
+      <w:pPr>
+        <w:pStyle w:val="ListParagraph"/>
+        <w:numPr>
+          <w:ilvl w:val="0"/>
+          <w:numId w:val="17"/>
+        </w:numPr>
+        <w:bidi/>
+        <w:spacing w:line="276" w:lineRule="auto"/>
+        <w:rPr>
+          <w:rFonts w:ascii="David" w:hAnsi="David" w:cs="David"/>
+        </w:rPr>
+      </w:pPr>
+      <w:r>
+        <w:rPr>
+          <w:rFonts w:ascii="David" w:hAnsi="David" w:cs="David" w:hint="cs"/>
+          <w:rtl/>
+        </w:rPr>
+        <w:t xml:space="preserve">חבילת </w:t>
+      </w:r>
+      <w:r>
+        <w:rPr>
+          <w:rFonts w:ascii="David" w:hAnsi="David" w:cs="David"/>
+        </w:rPr>
+        <w:t>components</w:t>
+      </w:r>
+      <w:r>
+        <w:rPr>
+          <w:rFonts w:ascii="David" w:hAnsi="David" w:cs="David" w:hint="cs"/>
+          <w:rtl/>
+        </w:rPr>
+        <w:t xml:space="preserve"> (עשויה לכלול גם חבילת </w:t>
+      </w:r>
+      <w:r>
+        <w:rPr>
+          <w:rFonts w:ascii="David" w:hAnsi="David" w:cs="David"/>
+        </w:rPr>
+        <w:t>admin</w:t>
+      </w:r>
+      <w:r>
+        <w:rPr>
+          <w:rFonts w:ascii="David" w:hAnsi="David" w:cs="David" w:hint="cs"/>
+          <w:rtl/>
+        </w:rPr>
+        <w:t xml:space="preserve"> בתוכה): מכילה קומפוננטות ספציפיות לפיצ'ר ולמצב </w:t>
+      </w:r>
+      <w:r>
+        <w:rPr>
+          <w:rFonts w:ascii="David" w:hAnsi="David" w:cs="David"/>
+        </w:rPr>
+        <w:t>ADMIN</w:t>
+      </w:r>
+      <w:r>
+        <w:rPr>
+          <w:rFonts w:ascii="David" w:hAnsi="David" w:cs="David" w:hint="cs"/>
+          <w:rtl/>
+        </w:rPr>
+        <w:t xml:space="preserve"> בתוכו.</w:t>
+      </w:r>
+      <w:r>
+        <w:rPr>
+          <w:rFonts w:ascii="David" w:hAnsi="David" w:cs="David" w:hint="cs"/>
+          <w:rtl/>
+        </w:rPr>
+        <w:t xml:space="preserve"> נפרטי מעט על קומפוננטות עיקריות לפי פיצ'ר:</w:t>
+      </w:r>
+    </w:p>
+    <w:p>
+      <w:pPr>
+        <w:pStyle w:val="ListParagraph"/>
+        <w:numPr>
+          <w:ilvl w:val="1"/>
+          <w:numId w:val="17"/>
+        </w:numPr>
+        <w:bidi/>
+        <w:spacing w:line="276" w:lineRule="auto"/>
+        <w:rPr>
+          <w:rFonts w:ascii="David" w:hAnsi="David" w:cs="David"/>
+        </w:rPr>
+      </w:pPr>
+      <w:r>
+        <w:rPr>
+          <w:rFonts w:ascii="David" w:hAnsi="David" w:cs="David"/>
+        </w:rPr>
+        <w:t>auth</w:t>
+      </w:r>
+      <w:r>
+        <w:rPr>
+          <w:rFonts w:ascii="David" w:hAnsi="David" w:cs="David" w:hint="cs"/>
+          <w:rtl/>
+        </w:rPr>
+        <w:t>: מכיל דפי הרשמה והתחברות</w:t>
+      </w:r>
+    </w:p>
+    <w:p>
+      <w:pPr>
+        <w:pStyle w:val="ListParagraph"/>
+        <w:numPr>
+          <w:ilvl w:val="1"/>
+          <w:numId w:val="17"/>
+        </w:numPr>
+        <w:bidi/>
+        <w:spacing w:line="276" w:lineRule="auto"/>
+        <w:rPr>
+          <w:rFonts w:ascii="David" w:hAnsi="David" w:cs="David"/>
+        </w:rPr>
+      </w:pPr>
+      <w:r>
+        <w:rPr>
+          <w:rFonts w:ascii="David" w:hAnsi="David" w:cs="David"/>
+        </w:rPr>
+        <w:t>cart</w:t>
+      </w:r>
+      <w:r>
+        <w:rPr>
+          <w:rFonts w:ascii="David" w:hAnsi="David" w:cs="David" w:hint="cs"/>
+          <w:rtl/>
+        </w:rPr>
+        <w:t xml:space="preserve">: מכיל את דף סל הקניות, ורכיבים שונים שיושבים בתוכו כמו סיכום הזמנה, </w:t>
+      </w:r>
+      <w:r>
+        <w:rPr>
+          <w:rFonts w:ascii="David" w:hAnsi="David" w:cs="David"/>
+        </w:rPr>
+        <w:t>MODAL</w:t>
+      </w:r>
+      <w:r>
+        <w:rPr>
+          <w:rFonts w:ascii="David" w:hAnsi="David" w:cs="David" w:hint="cs"/>
+          <w:rtl/>
+        </w:rPr>
+        <w:t xml:space="preserve"> של בעיות בסל, רשימת פריטים וכדומה.</w:t>
+      </w:r>
+    </w:p>
+    <w:p>
+      <w:pPr>
+        <w:pStyle w:val="ListParagraph"/>
+        <w:numPr>
+          <w:ilvl w:val="1"/>
+          <w:numId w:val="17"/>
+        </w:numPr>
+        <w:bidi/>
+        <w:spacing w:line="276" w:lineRule="auto"/>
+        <w:rPr>
+          <w:rFonts w:ascii="David" w:hAnsi="David" w:cs="David"/>
+        </w:rPr>
+      </w:pPr>
+      <w:r>
+        <w:rPr>
+          <w:rFonts w:ascii="David" w:hAnsi="David" w:cs="David"/>
+        </w:rPr>
+        <w:lastRenderedPageBreak/>
+        <w:t>catalog</w:t>
+      </w:r>
+      <w:r>
+        <w:rPr>
+          <w:rFonts w:ascii="David" w:hAnsi="David" w:cs="David" w:hint="cs"/>
+          <w:rtl/>
+        </w:rPr>
+        <w:t xml:space="preserve">: מכיל את דף הקטלוג, </w:t>
+      </w:r>
+      <w:r>
+        <w:rPr>
+          <w:rFonts w:ascii="David" w:hAnsi="David" w:cs="David" w:hint="cs"/>
+          <w:rtl/>
+        </w:rPr>
+        <w:t>ורכיבים שונים שיושבים בתוכו</w:t>
+      </w:r>
+      <w:r>
+        <w:rPr>
+          <w:rFonts w:ascii="David" w:hAnsi="David" w:cs="David" w:hint="cs"/>
+          <w:rtl/>
+        </w:rPr>
+        <w:t xml:space="preserve"> כמו שורת חיפוש ופילטרים, דף פרטי מוצר, כרטיס מוצר, וכדומה. בנוסף יש גם דברים יותר ספציפיים ל</w:t>
+      </w:r>
+      <w:r>
+        <w:rPr>
+          <w:rFonts w:ascii="David" w:hAnsi="David" w:cs="David"/>
+        </w:rPr>
+        <w:t>ADMIN</w:t>
+      </w:r>
+      <w:r>
+        <w:rPr>
+          <w:rFonts w:ascii="David" w:hAnsi="David" w:cs="David" w:hint="cs"/>
+          <w:rtl/>
+        </w:rPr>
+        <w:t xml:space="preserve"> כמו </w:t>
+      </w:r>
+      <w:r>
+        <w:rPr>
+          <w:rFonts w:ascii="David" w:hAnsi="David" w:cs="David"/>
+        </w:rPr>
+        <w:t>MODALS</w:t>
+      </w:r>
+      <w:r>
+        <w:rPr>
+          <w:rFonts w:ascii="David" w:hAnsi="David" w:cs="David" w:hint="cs"/>
+          <w:rtl/>
+        </w:rPr>
+        <w:t xml:space="preserve"> של מחיקה או שחזור מוצר, יצירת מוצר וכן הלאה.</w:t>
+      </w:r>
+    </w:p>
+    <w:p>
+      <w:pPr>
+        <w:pStyle w:val="ListParagraph"/>
+        <w:numPr>
+          <w:ilvl w:val="1"/>
+          <w:numId w:val="17"/>
+        </w:numPr>
+        <w:bidi/>
+        <w:spacing w:line="276" w:lineRule="auto"/>
+        <w:rPr>
+          <w:rFonts w:ascii="David" w:hAnsi="David" w:cs="David"/>
+        </w:rPr>
+      </w:pPr>
+      <w:r>
+        <w:rPr>
+          <w:rFonts w:ascii="David" w:hAnsi="David" w:cs="David"/>
+        </w:rPr>
+        <w:t>categories</w:t>
+      </w:r>
+      <w:r>
+        <w:rPr>
+          <w:rFonts w:ascii="David" w:hAnsi="David" w:cs="David" w:hint="cs"/>
+          <w:rtl/>
+        </w:rPr>
+        <w:t>:</w:t>
+      </w:r>
+      <w:r>
+        <w:rPr>
+          <w:rFonts w:ascii="David" w:hAnsi="David" w:cs="David" w:hint="cs"/>
+          <w:rtl/>
+        </w:rPr>
+        <w:t xml:space="preserve"> רלוונטי ל</w:t>
+      </w:r>
+      <w:r>
+        <w:rPr>
+          <w:rFonts w:ascii="David" w:hAnsi="David" w:cs="David"/>
+        </w:rPr>
+        <w:t>ADMIN</w:t>
+      </w:r>
+      <w:r>
+        <w:rPr>
+          <w:rFonts w:ascii="David" w:hAnsi="David" w:cs="David" w:hint="cs"/>
+          <w:rtl/>
+        </w:rPr>
+        <w:t xml:space="preserve"> </w:t>
+      </w:r>
+      <w:r>
+        <w:rPr>
+          <w:rFonts w:ascii="David" w:hAnsi="David" w:cs="David"/>
+          <w:rtl/>
+        </w:rPr>
+        <w:t>–</w:t>
+      </w:r>
+      <w:r>
+        <w:rPr>
+          <w:rFonts w:ascii="David" w:hAnsi="David" w:cs="David" w:hint="cs"/>
+          <w:rtl/>
+        </w:rPr>
+        <w:t xml:space="preserve"> מכיל את דף הקטגוריות כולל </w:t>
+      </w:r>
+      <w:r>
+        <w:rPr>
+          <w:rFonts w:ascii="David" w:hAnsi="David" w:cs="David"/>
+        </w:rPr>
+        <w:t>MODALS</w:t>
+      </w:r>
+      <w:r>
+        <w:rPr>
+          <w:rFonts w:ascii="David" w:hAnsi="David" w:cs="David" w:hint="cs"/>
+          <w:rtl/>
+        </w:rPr>
+        <w:t xml:space="preserve"> עבור </w:t>
+      </w:r>
+      <w:r>
+        <w:rPr>
+          <w:rFonts w:ascii="David" w:hAnsi="David" w:cs="David"/>
+        </w:rPr>
+        <w:t>CRUD</w:t>
+      </w:r>
+      <w:r>
+        <w:rPr>
+          <w:rFonts w:ascii="David" w:hAnsi="David" w:cs="David" w:hint="cs"/>
+          <w:rtl/>
+        </w:rPr>
+        <w:t>.</w:t>
+      </w:r>
+    </w:p>
+    <w:p>
+      <w:pPr>
+        <w:pStyle w:val="ListParagraph"/>
+        <w:numPr>
+          <w:ilvl w:val="1"/>
+          <w:numId w:val="17"/>
+        </w:numPr>
+        <w:bidi/>
+        <w:spacing w:line="276" w:lineRule="auto"/>
+        <w:rPr>
+          <w:rFonts w:ascii="David" w:hAnsi="David" w:cs="David"/>
+        </w:rPr>
+      </w:pPr>
+      <w:r>
+        <w:rPr>
+          <w:rFonts w:ascii="David" w:hAnsi="David" w:cs="David"/>
+        </w:rPr>
+        <w:t>checkout</w:t>
+      </w:r>
+      <w:r>
+        <w:rPr>
+          <w:rFonts w:ascii="David" w:hAnsi="David" w:cs="David" w:hint="cs"/>
+          <w:rtl/>
+        </w:rPr>
+        <w:t>:</w:t>
+      </w:r>
+      <w:r>
+        <w:rPr>
+          <w:rFonts w:ascii="David" w:hAnsi="David" w:cs="David" w:hint="cs"/>
+          <w:rtl/>
+        </w:rPr>
+        <w:t xml:space="preserve"> מכיל את מסכי תהליך ההזמנה </w:t>
+      </w:r>
+      <w:r>
+        <w:rPr>
+          <w:rFonts w:ascii="David" w:hAnsi="David" w:cs="David"/>
+          <w:rtl/>
+        </w:rPr>
+        <w:t>–</w:t>
+      </w:r>
+      <w:r>
+        <w:rPr>
+          <w:rFonts w:ascii="David" w:hAnsi="David" w:cs="David" w:hint="cs"/>
+          <w:rtl/>
+        </w:rPr>
+        <w:t xml:space="preserve"> נפתח מתוך סל הקניות </w:t>
+      </w:r>
+      <w:r>
+        <w:rPr>
+          <w:rFonts w:ascii="David" w:hAnsi="David" w:cs="David"/>
+          <w:rtl/>
+        </w:rPr>
+        <w:t>–</w:t>
+      </w:r>
+      <w:r>
+        <w:rPr>
+          <w:rFonts w:ascii="David" w:hAnsi="David" w:cs="David" w:hint="cs"/>
+          <w:rtl/>
+        </w:rPr>
+        <w:t xml:space="preserve"> מכיל פרטי משלוח, פרטי אשראי, והתמודדות עם הצלחה\כישלון של ההזמנה.</w:t>
+      </w:r>
+    </w:p>
+    <w:p>
+      <w:pPr>
+        <w:pStyle w:val="ListParagraph"/>
+        <w:numPr>
+          <w:ilvl w:val="1"/>
+          <w:numId w:val="17"/>
+        </w:numPr>
+        <w:bidi/>
+        <w:spacing w:line="276" w:lineRule="auto"/>
+        <w:rPr>
+          <w:rFonts w:ascii="David" w:hAnsi="David" w:cs="David"/>
+        </w:rPr>
+      </w:pPr>
+      <w:r>
+        <w:rPr>
+          <w:rFonts w:ascii="David" w:hAnsi="David" w:cs="David"/>
+        </w:rPr>
+        <w:t>home</w:t>
+      </w:r>
+      <w:r>
+        <w:rPr>
+          <w:rFonts w:ascii="David" w:hAnsi="David" w:cs="David" w:hint="cs"/>
+          <w:rtl/>
+        </w:rPr>
+        <w:t>:</w:t>
+      </w:r>
+      <w:r>
+        <w:rPr>
+          <w:rFonts w:ascii="David" w:hAnsi="David" w:cs="David" w:hint="cs"/>
+          <w:rtl/>
+        </w:rPr>
+        <w:t xml:space="preserve"> מכיל את מסך הבית על כל חלקיו </w:t>
+      </w:r>
+      <w:r>
+        <w:rPr>
+          <w:rFonts w:ascii="David" w:hAnsi="David" w:cs="David"/>
+          <w:rtl/>
+        </w:rPr>
+        <w:t>–</w:t>
+      </w:r>
+      <w:r>
+        <w:rPr>
+          <w:rFonts w:ascii="David" w:hAnsi="David" w:cs="David" w:hint="cs"/>
+          <w:rtl/>
+        </w:rPr>
+        <w:t xml:space="preserve"> קומפוננטה לכל </w:t>
+      </w:r>
+      <w:r>
+        <w:rPr>
+          <w:rFonts w:ascii="David" w:hAnsi="David" w:cs="David"/>
+        </w:rPr>
+        <w:t>SECTION</w:t>
+      </w:r>
+      <w:r>
+        <w:rPr>
+          <w:rFonts w:ascii="David" w:hAnsi="David" w:cs="David" w:hint="cs"/>
+          <w:rtl/>
+        </w:rPr>
+        <w:t>.</w:t>
+      </w:r>
+    </w:p>
+    <w:p>
+      <w:pPr>
+        <w:pStyle w:val="ListParagraph"/>
+        <w:numPr>
+          <w:ilvl w:val="1"/>
+          <w:numId w:val="17"/>
+        </w:numPr>
+        <w:bidi/>
+        <w:spacing w:line="276" w:lineRule="auto"/>
+        <w:rPr>
+          <w:rFonts w:ascii="David" w:hAnsi="David" w:cs="David"/>
+        </w:rPr>
+      </w:pPr>
+      <w:r>
+        <w:rPr>
+          <w:rFonts w:ascii="David" w:hAnsi="David" w:cs="David"/>
+        </w:rPr>
+        <w:t>images</w:t>
+      </w:r>
+      <w:r>
+        <w:rPr>
+          <w:rFonts w:ascii="David" w:hAnsi="David" w:cs="David" w:hint="cs"/>
+          <w:rtl/>
+        </w:rPr>
+        <w:t>:</w:t>
+      </w:r>
+      <w:r>
+        <w:rPr>
+          <w:rFonts w:ascii="David" w:hAnsi="David" w:cs="David" w:hint="cs"/>
+          <w:rtl/>
+        </w:rPr>
+        <w:t xml:space="preserve"> מכיל קומפוננטה של העלאת תמונה.</w:t>
+      </w:r>
+    </w:p>
+    <w:p>
+      <w:pPr>
+        <w:pStyle w:val="ListParagraph"/>
+        <w:numPr>
+          <w:ilvl w:val="1"/>
+          <w:numId w:val="17"/>
+        </w:numPr>
+        <w:bidi/>
+        <w:spacing w:line="276" w:lineRule="auto"/>
+        <w:rPr>
+          <w:rFonts w:ascii="David" w:hAnsi="David" w:cs="David"/>
+        </w:rPr>
+      </w:pPr>
+      <w:r>
+        <w:rPr>
+          <w:rFonts w:ascii="David" w:hAnsi="David" w:cs="David"/>
+        </w:rPr>
+        <w:t>orders</w:t>
+      </w:r>
+      <w:r>
+        <w:rPr>
+          <w:rFonts w:ascii="David" w:hAnsi="David" w:cs="David"/>
+          <w:rtl/>
+        </w:rPr>
+        <w:t>:</w:t>
+      </w:r>
+      <w:r>
+        <w:rPr>
+          <w:rFonts w:ascii="David" w:hAnsi="David" w:cs="David" w:hint="cs"/>
+          <w:rtl/>
+        </w:rPr>
+        <w:t xml:space="preserve"> מכיל את כל פיצ'ר ההזמנות </w:t>
+      </w:r>
+      <w:r>
+        <w:rPr>
+          <w:rFonts w:ascii="David" w:hAnsi="David" w:cs="David"/>
+          <w:rtl/>
+        </w:rPr>
+        <w:t>–</w:t>
+      </w:r>
+      <w:r>
+        <w:rPr>
+          <w:rFonts w:ascii="David" w:hAnsi="David" w:cs="David" w:hint="cs"/>
+          <w:rtl/>
+        </w:rPr>
+        <w:t xml:space="preserve"> מסכי פרטי הזמנה ומסך כל ההזמנות, ומכיל קומפוננטות המרכיבות את המסכים הללו כמו שורת החיפוש, כרטיס פרטי משלוח\תשלום, פרטי המוצרים המוזמנים ועוד.</w:t>
+      </w:r>
+    </w:p>
+    <w:p>
+      <w:pPr>
+        <w:pStyle w:val="ListParagraph"/>
+        <w:numPr>
+          <w:ilvl w:val="1"/>
+          <w:numId w:val="17"/>
+        </w:numPr>
+        <w:bidi/>
+        <w:spacing w:line="276" w:lineRule="auto"/>
+        <w:rPr>
+          <w:rFonts w:ascii="David" w:hAnsi="David" w:cs="David"/>
+        </w:rPr>
+      </w:pPr>
+      <w:r>
+        <w:rPr>
+          <w:rFonts w:ascii="David" w:hAnsi="David" w:cs="David"/>
+        </w:rPr>
+        <w:t>sessions</w:t>
+      </w:r>
+      <w:r>
+        <w:rPr>
+          <w:rFonts w:ascii="David" w:hAnsi="David" w:cs="David"/>
+          <w:rtl/>
+        </w:rPr>
+        <w:t>:</w:t>
+      </w:r>
+      <w:r>
+        <w:rPr>
+          <w:rFonts w:ascii="David" w:hAnsi="David" w:cs="David" w:hint="cs"/>
+          <w:rtl/>
+        </w:rPr>
+        <w:t xml:space="preserve"> </w:t>
+      </w:r>
+      <w:r>
+        <w:rPr>
+          <w:rFonts w:ascii="David" w:hAnsi="David" w:cs="David" w:hint="cs"/>
+          <w:rtl/>
+        </w:rPr>
+        <w:t>רלוונטי ל</w:t>
+      </w:r>
+      <w:r>
+        <w:rPr>
+          <w:rFonts w:ascii="David" w:hAnsi="David" w:cs="David"/>
+        </w:rPr>
+        <w:t>ADMIN</w:t>
+      </w:r>
+      <w:r>
+        <w:rPr>
+          <w:rFonts w:ascii="David" w:hAnsi="David" w:cs="David" w:hint="cs"/>
+          <w:rtl/>
+        </w:rPr>
+        <w:t xml:space="preserve"> </w:t>
+      </w:r>
+      <w:r>
+        <w:rPr>
+          <w:rFonts w:ascii="David" w:hAnsi="David" w:cs="David"/>
+          <w:rtl/>
+        </w:rPr>
+        <w:t>–</w:t>
+      </w:r>
+      <w:r>
+        <w:rPr>
+          <w:rFonts w:ascii="David" w:hAnsi="David" w:cs="David" w:hint="cs"/>
+          <w:rtl/>
+        </w:rPr>
+        <w:t xml:space="preserve"> מכיל את דף הצפייה ב</w:t>
+      </w:r>
+      <w:r>
+        <w:rPr>
+          <w:rFonts w:ascii="David" w:hAnsi="David" w:cs="David"/>
+        </w:rPr>
+        <w:t>SESSIONS</w:t>
+      </w:r>
+      <w:r>
+        <w:rPr>
+          <w:rFonts w:ascii="David" w:hAnsi="David" w:cs="David" w:hint="cs"/>
+          <w:rtl/>
+        </w:rPr>
+        <w:t xml:space="preserve"> ואת הפעולות האפשריות בו כמו מחיקה של </w:t>
+      </w:r>
+      <w:r>
+        <w:rPr>
+          <w:rFonts w:ascii="David" w:hAnsi="David" w:cs="David"/>
+        </w:rPr>
+        <w:t>REFRESH TOKENS</w:t>
+      </w:r>
+      <w:r>
+        <w:rPr>
+          <w:rFonts w:ascii="David" w:hAnsi="David" w:cs="David" w:hint="cs"/>
+          <w:rtl/>
+        </w:rPr>
+        <w:t>, חיפוש וכדומה.</w:t>
+      </w:r>
+    </w:p>
+    <w:p>
+      <w:pPr>
+        <w:pStyle w:val="ListParagraph"/>
+        <w:numPr>
+          <w:ilvl w:val="1"/>
+          <w:numId w:val="17"/>
+        </w:numPr>
+        <w:bidi/>
+        <w:spacing w:line="276" w:lineRule="auto"/>
+        <w:rPr>
+          <w:rFonts w:ascii="David" w:hAnsi="David" w:cs="David"/>
+        </w:rPr>
+      </w:pPr>
+      <w:r>
+        <w:rPr>
+          <w:rFonts w:ascii="David" w:hAnsi="David" w:cs="David"/>
+        </w:rPr>
+        <w:t>stock</w:t>
+      </w:r>
+      <w:r>
+        <w:rPr>
+          <w:rFonts w:ascii="David" w:hAnsi="David" w:cs="David"/>
+          <w:rtl/>
+        </w:rPr>
+        <w:t>:</w:t>
+      </w:r>
+      <w:r>
+        <w:rPr>
+          <w:rFonts w:ascii="David" w:hAnsi="David" w:cs="David" w:hint="cs"/>
+          <w:rtl/>
+        </w:rPr>
+        <w:t xml:space="preserve"> </w:t>
+      </w:r>
+      <w:r>
+        <w:rPr>
+          <w:rFonts w:ascii="David" w:hAnsi="David" w:cs="David" w:hint="cs"/>
+          <w:rtl/>
+        </w:rPr>
+        <w:t>רלוונטי ל</w:t>
+      </w:r>
+      <w:r>
+        <w:rPr>
+          <w:rFonts w:ascii="David" w:hAnsi="David" w:cs="David"/>
+        </w:rPr>
+        <w:t>ADMIN</w:t>
+      </w:r>
+      <w:r>
+        <w:rPr>
+          <w:rFonts w:ascii="David" w:hAnsi="David" w:cs="David" w:hint="cs"/>
+          <w:rtl/>
+        </w:rPr>
+        <w:t xml:space="preserve"> </w:t>
+      </w:r>
+      <w:r>
+        <w:rPr>
+          <w:rFonts w:ascii="David" w:hAnsi="David" w:cs="David"/>
+          <w:rtl/>
+        </w:rPr>
+        <w:t>–</w:t>
+      </w:r>
+      <w:r>
+        <w:rPr>
+          <w:rFonts w:ascii="David" w:hAnsi="David" w:cs="David" w:hint="cs"/>
+          <w:rtl/>
+        </w:rPr>
+        <w:t xml:space="preserve"> מכיל את כל הפונקציונליות שקשורה לתחזוקת מלאי </w:t>
+      </w:r>
+      <w:r>
+        <w:rPr>
+          <w:rFonts w:ascii="David" w:hAnsi="David" w:cs="David"/>
+          <w:rtl/>
+        </w:rPr>
+        <w:t>–</w:t>
+      </w:r>
+      <w:r>
+        <w:rPr>
+          <w:rFonts w:ascii="David" w:hAnsi="David" w:cs="David" w:hint="cs"/>
+          <w:rtl/>
+        </w:rPr>
+        <w:t xml:space="preserve"> דף מלאי, פעולות </w:t>
+      </w:r>
+      <w:r>
+        <w:rPr>
+          <w:rFonts w:ascii="David" w:hAnsi="David" w:cs="David"/>
+        </w:rPr>
+        <w:t>CRUD</w:t>
+      </w:r>
+      <w:r>
+        <w:rPr>
+          <w:rFonts w:ascii="David" w:hAnsi="David" w:cs="David" w:hint="cs"/>
+          <w:rtl/>
+        </w:rPr>
+        <w:t>, חיפוש ועוד.</w:t>
+      </w:r>
+    </w:p>
+    <w:p>
+      <w:pPr>
+        <w:pStyle w:val="ListParagraph"/>
+        <w:numPr>
+          <w:ilvl w:val="1"/>
+          <w:numId w:val="17"/>
+        </w:numPr>
+        <w:bidi/>
+        <w:spacing w:line="276" w:lineRule="auto"/>
+        <w:rPr>
+          <w:rFonts w:ascii="David" w:hAnsi="David" w:cs="David"/>
+        </w:rPr>
+      </w:pPr>
+      <w:r>
+        <w:rPr>
+          <w:rFonts w:ascii="David" w:hAnsi="David" w:cs="David"/>
+        </w:rPr>
+        <w:t>users</w:t>
+      </w:r>
+      <w:r>
+        <w:rPr>
+          <w:rFonts w:ascii="David" w:hAnsi="David" w:cs="David"/>
+          <w:rtl/>
+        </w:rPr>
+        <w:t>:</w:t>
+      </w:r>
+      <w:r>
+        <w:rPr>
+          <w:rFonts w:ascii="David" w:hAnsi="David" w:cs="David" w:hint="cs"/>
+          <w:rtl/>
+        </w:rPr>
+        <w:t xml:space="preserve"> מכיל את כל הדברים הקשורים לתחזוקת משתמשים </w:t>
+      </w:r>
+      <w:r>
+        <w:rPr>
+          <w:rFonts w:ascii="David" w:hAnsi="David" w:cs="David"/>
+          <w:rtl/>
+        </w:rPr>
+        <w:t>–</w:t>
+      </w:r>
+      <w:r>
+        <w:rPr>
+          <w:rFonts w:ascii="David" w:hAnsi="David" w:cs="David" w:hint="cs"/>
+          <w:rtl/>
+        </w:rPr>
+        <w:t xml:space="preserve"> דף פרופיל, שינוי סיסמא, מחיקת לקוח, ודברים ספציפיים ל</w:t>
+      </w:r>
+      <w:r>
+        <w:rPr>
+          <w:rFonts w:ascii="David" w:hAnsi="David" w:cs="David"/>
+        </w:rPr>
+        <w:t>ADMIN</w:t>
+      </w:r>
+      <w:r>
+        <w:rPr>
+          <w:rFonts w:ascii="David" w:hAnsi="David" w:cs="David" w:hint="cs"/>
+          <w:rtl/>
+        </w:rPr>
+        <w:t xml:space="preserve"> כמו קידום ל</w:t>
+      </w:r>
+      <w:r>
+        <w:rPr>
+          <w:rFonts w:ascii="David" w:hAnsi="David" w:cs="David"/>
+        </w:rPr>
+        <w:t>ADMIN</w:t>
+      </w:r>
+      <w:r>
+        <w:rPr>
+          <w:rFonts w:ascii="David" w:hAnsi="David" w:cs="David" w:hint="cs"/>
+          <w:rtl/>
+        </w:rPr>
+        <w:t xml:space="preserve">, דף חיפוש משתמשים, דף פרטי משתמש עבור </w:t>
+      </w:r>
+      <w:r>
+        <w:rPr>
+          <w:rFonts w:ascii="David" w:hAnsi="David" w:cs="David"/>
+        </w:rPr>
+        <w:t>ADMIN</w:t>
+      </w:r>
+      <w:r>
+        <w:rPr>
+          <w:rFonts w:ascii="David" w:hAnsi="David" w:cs="David" w:hint="cs"/>
+          <w:rtl/>
+        </w:rPr>
+        <w:t xml:space="preserve"> וכל הרכיבים המרכיבים אותם.</w:t>
+      </w:r>
+    </w:p>
+    <w:p>
+      <w:pPr>
+        <w:pStyle w:val="ListParagraph"/>
+        <w:bidi/>
+        <w:spacing w:line="276" w:lineRule="auto"/>
+        <w:ind w:left="1080"/>
+        <w:rPr>
+          <w:rFonts w:ascii="David" w:hAnsi="David" w:cs="David"/>
+        </w:rPr>
+      </w:pPr>
+    </w:p>
+    <w:p>
+      <w:pPr>
+        <w:pStyle w:val="ListParagraph"/>
+        <w:numPr>
+          <w:ilvl w:val="0"/>
+          <w:numId w:val="13"/>
+        </w:numPr>
+        <w:bidi/>
+        <w:spacing w:line="276" w:lineRule="auto"/>
+        <w:rPr>
+          <w:rFonts w:ascii="David" w:hAnsi="David" w:cs="David"/>
+          <w:b/>
+          <w:bCs/>
+        </w:rPr>
+      </w:pPr>
+      <w:proofErr w:type="spellStart"/>
+      <w:r>
+        <w:rPr>
+          <w:rFonts w:ascii="David" w:hAnsi="David" w:cs="David"/>
+          <w:b/>
+          <w:bCs/>
+        </w:rPr>
+        <w:t>src</w:t>
+      </w:r>
+      <w:proofErr w:type="spellEnd"/>
+      <w:r>
+        <w:rPr>
+          <w:rFonts w:ascii="David" w:hAnsi="David" w:cs="David"/>
+          <w:b/>
+          <w:bCs/>
+        </w:rPr>
+        <w:t>/</w:t>
+      </w:r>
+      <w:r>
+        <w:rPr>
+          <w:rFonts w:ascii="David" w:hAnsi="David" w:cs="David"/>
+          <w:b/>
+          <w:bCs/>
+        </w:rPr>
+        <w:t>hooks</w:t>
+      </w:r>
+      <w:r>
+        <w:rPr>
+          <w:rFonts w:ascii="David" w:hAnsi="David" w:cs="David" w:hint="cs"/>
+          <w:b/>
+          <w:bCs/>
+          <w:rtl/>
+        </w:rPr>
+        <w:t>:</w:t>
+      </w:r>
+    </w:p>
+    <w:p>
+      <w:pPr>
+        <w:pStyle w:val="ListParagraph"/>
+        <w:bidi/>
+        <w:spacing w:line="276" w:lineRule="auto"/>
+        <w:rPr>
+          <w:rFonts w:ascii="David" w:hAnsi="David" w:cs="David"/>
+          <w:rtl/>
+        </w:rPr>
+      </w:pPr>
+      <w:r>
+        <w:rPr>
+          <w:rFonts w:ascii="David" w:hAnsi="David" w:cs="David" w:hint="cs"/>
+          <w:rtl/>
+        </w:rPr>
+        <w:t xml:space="preserve">קיום של </w:t>
+      </w:r>
+      <w:r>
+        <w:rPr>
+          <w:rFonts w:ascii="David" w:hAnsi="David" w:cs="David"/>
+        </w:rPr>
+        <w:t>HOOKS</w:t>
+      </w:r>
+      <w:r>
+        <w:rPr>
+          <w:rFonts w:ascii="David" w:hAnsi="David" w:cs="David" w:hint="cs"/>
+          <w:rtl/>
+        </w:rPr>
+        <w:t xml:space="preserve"> פרטיים </w:t>
+      </w:r>
+      <w:r>
+        <w:rPr>
+          <w:rFonts w:ascii="David" w:hAnsi="David" w:cs="David"/>
+          <w:rtl/>
+        </w:rPr>
+        <w:t>–</w:t>
+      </w:r>
+      <w:r>
+        <w:rPr>
+          <w:rFonts w:ascii="David" w:hAnsi="David" w:cs="David" w:hint="cs"/>
+          <w:rtl/>
+        </w:rPr>
+        <w:t xml:space="preserve"> קיים רק </w:t>
+      </w:r>
+      <w:proofErr w:type="spellStart"/>
+      <w:r>
+        <w:rPr>
+          <w:rFonts w:ascii="David" w:hAnsi="David" w:cs="David"/>
+        </w:rPr>
+        <w:t>useClickOutside</w:t>
+      </w:r>
+      <w:proofErr w:type="spellEnd"/>
+      <w:r>
+        <w:rPr>
+          <w:rFonts w:ascii="David" w:hAnsi="David" w:cs="David" w:hint="cs"/>
+          <w:rtl/>
+        </w:rPr>
+        <w:t xml:space="preserve"> כרגע </w:t>
+      </w:r>
+      <w:r>
+        <w:rPr>
+          <w:rFonts w:ascii="David" w:hAnsi="David" w:cs="David"/>
+          <w:rtl/>
+        </w:rPr>
+        <w:t>–</w:t>
+      </w:r>
+      <w:r>
+        <w:rPr>
+          <w:rFonts w:ascii="David" w:hAnsi="David" w:cs="David" w:hint="cs"/>
+          <w:rtl/>
+        </w:rPr>
+        <w:t xml:space="preserve"> מגביל סגירה של </w:t>
+      </w:r>
+      <w:r>
+        <w:rPr>
+          <w:rFonts w:ascii="David" w:hAnsi="David" w:cs="David"/>
+        </w:rPr>
+        <w:t>DROPDOWN</w:t>
+      </w:r>
+      <w:r>
+        <w:rPr>
+          <w:rFonts w:ascii="David" w:hAnsi="David" w:cs="David" w:hint="cs"/>
+          <w:rtl/>
+        </w:rPr>
+        <w:t xml:space="preserve"> ולחיצה מחוצה לו לא תסגור אותו.</w:t>
+      </w:r>
+    </w:p>
+    <w:p>
+      <w:pPr>
+        <w:pStyle w:val="ListParagraph"/>
+        <w:bidi/>
+        <w:spacing w:line="276" w:lineRule="auto"/>
+        <w:rPr>
+          <w:rFonts w:ascii="David" w:hAnsi="David" w:cs="David"/>
+          <w:rtl/>
+        </w:rPr>
+      </w:pPr>
+    </w:p>
+    <w:p>
+      <w:pPr>
+        <w:pStyle w:val="ListParagraph"/>
+        <w:numPr>
+          <w:ilvl w:val="0"/>
+          <w:numId w:val="13"/>
+        </w:numPr>
+        <w:bidi/>
+        <w:spacing w:line="276" w:lineRule="auto"/>
+        <w:rPr>
+          <w:rFonts w:ascii="David" w:hAnsi="David" w:cs="David"/>
+          <w:b/>
+          <w:bCs/>
+        </w:rPr>
+      </w:pPr>
+      <w:proofErr w:type="spellStart"/>
+      <w:r>
+        <w:rPr>
+          <w:rFonts w:ascii="David" w:hAnsi="David" w:cs="David"/>
+          <w:b/>
+          <w:bCs/>
+        </w:rPr>
+        <w:t>src</w:t>
+      </w:r>
+      <w:proofErr w:type="spellEnd"/>
+      <w:r>
+        <w:rPr>
+          <w:rFonts w:ascii="David" w:hAnsi="David" w:cs="David"/>
+          <w:b/>
+          <w:bCs/>
+        </w:rPr>
+        <w:t>/</w:t>
+      </w:r>
+      <w:r>
+        <w:rPr>
+          <w:rFonts w:ascii="David" w:hAnsi="David" w:cs="David"/>
+          <w:b/>
+          <w:bCs/>
+        </w:rPr>
+        <w:t>lib</w:t>
+      </w:r>
+      <w:r>
+        <w:rPr>
+          <w:rFonts w:ascii="David" w:hAnsi="David" w:cs="David" w:hint="cs"/>
+          <w:b/>
+          <w:bCs/>
+          <w:rtl/>
+        </w:rPr>
+        <w:t>:</w:t>
+      </w:r>
+    </w:p>
+    <w:p>
+      <w:pPr>
+        <w:pStyle w:val="ListParagraph"/>
+        <w:bidi/>
+        <w:spacing w:line="276" w:lineRule="auto"/>
+        <w:rPr>
+          <w:rFonts w:ascii="David" w:hAnsi="David" w:cs="David"/>
+          <w:rtl/>
+        </w:rPr>
+      </w:pPr>
+      <w:r>
+        <w:rPr>
+          <w:rFonts w:ascii="David" w:hAnsi="David" w:cs="David" w:hint="cs"/>
+          <w:rtl/>
+        </w:rPr>
+        <w:t>מכיל דברים משותפים לפרוייקט:</w:t>
+      </w:r>
+    </w:p>
+    <w:p>
+      <w:pPr>
+        <w:pStyle w:val="ListParagraph"/>
+        <w:numPr>
+          <w:ilvl w:val="0"/>
+          <w:numId w:val="18"/>
+        </w:numPr>
+        <w:bidi/>
+        <w:spacing w:line="276" w:lineRule="auto"/>
+        <w:rPr>
+          <w:rFonts w:ascii="David" w:hAnsi="David" w:cs="David"/>
+        </w:rPr>
+      </w:pPr>
+      <w:r>
+        <w:rPr>
+          <w:rFonts w:ascii="David" w:hAnsi="David" w:cs="David" w:hint="cs"/>
+          <w:rtl/>
+        </w:rPr>
+        <w:t xml:space="preserve">טיפול גנרי ביצירה של </w:t>
+      </w:r>
+      <w:r>
+        <w:rPr>
+          <w:rFonts w:ascii="David" w:hAnsi="David" w:cs="David"/>
+        </w:rPr>
+        <w:t>FILTERS</w:t>
+      </w:r>
+      <w:r>
+        <w:rPr>
+          <w:rFonts w:ascii="David" w:hAnsi="David" w:cs="David" w:hint="cs"/>
+          <w:rtl/>
+        </w:rPr>
+        <w:t xml:space="preserve"> עם פורמט זהה ושוני רק בתוכן.</w:t>
+      </w:r>
+    </w:p>
+    <w:p>
+      <w:pPr>
+        <w:pStyle w:val="ListParagraph"/>
+        <w:numPr>
+          <w:ilvl w:val="0"/>
+          <w:numId w:val="18"/>
+        </w:numPr>
+        <w:bidi/>
+        <w:spacing w:line="276" w:lineRule="auto"/>
+        <w:rPr>
+          <w:rFonts w:ascii="David" w:hAnsi="David" w:cs="David"/>
+        </w:rPr>
+      </w:pPr>
+      <w:r>
+        <w:rPr>
+          <w:rFonts w:ascii="David" w:hAnsi="David" w:cs="David" w:hint="cs"/>
+          <w:rtl/>
+        </w:rPr>
+        <w:t>סכמות משותפות +</w:t>
+      </w:r>
+      <w:r>
+        <w:rPr>
+          <w:rFonts w:ascii="David" w:hAnsi="David" w:cs="David"/>
+        </w:rPr>
+        <w:t xml:space="preserve"> </w:t>
+      </w:r>
+      <w:r>
+        <w:rPr>
+          <w:rFonts w:ascii="David" w:hAnsi="David" w:cs="David" w:hint="cs"/>
+          <w:rtl/>
+        </w:rPr>
+        <w:t>קבועים + טיפול ב</w:t>
+      </w:r>
+      <w:r>
+        <w:rPr>
+          <w:rFonts w:ascii="David" w:hAnsi="David" w:cs="David"/>
+        </w:rPr>
+        <w:t>PAGINATION</w:t>
+      </w:r>
+      <w:r>
+        <w:rPr>
+          <w:rFonts w:ascii="David" w:hAnsi="David" w:cs="David" w:hint="cs"/>
+          <w:rtl/>
+        </w:rPr>
+        <w:t>.</w:t>
+      </w:r>
+    </w:p>
+    <w:p>
+      <w:pPr>
+        <w:pStyle w:val="ListParagraph"/>
+        <w:numPr>
+          <w:ilvl w:val="0"/>
+          <w:numId w:val="18"/>
+        </w:numPr>
+        <w:bidi/>
+        <w:spacing w:line="276" w:lineRule="auto"/>
+        <w:rPr>
+          <w:rFonts w:ascii="David" w:hAnsi="David" w:cs="David"/>
+        </w:rPr>
+      </w:pPr>
+      <w:r>
+        <w:rPr>
+          <w:rFonts w:ascii="David" w:hAnsi="David" w:cs="David" w:hint="cs"/>
+          <w:rtl/>
+        </w:rPr>
+        <w:t xml:space="preserve">עזרים לטיפול בקריאות לשרת כולל התמודדות עם תקלות ועדכון של </w:t>
+      </w:r>
+      <w:r>
+        <w:rPr>
+          <w:rFonts w:ascii="David" w:hAnsi="David" w:cs="David"/>
+        </w:rPr>
+        <w:t>REFRESH TOKEN</w:t>
+      </w:r>
+      <w:r>
+        <w:rPr>
+          <w:rFonts w:ascii="David" w:hAnsi="David" w:cs="David" w:hint="cs"/>
+          <w:rtl/>
+        </w:rPr>
+        <w:t>.</w:t>
+      </w:r>
+    </w:p>
+    <w:p>
+      <w:pPr>
+        <w:pStyle w:val="ListParagraph"/>
+        <w:numPr>
+          <w:ilvl w:val="0"/>
+          <w:numId w:val="18"/>
+        </w:numPr>
+        <w:bidi/>
+        <w:spacing w:line="276" w:lineRule="auto"/>
+        <w:rPr>
+          <w:rFonts w:ascii="David" w:hAnsi="David" w:cs="David" w:hint="cs"/>
+        </w:rPr>
+      </w:pPr>
+      <w:r>
+        <w:rPr>
+          <w:rFonts w:ascii="David" w:hAnsi="David" w:cs="David" w:hint="cs"/>
+          <w:rtl/>
+        </w:rPr>
+        <w:t>עזר לטיפול ב</w:t>
+      </w:r>
+      <w:r>
+        <w:rPr>
+          <w:rFonts w:ascii="David" w:hAnsi="David" w:cs="David"/>
+        </w:rPr>
+        <w:t>CSS</w:t>
+      </w:r>
+      <w:r>
+        <w:rPr>
+          <w:rFonts w:ascii="David" w:hAnsi="David" w:cs="David" w:hint="cs"/>
+          <w:rtl/>
+        </w:rPr>
+        <w:t>.</w:t>
+      </w:r>
+    </w:p>
+    <w:p>
+      <w:pPr>
+        <w:bidi/>
+        <w:spacing w:line="276" w:lineRule="auto"/>
+        <w:rPr>
+          <w:rFonts w:ascii="David" w:hAnsi="David" w:cs="David"/>
+        </w:rPr>
+      </w:pPr>
+    </w:p>
+    <w:p>
+      <w:pPr>
+        <w:bidi/>
+        <w:spacing w:line="276" w:lineRule="auto"/>
+        <w:rPr>
+          <w:rFonts w:ascii="David" w:hAnsi="David" w:cs="David"/>
+        </w:rPr>
+      </w:pPr>
+    </w:p>
+    <w:p>
+      <w:pPr>
+        <w:bidi/>
+        <w:spacing w:line="276" w:lineRule="auto"/>
+        <w:rPr>
+          <w:rFonts w:ascii="David" w:hAnsi="David" w:cs="David"/>
+        </w:rPr>
+      </w:pPr>
+    </w:p>
+    <w:p>
+      <w:pPr>
+        <w:bidi/>
+        <w:spacing w:line="276" w:lineRule="auto"/>
+        <w:rPr>
+          <w:rFonts w:ascii="David" w:hAnsi="David" w:cs="David"/>
+        </w:rPr>
+      </w:pPr>
+    </w:p>
+    <w:p>
+      <w:pPr>
+        <w:bidi/>
+        <w:spacing w:line="276" w:lineRule="auto"/>
+        <w:rPr>
+          <w:rFonts w:ascii="David" w:hAnsi="David" w:cs="David"/>
+        </w:rPr>
+      </w:pPr>
+    </w:p>
+    <w:p>
+      <w:pPr>
+        <w:bidi/>
+        <w:spacing w:line="276" w:lineRule="auto"/>
+        <w:rPr>
+          <w:rFonts w:ascii="David" w:hAnsi="David" w:cs="David"/>
+        </w:rPr>
+      </w:pPr>
+    </w:p>
+    <w:p>
+      <w:pPr>
+        <w:bidi/>
+        <w:spacing w:line="276" w:lineRule="auto"/>
+        <w:rPr>
+          <w:rFonts w:ascii="David" w:hAnsi="David" w:cs="David"/>
+        </w:rPr>
+      </w:pPr>
+    </w:p>
+    <w:p>
+      <w:pPr>
+        <w:bidi/>
+        <w:spacing w:line="276" w:lineRule="auto"/>
+        <w:rPr>
+          <w:rFonts w:ascii="David" w:hAnsi="David" w:cs="David"/>
+        </w:rPr>
+      </w:pPr>
+    </w:p>
+    <w:p>
+      <w:pPr>
+        <w:bidi/>
+        <w:spacing w:line="276" w:lineRule="auto"/>
+        <w:rPr>
+          <w:rFonts w:ascii="David" w:hAnsi="David" w:cs="David"/>
+          <w:rtl/>
+        </w:rPr>
+      </w:pPr>
+    </w:p>
+    <w:p>
+      <w:pPr>
+        <w:bidi/>
+        <w:spacing w:line="276" w:lineRule="auto"/>
+        <w:rPr>
+          <w:rFonts w:ascii="David" w:hAnsi="David" w:cs="David"/>
+        </w:rPr>
+      </w:pPr>
     </w:p>
     <w:p>
       <w:pPr>
@@ -8518,6 +11462,95 @@
 <file path=word/numbering.xml><?xml version="1.0" encoding="utf-8"?>
 <w:numbering xmlns:wpc="http://schemas.microsoft.com/office/word/2010/wordprocessingCanvas" xmlns:cx="http://schemas.microsoft.com/office/drawing/2014/chartex" xmlns:cx1="http://schemas.microsoft.com/office/drawing/2015/9/8/chartex" xmlns:cx2="http://schemas.microsoft.com/office/drawing/2015/10/21/chartex" xmlns:cx3="http://schemas.microsoft.com/office/drawing/2016/5/9/chartex" xmlns:cx4="http://schemas.microsoft.com/office/drawing/2016/5/10/chartex" xmlns:cx5="http://schemas.microsoft.com/office/drawing/2016/5/11/chartex" xmlns:cx6="http://schemas.microsoft.com/office/drawing/2016/5/12/chartex" xmlns:cx7="http://schemas.microsoft.com/office/drawing/2016/5/13/chartex" xmlns:cx8="http://schemas.microsoft.com/office/drawing/2016/5/14/chartex" xmlns:mc="http://schemas.openxmlformats.org/markup-compatibility/2006" xmlns:aink="http://schemas.microsoft.com/office/drawing/2016/ink" xmlns:am3d="http://schemas.microsoft.com/office/drawing/2017/model3d" xmlns:o="urn:schemas-microsoft-com:office:office" xmlns:oel="http://schemas.microsoft.com/office/2019/extlst" xmlns:r="http://schemas.openxmlformats.org/officeDocument/2006/relationships" xmlns:m="http://schemas.openxmlformats.org/officeDocument/2006/math" xmlns:v="urn:schemas-microsoft-com:vml" xmlns:wp14="http://schemas.microsoft.com/office/word/2010/wordprocessingDrawing" xmlns:wp="http://schemas.openxmlformats.org/drawingml/2006/wordprocessingDrawing" xmlns:w10="urn:schemas-microsoft-com:office:word" xmlns:w="http://schemas.openxmlformats.org/wordprocessingml/2006/main" xmlns:w14="http://schemas.microsoft.com/office/word/2010/wordml" xmlns:w15="http://schemas.microsoft.com/office/word/2012/wordml" xmlns:w16cex="http://schemas.microsoft.com/office/word/2018/wordml/cex" xmlns:w16cid="http://schemas.microsoft.com/office/word/2016/wordml/cid" xmlns:w16="http://schemas.microsoft.com/office/word/2018/wordml" xmlns:w16du="http://schemas.microsoft.com/office/word/2023/wordml/word16du" xmlns:w16sdtdh="http://schemas.microsoft.com/office/word/2020/wordml/sdtdatahash" xmlns:w16sdtfl="http://schemas.microsoft.com/office/word/2024/wordml/sdtformatlock" xmlns:w16se="http://schemas.microsoft.com/office/word/2015/wordml/symex" xmlns:wpg="http://schemas.microsoft.com/office/word/2010/wordprocessingGroup" xmlns:wpi="http://schemas.microsoft.com/office/word/2010/wordprocessingInk" xmlns:wne="http://schemas.microsoft.com/office/word/2006/wordml" xmlns:wps="http://schemas.microsoft.com/office/word/2010/wordprocessingShape" mc:Ignorable="w14 w15 w16se w16cid w16 w16cex w16sdtdh w16sdtfl w16du wp14">
   <w:abstractNum w:abstractNumId="0" w15:restartNumberingAfterBreak="0">
+    <w:nsid w:val="1EB53BAF"/>
+    <w:multiLevelType w:val="hybridMultilevel"/>
+    <w:tmpl w:val="A7EEE0AC"/>
+    <w:lvl w:ilvl="0" w:tplc="48008AE0">
+      <w:start w:val="1"/>
+      <w:numFmt w:val="decimal"/>
+      <w:lvlText w:val="%1."/>
+      <w:lvlJc w:val="left"/>
+      <w:pPr>
+        <w:ind w:left="1080" w:hanging="360"/>
+      </w:pPr>
+      <w:rPr>
+        <w:rFonts w:hint="default"/>
+      </w:rPr>
+    </w:lvl>
+    <w:lvl w:ilvl="1" w:tplc="04090019" w:tentative="1">
+      <w:start w:val="1"/>
+      <w:numFmt w:val="lowerLetter"/>
+      <w:lvlText w:val="%2."/>
+      <w:lvlJc w:val="left"/>
+      <w:pPr>
+        <w:ind w:left="1800" w:hanging="360"/>
+      </w:pPr>
+    </w:lvl>
+    <w:lvl w:ilvl="2" w:tplc="0409001B" w:tentative="1">
+      <w:start w:val="1"/>
+      <w:numFmt w:val="lowerRoman"/>
+      <w:lvlText w:val="%3."/>
+      <w:lvlJc w:val="right"/>
+      <w:pPr>
+        <w:ind w:left="2520" w:hanging="180"/>
+      </w:pPr>
+    </w:lvl>
+    <w:lvl w:ilvl="3" w:tplc="0409000F" w:tentative="1">
+      <w:start w:val="1"/>
+      <w:numFmt w:val="decimal"/>
+      <w:lvlText w:val="%4."/>
+      <w:lvlJc w:val="left"/>
+      <w:pPr>
+        <w:ind w:left="3240" w:hanging="360"/>
+      </w:pPr>
+    </w:lvl>
+    <w:lvl w:ilvl="4" w:tplc="04090019" w:tentative="1">
+      <w:start w:val="1"/>
+      <w:numFmt w:val="lowerLetter"/>
+      <w:lvlText w:val="%5."/>
+      <w:lvlJc w:val="left"/>
+      <w:pPr>
+        <w:ind w:left="3960" w:hanging="360"/>
+      </w:pPr>
+    </w:lvl>
+    <w:lvl w:ilvl="5" w:tplc="0409001B" w:tentative="1">
+      <w:start w:val="1"/>
+      <w:numFmt w:val="lowerRoman"/>
+      <w:lvlText w:val="%6."/>
+      <w:lvlJc w:val="right"/>
+      <w:pPr>
+        <w:ind w:left="4680" w:hanging="180"/>
+      </w:pPr>
+    </w:lvl>
+    <w:lvl w:ilvl="6" w:tplc="0409000F" w:tentative="1">
+      <w:start w:val="1"/>
+      <w:numFmt w:val="decimal"/>
+      <w:lvlText w:val="%7."/>
+      <w:lvlJc w:val="left"/>
+      <w:pPr>
+        <w:ind w:left="5400" w:hanging="360"/>
+      </w:pPr>
+    </w:lvl>
+    <w:lvl w:ilvl="7" w:tplc="04090019" w:tentative="1">
+      <w:start w:val="1"/>
+      <w:numFmt w:val="lowerLetter"/>
+      <w:lvlText w:val="%8."/>
+      <w:lvlJc w:val="left"/>
+      <w:pPr>
+        <w:ind w:left="6120" w:hanging="360"/>
+      </w:pPr>
+    </w:lvl>
+    <w:lvl w:ilvl="8" w:tplc="0409001B" w:tentative="1">
+      <w:start w:val="1"/>
+      <w:numFmt w:val="lowerRoman"/>
+      <w:lvlText w:val="%9."/>
+      <w:lvlJc w:val="right"/>
+      <w:pPr>
+        <w:ind w:left="6840" w:hanging="180"/>
+      </w:pPr>
+    </w:lvl>
+  </w:abstractNum>
+  <w:abstractNum w:abstractNumId="1" w15:restartNumberingAfterBreak="0">
     <w:nsid w:val="2AFB127B"/>
     <w:multiLevelType w:val="hybridMultilevel"/>
     <w:tmpl w:val="3D289C30"/>
@@ -8606,7 +11639,7 @@
       </w:pPr>
     </w:lvl>
   </w:abstractNum>
-  <w:abstractNum w:abstractNumId="1" w15:restartNumberingAfterBreak="0">
+  <w:abstractNum w:abstractNumId="2" w15:restartNumberingAfterBreak="0">
     <w:nsid w:val="30E619B6"/>
     <w:multiLevelType w:val="hybridMultilevel"/>
     <w:tmpl w:val="43E053D4"/>
@@ -8695,7 +11728,7 @@
       </w:pPr>
     </w:lvl>
   </w:abstractNum>
-  <w:abstractNum w:abstractNumId="2" w15:restartNumberingAfterBreak="0">
+  <w:abstractNum w:abstractNumId="3" w15:restartNumberingAfterBreak="0">
     <w:nsid w:val="35536138"/>
     <w:multiLevelType w:val="hybridMultilevel"/>
     <w:tmpl w:val="F858CFCE"/>
@@ -8808,7 +11841,7 @@
       </w:rPr>
     </w:lvl>
   </w:abstractNum>
-  <w:abstractNum w:abstractNumId="3" w15:restartNumberingAfterBreak="0">
+  <w:abstractNum w:abstractNumId="4" w15:restartNumberingAfterBreak="0">
     <w:nsid w:val="37934BE7"/>
     <w:multiLevelType w:val="hybridMultilevel"/>
     <w:tmpl w:val="52B2C8D2"/>
@@ -8897,7 +11930,185 @@
       </w:pPr>
     </w:lvl>
   </w:abstractNum>
-  <w:abstractNum w:abstractNumId="4" w15:restartNumberingAfterBreak="0">
+  <w:abstractNum w:abstractNumId="5" w15:restartNumberingAfterBreak="0">
+    <w:nsid w:val="3E9761BE"/>
+    <w:multiLevelType w:val="hybridMultilevel"/>
+    <w:tmpl w:val="5EB26B38"/>
+    <w:lvl w:ilvl="0" w:tplc="0409000F">
+      <w:start w:val="1"/>
+      <w:numFmt w:val="decimal"/>
+      <w:lvlText w:val="%1."/>
+      <w:lvlJc w:val="left"/>
+      <w:pPr>
+        <w:ind w:left="720" w:hanging="360"/>
+      </w:pPr>
+      <w:rPr>
+        <w:rFonts w:hint="default"/>
+      </w:rPr>
+    </w:lvl>
+    <w:lvl w:ilvl="1" w:tplc="04090019" w:tentative="1">
+      <w:start w:val="1"/>
+      <w:numFmt w:val="lowerLetter"/>
+      <w:lvlText w:val="%2."/>
+      <w:lvlJc w:val="left"/>
+      <w:pPr>
+        <w:ind w:left="1440" w:hanging="360"/>
+      </w:pPr>
+    </w:lvl>
+    <w:lvl w:ilvl="2" w:tplc="0409001B" w:tentative="1">
+      <w:start w:val="1"/>
+      <w:numFmt w:val="lowerRoman"/>
+      <w:lvlText w:val="%3."/>
+      <w:lvlJc w:val="right"/>
+      <w:pPr>
+        <w:ind w:left="2160" w:hanging="180"/>
+      </w:pPr>
+    </w:lvl>
+    <w:lvl w:ilvl="3" w:tplc="0409000F" w:tentative="1">
+      <w:start w:val="1"/>
+      <w:numFmt w:val="decimal"/>
+      <w:lvlText w:val="%4."/>
+      <w:lvlJc w:val="left"/>
+      <w:pPr>
+        <w:ind w:left="2880" w:hanging="360"/>
+      </w:pPr>
+    </w:lvl>
+    <w:lvl w:ilvl="4" w:tplc="04090019" w:tentative="1">
+      <w:start w:val="1"/>
+      <w:numFmt w:val="lowerLetter"/>
+      <w:lvlText w:val="%5."/>
+      <w:lvlJc w:val="left"/>
+      <w:pPr>
+        <w:ind w:left="3600" w:hanging="360"/>
+      </w:pPr>
+    </w:lvl>
+    <w:lvl w:ilvl="5" w:tplc="0409001B" w:tentative="1">
+      <w:start w:val="1"/>
+      <w:numFmt w:val="lowerRoman"/>
+      <w:lvlText w:val="%6."/>
+      <w:lvlJc w:val="right"/>
+      <w:pPr>
+        <w:ind w:left="4320" w:hanging="180"/>
+      </w:pPr>
+    </w:lvl>
+    <w:lvl w:ilvl="6" w:tplc="0409000F" w:tentative="1">
+      <w:start w:val="1"/>
+      <w:numFmt w:val="decimal"/>
+      <w:lvlText w:val="%7."/>
+      <w:lvlJc w:val="left"/>
+      <w:pPr>
+        <w:ind w:left="5040" w:hanging="360"/>
+      </w:pPr>
+    </w:lvl>
+    <w:lvl w:ilvl="7" w:tplc="04090019" w:tentative="1">
+      <w:start w:val="1"/>
+      <w:numFmt w:val="lowerLetter"/>
+      <w:lvlText w:val="%8."/>
+      <w:lvlJc w:val="left"/>
+      <w:pPr>
+        <w:ind w:left="5760" w:hanging="360"/>
+      </w:pPr>
+    </w:lvl>
+    <w:lvl w:ilvl="8" w:tplc="0409001B" w:tentative="1">
+      <w:start w:val="1"/>
+      <w:numFmt w:val="lowerRoman"/>
+      <w:lvlText w:val="%9."/>
+      <w:lvlJc w:val="right"/>
+      <w:pPr>
+        <w:ind w:left="6480" w:hanging="180"/>
+      </w:pPr>
+    </w:lvl>
+  </w:abstractNum>
+  <w:abstractNum w:abstractNumId="6" w15:restartNumberingAfterBreak="0">
+    <w:nsid w:val="3ED53F40"/>
+    <w:multiLevelType w:val="hybridMultilevel"/>
+    <w:tmpl w:val="0AF22848"/>
+    <w:lvl w:ilvl="0" w:tplc="48008AE0">
+      <w:start w:val="1"/>
+      <w:numFmt w:val="decimal"/>
+      <w:lvlText w:val="%1."/>
+      <w:lvlJc w:val="left"/>
+      <w:pPr>
+        <w:ind w:left="1080" w:hanging="360"/>
+      </w:pPr>
+      <w:rPr>
+        <w:rFonts w:hint="default"/>
+      </w:rPr>
+    </w:lvl>
+    <w:lvl w:ilvl="1" w:tplc="04090019" w:tentative="1">
+      <w:start w:val="1"/>
+      <w:numFmt w:val="lowerLetter"/>
+      <w:lvlText w:val="%2."/>
+      <w:lvlJc w:val="left"/>
+      <w:pPr>
+        <w:ind w:left="1800" w:hanging="360"/>
+      </w:pPr>
+    </w:lvl>
+    <w:lvl w:ilvl="2" w:tplc="0409001B" w:tentative="1">
+      <w:start w:val="1"/>
+      <w:numFmt w:val="lowerRoman"/>
+      <w:lvlText w:val="%3."/>
+      <w:lvlJc w:val="right"/>
+      <w:pPr>
+        <w:ind w:left="2520" w:hanging="180"/>
+      </w:pPr>
+    </w:lvl>
+    <w:lvl w:ilvl="3" w:tplc="0409000F" w:tentative="1">
+      <w:start w:val="1"/>
+      <w:numFmt w:val="decimal"/>
+      <w:lvlText w:val="%4."/>
+      <w:lvlJc w:val="left"/>
+      <w:pPr>
+        <w:ind w:left="3240" w:hanging="360"/>
+      </w:pPr>
+    </w:lvl>
+    <w:lvl w:ilvl="4" w:tplc="04090019" w:tentative="1">
+      <w:start w:val="1"/>
+      <w:numFmt w:val="lowerLetter"/>
+      <w:lvlText w:val="%5."/>
+      <w:lvlJc w:val="left"/>
+      <w:pPr>
+        <w:ind w:left="3960" w:hanging="360"/>
+      </w:pPr>
+    </w:lvl>
+    <w:lvl w:ilvl="5" w:tplc="0409001B" w:tentative="1">
+      <w:start w:val="1"/>
+      <w:numFmt w:val="lowerRoman"/>
+      <w:lvlText w:val="%6."/>
+      <w:lvlJc w:val="right"/>
+      <w:pPr>
+        <w:ind w:left="4680" w:hanging="180"/>
+      </w:pPr>
+    </w:lvl>
+    <w:lvl w:ilvl="6" w:tplc="0409000F" w:tentative="1">
+      <w:start w:val="1"/>
+      <w:numFmt w:val="decimal"/>
+      <w:lvlText w:val="%7."/>
+      <w:lvlJc w:val="left"/>
+      <w:pPr>
+        <w:ind w:left="5400" w:hanging="360"/>
+      </w:pPr>
+    </w:lvl>
+    <w:lvl w:ilvl="7" w:tplc="04090019" w:tentative="1">
+      <w:start w:val="1"/>
+      <w:numFmt w:val="lowerLetter"/>
+      <w:lvlText w:val="%8."/>
+      <w:lvlJc w:val="left"/>
+      <w:pPr>
+        <w:ind w:left="6120" w:hanging="360"/>
+      </w:pPr>
+    </w:lvl>
+    <w:lvl w:ilvl="8" w:tplc="0409001B" w:tentative="1">
+      <w:start w:val="1"/>
+      <w:numFmt w:val="lowerRoman"/>
+      <w:lvlText w:val="%9."/>
+      <w:lvlJc w:val="right"/>
+      <w:pPr>
+        <w:ind w:left="6840" w:hanging="180"/>
+      </w:pPr>
+    </w:lvl>
+  </w:abstractNum>
+  <w:abstractNum w:abstractNumId="7" w15:restartNumberingAfterBreak="0">
     <w:nsid w:val="3F086877"/>
     <w:multiLevelType w:val="hybridMultilevel"/>
     <w:tmpl w:val="27682832"/>
@@ -8988,7 +12199,96 @@
       </w:pPr>
     </w:lvl>
   </w:abstractNum>
-  <w:abstractNum w:abstractNumId="5" w15:restartNumberingAfterBreak="0">
+  <w:abstractNum w:abstractNumId="8" w15:restartNumberingAfterBreak="0">
+    <w:nsid w:val="3FA54C6B"/>
+    <w:multiLevelType w:val="hybridMultilevel"/>
+    <w:tmpl w:val="2E1C70EA"/>
+    <w:lvl w:ilvl="0" w:tplc="FFFFFFFF">
+      <w:start w:val="1"/>
+      <w:numFmt w:val="decimal"/>
+      <w:lvlText w:val="%1."/>
+      <w:lvlJc w:val="left"/>
+      <w:pPr>
+        <w:ind w:left="1080" w:hanging="360"/>
+      </w:pPr>
+      <w:rPr>
+        <w:rFonts w:hint="default"/>
+      </w:rPr>
+    </w:lvl>
+    <w:lvl w:ilvl="1" w:tplc="FFFFFFFF" w:tentative="1">
+      <w:start w:val="1"/>
+      <w:numFmt w:val="lowerLetter"/>
+      <w:lvlText w:val="%2."/>
+      <w:lvlJc w:val="left"/>
+      <w:pPr>
+        <w:ind w:left="1800" w:hanging="360"/>
+      </w:pPr>
+    </w:lvl>
+    <w:lvl w:ilvl="2" w:tplc="FFFFFFFF" w:tentative="1">
+      <w:start w:val="1"/>
+      <w:numFmt w:val="lowerRoman"/>
+      <w:lvlText w:val="%3."/>
+      <w:lvlJc w:val="right"/>
+      <w:pPr>
+        <w:ind w:left="2520" w:hanging="180"/>
+      </w:pPr>
+    </w:lvl>
+    <w:lvl w:ilvl="3" w:tplc="FFFFFFFF" w:tentative="1">
+      <w:start w:val="1"/>
+      <w:numFmt w:val="decimal"/>
+      <w:lvlText w:val="%4."/>
+      <w:lvlJc w:val="left"/>
+      <w:pPr>
+        <w:ind w:left="3240" w:hanging="360"/>
+      </w:pPr>
+    </w:lvl>
+    <w:lvl w:ilvl="4" w:tplc="FFFFFFFF" w:tentative="1">
+      <w:start w:val="1"/>
+      <w:numFmt w:val="lowerLetter"/>
+      <w:lvlText w:val="%5."/>
+      <w:lvlJc w:val="left"/>
+      <w:pPr>
+        <w:ind w:left="3960" w:hanging="360"/>
+      </w:pPr>
+    </w:lvl>
+    <w:lvl w:ilvl="5" w:tplc="FFFFFFFF" w:tentative="1">
+      <w:start w:val="1"/>
+      <w:numFmt w:val="lowerRoman"/>
+      <w:lvlText w:val="%6."/>
+      <w:lvlJc w:val="right"/>
+      <w:pPr>
+        <w:ind w:left="4680" w:hanging="180"/>
+      </w:pPr>
+    </w:lvl>
+    <w:lvl w:ilvl="6" w:tplc="FFFFFFFF" w:tentative="1">
+      <w:start w:val="1"/>
+      <w:numFmt w:val="decimal"/>
+      <w:lvlText w:val="%7."/>
+      <w:lvlJc w:val="left"/>
+      <w:pPr>
+        <w:ind w:left="5400" w:hanging="360"/>
+      </w:pPr>
+    </w:lvl>
+    <w:lvl w:ilvl="7" w:tplc="FFFFFFFF" w:tentative="1">
+      <w:start w:val="1"/>
+      <w:numFmt w:val="lowerLetter"/>
+      <w:lvlText w:val="%8."/>
+      <w:lvlJc w:val="left"/>
+      <w:pPr>
+        <w:ind w:left="6120" w:hanging="360"/>
+      </w:pPr>
+    </w:lvl>
+    <w:lvl w:ilvl="8" w:tplc="FFFFFFFF" w:tentative="1">
+      <w:start w:val="1"/>
+      <w:numFmt w:val="lowerRoman"/>
+      <w:lvlText w:val="%9."/>
+      <w:lvlJc w:val="right"/>
+      <w:pPr>
+        <w:ind w:left="6840" w:hanging="180"/>
+      </w:pPr>
+    </w:lvl>
+  </w:abstractNum>
+  <w:abstractNum w:abstractNumId="9" w15:restartNumberingAfterBreak="0">
     <w:nsid w:val="46CC4FF4"/>
     <w:multiLevelType w:val="hybridMultilevel"/>
     <w:tmpl w:val="B45810E6"/>
@@ -9077,7 +12377,7 @@
       </w:pPr>
     </w:lvl>
   </w:abstractNum>
-  <w:abstractNum w:abstractNumId="6" w15:restartNumberingAfterBreak="0">
+  <w:abstractNum w:abstractNumId="10" w15:restartNumberingAfterBreak="0">
     <w:nsid w:val="474446C7"/>
     <w:multiLevelType w:val="hybridMultilevel"/>
     <w:tmpl w:val="8F32EB80"/>
@@ -9166,7 +12466,7 @@
       </w:pPr>
     </w:lvl>
   </w:abstractNum>
-  <w:abstractNum w:abstractNumId="7" w15:restartNumberingAfterBreak="0">
+  <w:abstractNum w:abstractNumId="11" w15:restartNumberingAfterBreak="0">
     <w:nsid w:val="48E11489"/>
     <w:multiLevelType w:val="hybridMultilevel"/>
     <w:tmpl w:val="2E1C70EA"/>
@@ -9255,7 +12555,7 @@
       </w:pPr>
     </w:lvl>
   </w:abstractNum>
-  <w:abstractNum w:abstractNumId="8" w15:restartNumberingAfterBreak="0">
+  <w:abstractNum w:abstractNumId="12" w15:restartNumberingAfterBreak="0">
     <w:nsid w:val="4D6F6F8C"/>
     <w:multiLevelType w:val="hybridMultilevel"/>
     <w:tmpl w:val="C7A6D928"/>
@@ -9344,7 +12644,7 @@
       </w:pPr>
     </w:lvl>
   </w:abstractNum>
-  <w:abstractNum w:abstractNumId="9" w15:restartNumberingAfterBreak="0">
+  <w:abstractNum w:abstractNumId="13" w15:restartNumberingAfterBreak="0">
     <w:nsid w:val="63AE54A3"/>
     <w:multiLevelType w:val="hybridMultilevel"/>
     <w:tmpl w:val="5370433A"/>
@@ -9433,7 +12733,185 @@
       </w:pPr>
     </w:lvl>
   </w:abstractNum>
-  <w:abstractNum w:abstractNumId="10" w15:restartNumberingAfterBreak="0">
+  <w:abstractNum w:abstractNumId="14" w15:restartNumberingAfterBreak="0">
+    <w:nsid w:val="641D6FFF"/>
+    <w:multiLevelType w:val="hybridMultilevel"/>
+    <w:tmpl w:val="B8FACF72"/>
+    <w:lvl w:ilvl="0" w:tplc="48008AE0">
+      <w:start w:val="1"/>
+      <w:numFmt w:val="decimal"/>
+      <w:lvlText w:val="%1."/>
+      <w:lvlJc w:val="left"/>
+      <w:pPr>
+        <w:ind w:left="1080" w:hanging="360"/>
+      </w:pPr>
+      <w:rPr>
+        <w:rFonts w:hint="default"/>
+      </w:rPr>
+    </w:lvl>
+    <w:lvl w:ilvl="1" w:tplc="04090019">
+      <w:start w:val="1"/>
+      <w:numFmt w:val="lowerLetter"/>
+      <w:lvlText w:val="%2."/>
+      <w:lvlJc w:val="left"/>
+      <w:pPr>
+        <w:ind w:left="1800" w:hanging="360"/>
+      </w:pPr>
+    </w:lvl>
+    <w:lvl w:ilvl="2" w:tplc="0409001B" w:tentative="1">
+      <w:start w:val="1"/>
+      <w:numFmt w:val="lowerRoman"/>
+      <w:lvlText w:val="%3."/>
+      <w:lvlJc w:val="right"/>
+      <w:pPr>
+        <w:ind w:left="2520" w:hanging="180"/>
+      </w:pPr>
+    </w:lvl>
+    <w:lvl w:ilvl="3" w:tplc="0409000F" w:tentative="1">
+      <w:start w:val="1"/>
+      <w:numFmt w:val="decimal"/>
+      <w:lvlText w:val="%4."/>
+      <w:lvlJc w:val="left"/>
+      <w:pPr>
+        <w:ind w:left="3240" w:hanging="360"/>
+      </w:pPr>
+    </w:lvl>
+    <w:lvl w:ilvl="4" w:tplc="04090019" w:tentative="1">
+      <w:start w:val="1"/>
+      <w:numFmt w:val="lowerLetter"/>
+      <w:lvlText w:val="%5."/>
+      <w:lvlJc w:val="left"/>
+      <w:pPr>
+        <w:ind w:left="3960" w:hanging="360"/>
+      </w:pPr>
+    </w:lvl>
+    <w:lvl w:ilvl="5" w:tplc="0409001B" w:tentative="1">
+      <w:start w:val="1"/>
+      <w:numFmt w:val="lowerRoman"/>
+      <w:lvlText w:val="%6."/>
+      <w:lvlJc w:val="right"/>
+      <w:pPr>
+        <w:ind w:left="4680" w:hanging="180"/>
+      </w:pPr>
+    </w:lvl>
+    <w:lvl w:ilvl="6" w:tplc="0409000F" w:tentative="1">
+      <w:start w:val="1"/>
+      <w:numFmt w:val="decimal"/>
+      <w:lvlText w:val="%7."/>
+      <w:lvlJc w:val="left"/>
+      <w:pPr>
+        <w:ind w:left="5400" w:hanging="360"/>
+      </w:pPr>
+    </w:lvl>
+    <w:lvl w:ilvl="7" w:tplc="04090019" w:tentative="1">
+      <w:start w:val="1"/>
+      <w:numFmt w:val="lowerLetter"/>
+      <w:lvlText w:val="%8."/>
+      <w:lvlJc w:val="left"/>
+      <w:pPr>
+        <w:ind w:left="6120" w:hanging="360"/>
+      </w:pPr>
+    </w:lvl>
+    <w:lvl w:ilvl="8" w:tplc="0409001B" w:tentative="1">
+      <w:start w:val="1"/>
+      <w:numFmt w:val="lowerRoman"/>
+      <w:lvlText w:val="%9."/>
+      <w:lvlJc w:val="right"/>
+      <w:pPr>
+        <w:ind w:left="6840" w:hanging="180"/>
+      </w:pPr>
+    </w:lvl>
+  </w:abstractNum>
+  <w:abstractNum w:abstractNumId="15" w15:restartNumberingAfterBreak="0">
+    <w:nsid w:val="662B4117"/>
+    <w:multiLevelType w:val="hybridMultilevel"/>
+    <w:tmpl w:val="D6CCE930"/>
+    <w:lvl w:ilvl="0" w:tplc="48008AE0">
+      <w:start w:val="1"/>
+      <w:numFmt w:val="decimal"/>
+      <w:lvlText w:val="%1."/>
+      <w:lvlJc w:val="left"/>
+      <w:pPr>
+        <w:ind w:left="1080" w:hanging="360"/>
+      </w:pPr>
+      <w:rPr>
+        <w:rFonts w:hint="default"/>
+      </w:rPr>
+    </w:lvl>
+    <w:lvl w:ilvl="1" w:tplc="04090019" w:tentative="1">
+      <w:start w:val="1"/>
+      <w:numFmt w:val="lowerLetter"/>
+      <w:lvlText w:val="%2."/>
+      <w:lvlJc w:val="left"/>
+      <w:pPr>
+        <w:ind w:left="1800" w:hanging="360"/>
+      </w:pPr>
+    </w:lvl>
+    <w:lvl w:ilvl="2" w:tplc="0409001B" w:tentative="1">
+      <w:start w:val="1"/>
+      <w:numFmt w:val="lowerRoman"/>
+      <w:lvlText w:val="%3."/>
+      <w:lvlJc w:val="right"/>
+      <w:pPr>
+        <w:ind w:left="2520" w:hanging="180"/>
+      </w:pPr>
+    </w:lvl>
+    <w:lvl w:ilvl="3" w:tplc="0409000F" w:tentative="1">
+      <w:start w:val="1"/>
+      <w:numFmt w:val="decimal"/>
+      <w:lvlText w:val="%4."/>
+      <w:lvlJc w:val="left"/>
+      <w:pPr>
+        <w:ind w:left="3240" w:hanging="360"/>
+      </w:pPr>
+    </w:lvl>
+    <w:lvl w:ilvl="4" w:tplc="04090019" w:tentative="1">
+      <w:start w:val="1"/>
+      <w:numFmt w:val="lowerLetter"/>
+      <w:lvlText w:val="%5."/>
+      <w:lvlJc w:val="left"/>
+      <w:pPr>
+        <w:ind w:left="3960" w:hanging="360"/>
+      </w:pPr>
+    </w:lvl>
+    <w:lvl w:ilvl="5" w:tplc="0409001B" w:tentative="1">
+      <w:start w:val="1"/>
+      <w:numFmt w:val="lowerRoman"/>
+      <w:lvlText w:val="%6."/>
+      <w:lvlJc w:val="right"/>
+      <w:pPr>
+        <w:ind w:left="4680" w:hanging="180"/>
+      </w:pPr>
+    </w:lvl>
+    <w:lvl w:ilvl="6" w:tplc="0409000F" w:tentative="1">
+      <w:start w:val="1"/>
+      <w:numFmt w:val="decimal"/>
+      <w:lvlText w:val="%7."/>
+      <w:lvlJc w:val="left"/>
+      <w:pPr>
+        <w:ind w:left="5400" w:hanging="360"/>
+      </w:pPr>
+    </w:lvl>
+    <w:lvl w:ilvl="7" w:tplc="04090019" w:tentative="1">
+      <w:start w:val="1"/>
+      <w:numFmt w:val="lowerLetter"/>
+      <w:lvlText w:val="%8."/>
+      <w:lvlJc w:val="left"/>
+      <w:pPr>
+        <w:ind w:left="6120" w:hanging="360"/>
+      </w:pPr>
+    </w:lvl>
+    <w:lvl w:ilvl="8" w:tplc="0409001B" w:tentative="1">
+      <w:start w:val="1"/>
+      <w:numFmt w:val="lowerRoman"/>
+      <w:lvlText w:val="%9."/>
+      <w:lvlJc w:val="right"/>
+      <w:pPr>
+        <w:ind w:left="6840" w:hanging="180"/>
+      </w:pPr>
+    </w:lvl>
+  </w:abstractNum>
+  <w:abstractNum w:abstractNumId="16" w15:restartNumberingAfterBreak="0">
     <w:nsid w:val="7AB84668"/>
     <w:multiLevelType w:val="hybridMultilevel"/>
     <w:tmpl w:val="4A6EF0E4"/>
@@ -9522,7 +13000,7 @@
       </w:pPr>
     </w:lvl>
   </w:abstractNum>
-  <w:abstractNum w:abstractNumId="11" w15:restartNumberingAfterBreak="0">
+  <w:abstractNum w:abstractNumId="17" w15:restartNumberingAfterBreak="0">
     <w:nsid w:val="7CC44EBA"/>
     <w:multiLevelType w:val="hybridMultilevel"/>
     <w:tmpl w:val="2E1C70EA"/>
@@ -9612,40 +13090,58 @@
     </w:lvl>
   </w:abstractNum>
   <w:num w:numId="1" w16cid:durableId="1016466931">
+    <w:abstractNumId w:val="12"/>
+  </w:num>
+  <w:num w:numId="2" w16cid:durableId="269050620">
+    <w:abstractNumId w:val="3"/>
+  </w:num>
+  <w:num w:numId="3" w16cid:durableId="841773831">
+    <w:abstractNumId w:val="4"/>
+  </w:num>
+  <w:num w:numId="4" w16cid:durableId="1851337858">
+    <w:abstractNumId w:val="2"/>
+  </w:num>
+  <w:num w:numId="5" w16cid:durableId="966203256">
+    <w:abstractNumId w:val="1"/>
+  </w:num>
+  <w:num w:numId="6" w16cid:durableId="572591241">
+    <w:abstractNumId w:val="11"/>
+  </w:num>
+  <w:num w:numId="7" w16cid:durableId="915867882">
+    <w:abstractNumId w:val="10"/>
+  </w:num>
+  <w:num w:numId="8" w16cid:durableId="77866653">
+    <w:abstractNumId w:val="16"/>
+  </w:num>
+  <w:num w:numId="9" w16cid:durableId="918320725">
+    <w:abstractNumId w:val="7"/>
+  </w:num>
+  <w:num w:numId="10" w16cid:durableId="1551767055">
+    <w:abstractNumId w:val="13"/>
+  </w:num>
+  <w:num w:numId="11" w16cid:durableId="594939062">
+    <w:abstractNumId w:val="9"/>
+  </w:num>
+  <w:num w:numId="12" w16cid:durableId="13505523">
+    <w:abstractNumId w:val="17"/>
+  </w:num>
+  <w:num w:numId="13" w16cid:durableId="1687749319">
+    <w:abstractNumId w:val="5"/>
+  </w:num>
+  <w:num w:numId="14" w16cid:durableId="2073918011">
     <w:abstractNumId w:val="8"/>
   </w:num>
-  <w:num w:numId="2" w16cid:durableId="269050620">
-    <w:abstractNumId w:val="2"/>
+  <w:num w:numId="15" w16cid:durableId="1202287943">
+    <w:abstractNumId w:val="6"/>
   </w:num>
-  <w:num w:numId="3" w16cid:durableId="841773831">
-    <w:abstractNumId w:val="3"/>
-  </w:num>
-  <w:num w:numId="4" w16cid:durableId="1851337858">
-    <w:abstractNumId w:val="1"/>
-  </w:num>
-  <w:num w:numId="5" w16cid:durableId="966203256">
+  <w:num w:numId="16" w16cid:durableId="408887256">
     <w:abstractNumId w:val="0"/>
   </w:num>
-  <w:num w:numId="6" w16cid:durableId="572591241">
-    <w:abstractNumId w:val="7"/>
+  <w:num w:numId="17" w16cid:durableId="916784857">
+    <w:abstractNumId w:val="14"/>
   </w:num>
-  <w:num w:numId="7" w16cid:durableId="915867882">
-    <w:abstractNumId w:val="6"/>
-  </w:num>
-  <w:num w:numId="8" w16cid:durableId="77866653">
-    <w:abstractNumId w:val="10"/>
-  </w:num>
-  <w:num w:numId="9" w16cid:durableId="918320725">
-    <w:abstractNumId w:val="4"/>
-  </w:num>
-  <w:num w:numId="10" w16cid:durableId="1551767055">
-    <w:abstractNumId w:val="9"/>
-  </w:num>
-  <w:num w:numId="11" w16cid:durableId="594939062">
-    <w:abstractNumId w:val="5"/>
-  </w:num>
-  <w:num w:numId="12" w16cid:durableId="13505523">
-    <w:abstractNumId w:val="11"/>
+  <w:num w:numId="18" w16cid:durableId="1609510136">
+    <w:abstractNumId w:val="15"/>
   </w:num>
 </w:numbering>
 </file>
@@ -10050,7 +13546,7 @@
   <w:style w:type="paragraph" w:default="1" w:styleId="Normal">
     <w:name w:val="Normal"/>
     <w:qFormat/>
-    <w:rsid w:val="00F737B6"/>
+    <w:rsid w:val="00A0549D"/>
   </w:style>
   <w:style w:type="paragraph" w:styleId="Heading1">
     <w:name w:val="heading 1"/>

</xml_diff>

<commit_message>
planning file - docs + deploy
</commit_message>
<xml_diff>
--- a/planning.docx
+++ b/planning.docx
@@ -10651,6 +10651,599 @@
         </w:rPr>
         <w:t>.</w:t>
       </w:r>
+    </w:p>
+    <w:p>
+      <w:pPr>
+        <w:bidi/>
+        <w:spacing w:line="276" w:lineRule="auto"/>
+        <w:rPr>
+          <w:rFonts w:ascii="David" w:hAnsi="David" w:cs="David"/>
+        </w:rPr>
+      </w:pPr>
+    </w:p>
+    <w:p>
+      <w:pPr>
+        <w:bidi/>
+        <w:spacing w:line="276" w:lineRule="auto"/>
+        <w:rPr>
+          <w:rFonts w:ascii="David" w:hAnsi="David" w:cs="David"/>
+        </w:rPr>
+      </w:pPr>
+    </w:p>
+    <w:p>
+      <w:pPr>
+        <w:bidi/>
+        <w:spacing w:line="276" w:lineRule="auto"/>
+        <w:rPr>
+          <w:rFonts w:ascii="David" w:hAnsi="David" w:cs="David"/>
+        </w:rPr>
+      </w:pPr>
+    </w:p>
+    <w:p>
+      <w:pPr>
+        <w:bidi/>
+        <w:spacing w:line="276" w:lineRule="auto"/>
+        <w:rPr>
+          <w:rFonts w:ascii="David" w:hAnsi="David" w:cs="David"/>
+        </w:rPr>
+      </w:pPr>
+    </w:p>
+    <w:p>
+      <w:pPr>
+        <w:bidi/>
+        <w:spacing w:line="276" w:lineRule="auto"/>
+        <w:rPr>
+          <w:rFonts w:ascii="David" w:hAnsi="David" w:cs="David"/>
+        </w:rPr>
+      </w:pPr>
+    </w:p>
+    <w:p>
+      <w:pPr>
+        <w:bidi/>
+        <w:spacing w:line="276" w:lineRule="auto"/>
+        <w:rPr>
+          <w:rFonts w:ascii="David" w:hAnsi="David" w:cs="David"/>
+        </w:rPr>
+      </w:pPr>
+    </w:p>
+    <w:p>
+      <w:pPr>
+        <w:bidi/>
+        <w:spacing w:line="276" w:lineRule="auto"/>
+        <w:rPr>
+          <w:rFonts w:ascii="David" w:hAnsi="David" w:cs="David"/>
+        </w:rPr>
+      </w:pPr>
+    </w:p>
+    <w:p>
+      <w:pPr>
+        <w:bidi/>
+        <w:spacing w:line="276" w:lineRule="auto"/>
+        <w:rPr>
+          <w:rFonts w:ascii="David" w:hAnsi="David" w:cs="David"/>
+        </w:rPr>
+      </w:pPr>
+    </w:p>
+    <w:p>
+      <w:pPr>
+        <w:bidi/>
+        <w:spacing w:line="276" w:lineRule="auto"/>
+        <w:rPr>
+          <w:rFonts w:ascii="David" w:hAnsi="David" w:cs="David"/>
+          <w:rtl/>
+        </w:rPr>
+      </w:pPr>
+    </w:p>
+    <w:p>
+      <w:pPr>
+        <w:bidi/>
+        <w:spacing w:line="276" w:lineRule="auto"/>
+        <w:rPr>
+          <w:rFonts w:ascii="David" w:hAnsi="David" w:cs="David"/>
+        </w:rPr>
+      </w:pPr>
+    </w:p>
+    <w:p>
+      <w:pPr>
+        <w:bidi/>
+        <w:spacing w:line="276" w:lineRule="auto"/>
+        <w:rPr>
+          <w:rFonts w:ascii="David" w:hAnsi="David" w:cs="David"/>
+        </w:rPr>
+      </w:pPr>
+    </w:p>
+    <w:p>
+      <w:pPr>
+        <w:bidi/>
+        <w:spacing w:line="276" w:lineRule="auto"/>
+        <w:rPr>
+          <w:rFonts w:ascii="David" w:hAnsi="David" w:cs="David"/>
+          <w:u w:val="single"/>
+          <w:rtl/>
+        </w:rPr>
+      </w:pPr>
+      <w:r>
+        <w:rPr>
+          <w:rFonts w:ascii="David" w:hAnsi="David" w:cs="David"/>
+          <w:u w:val="single"/>
+        </w:rPr>
+        <w:lastRenderedPageBreak/>
+        <w:t>deploy</w:t>
+      </w:r>
+      <w:r>
+        <w:rPr>
+          <w:rFonts w:ascii="David" w:hAnsi="David" w:cs="David" w:hint="cs"/>
+          <w:u w:val="single"/>
+          <w:rtl/>
+        </w:rPr>
+        <w:t>:</w:t>
+      </w:r>
+    </w:p>
+    <w:p>
+      <w:pPr>
+        <w:pStyle w:val="ListParagraph"/>
+        <w:numPr>
+          <w:ilvl w:val="0"/>
+          <w:numId w:val="19"/>
+        </w:numPr>
+        <w:bidi/>
+        <w:spacing w:line="276" w:lineRule="auto"/>
+        <w:rPr>
+          <w:rFonts w:ascii="David" w:hAnsi="David" w:cs="David"/>
+          <w:b/>
+          <w:bCs/>
+        </w:rPr>
+      </w:pPr>
+      <w:proofErr w:type="gramStart"/>
+      <w:r>
+        <w:rPr>
+          <w:rFonts w:ascii="David" w:hAnsi="David" w:cs="David"/>
+          <w:b/>
+          <w:bCs/>
+        </w:rPr>
+        <w:t>.</w:t>
+      </w:r>
+      <w:proofErr w:type="spellStart"/>
+      <w:r>
+        <w:rPr>
+          <w:rFonts w:ascii="David" w:hAnsi="David" w:cs="David"/>
+          <w:b/>
+          <w:bCs/>
+        </w:rPr>
+        <w:t>env</w:t>
+      </w:r>
+      <w:proofErr w:type="gramEnd"/>
+      <w:r>
+        <w:rPr>
+          <w:rFonts w:ascii="David" w:hAnsi="David" w:cs="David"/>
+          <w:b/>
+          <w:bCs/>
+        </w:rPr>
+        <w:t>.prod.db.example</w:t>
+      </w:r>
+      <w:proofErr w:type="spellEnd"/>
+      <w:r>
+        <w:rPr>
+          <w:rFonts w:ascii="David" w:hAnsi="David" w:cs="David" w:hint="cs"/>
+          <w:b/>
+          <w:bCs/>
+          <w:rtl/>
+        </w:rPr>
+        <w:t xml:space="preserve">: </w:t>
+      </w:r>
+    </w:p>
+    <w:p>
+      <w:pPr>
+        <w:pStyle w:val="ListParagraph"/>
+        <w:bidi/>
+        <w:spacing w:line="276" w:lineRule="auto"/>
+        <w:rPr>
+          <w:rFonts w:ascii="David" w:hAnsi="David" w:cs="David"/>
+          <w:rtl/>
+        </w:rPr>
+      </w:pPr>
+      <w:r>
+        <w:rPr>
+          <w:rFonts w:ascii="David" w:hAnsi="David" w:cs="David" w:hint="cs"/>
+          <w:rtl/>
+        </w:rPr>
+        <w:t xml:space="preserve">מכיל פרטים של </w:t>
+      </w:r>
+      <w:r>
+        <w:rPr>
+          <w:rFonts w:ascii="David" w:hAnsi="David" w:cs="David"/>
+        </w:rPr>
+        <w:t>DB</w:t>
+      </w:r>
+      <w:r>
+        <w:rPr>
+          <w:rFonts w:ascii="David" w:hAnsi="David" w:cs="David" w:hint="cs"/>
+          <w:rtl/>
+        </w:rPr>
+        <w:t xml:space="preserve"> לצורך הרצה באמצעות </w:t>
+      </w:r>
+      <w:r>
+        <w:rPr>
+          <w:rFonts w:ascii="David" w:hAnsi="David" w:cs="David"/>
+        </w:rPr>
+        <w:t>DOCKER</w:t>
+      </w:r>
+      <w:r>
+        <w:rPr>
+          <w:rFonts w:ascii="David" w:hAnsi="David" w:cs="David" w:hint="cs"/>
+          <w:rtl/>
+        </w:rPr>
+        <w:t xml:space="preserve"> (צריך שיהיה זהה בקובץ בפועל, ובקובץ הסביבה בפועל של צד השרת).</w:t>
+      </w:r>
+    </w:p>
+    <w:p>
+      <w:pPr>
+        <w:pStyle w:val="ListParagraph"/>
+        <w:bidi/>
+        <w:spacing w:line="276" w:lineRule="auto"/>
+        <w:rPr>
+          <w:rFonts w:ascii="David" w:hAnsi="David" w:cs="David"/>
+          <w:rtl/>
+        </w:rPr>
+      </w:pPr>
+    </w:p>
+    <w:p>
+      <w:pPr>
+        <w:pStyle w:val="ListParagraph"/>
+        <w:numPr>
+          <w:ilvl w:val="0"/>
+          <w:numId w:val="19"/>
+        </w:numPr>
+        <w:bidi/>
+        <w:spacing w:line="276" w:lineRule="auto"/>
+        <w:rPr>
+          <w:rFonts w:ascii="David" w:hAnsi="David" w:cs="David"/>
+          <w:b/>
+          <w:bCs/>
+        </w:rPr>
+      </w:pPr>
+      <w:proofErr w:type="spellStart"/>
+      <w:r>
+        <w:rPr>
+          <w:rFonts w:ascii="David" w:hAnsi="David" w:cs="David"/>
+          <w:b/>
+          <w:bCs/>
+        </w:rPr>
+        <w:t>docker.compose.yml</w:t>
+      </w:r>
+      <w:proofErr w:type="spellEnd"/>
+      <w:r>
+        <w:rPr>
+          <w:rFonts w:ascii="David" w:hAnsi="David" w:cs="David" w:hint="cs"/>
+          <w:b/>
+          <w:bCs/>
+          <w:rtl/>
+        </w:rPr>
+        <w:t xml:space="preserve">: </w:t>
+      </w:r>
+    </w:p>
+    <w:p>
+      <w:pPr>
+        <w:pStyle w:val="ListParagraph"/>
+        <w:bidi/>
+        <w:spacing w:line="276" w:lineRule="auto"/>
+        <w:rPr>
+          <w:rFonts w:ascii="David" w:hAnsi="David" w:cs="David"/>
+          <w:rtl/>
+        </w:rPr>
+      </w:pPr>
+      <w:r>
+        <w:rPr>
+          <w:rFonts w:ascii="David" w:hAnsi="David" w:cs="David" w:hint="cs"/>
+          <w:rtl/>
+        </w:rPr>
+        <w:t xml:space="preserve">מכיל את כלל ההרצה של הפרוייקט </w:t>
+      </w:r>
+      <w:r>
+        <w:rPr>
+          <w:rFonts w:ascii="David" w:hAnsi="David" w:cs="David"/>
+        </w:rPr>
+        <w:t>END TO END</w:t>
+      </w:r>
+      <w:r>
+        <w:rPr>
+          <w:rFonts w:ascii="David" w:hAnsi="David" w:cs="David" w:hint="cs"/>
+          <w:rtl/>
+        </w:rPr>
+        <w:t xml:space="preserve"> באמצעות </w:t>
+      </w:r>
+      <w:r>
+        <w:rPr>
+          <w:rFonts w:ascii="David" w:hAnsi="David" w:cs="David"/>
+        </w:rPr>
+        <w:t>DOCKER</w:t>
+      </w:r>
+      <w:r>
+        <w:rPr>
+          <w:rFonts w:ascii="David" w:hAnsi="David" w:cs="David" w:hint="cs"/>
+          <w:rtl/>
+        </w:rPr>
+        <w:t xml:space="preserve"> </w:t>
+      </w:r>
+      <w:r>
+        <w:rPr>
+          <w:rFonts w:ascii="David" w:hAnsi="David" w:cs="David"/>
+          <w:rtl/>
+        </w:rPr>
+        <w:t>–</w:t>
+      </w:r>
+      <w:r>
+        <w:rPr>
+          <w:rFonts w:ascii="David" w:hAnsi="David" w:cs="David" w:hint="cs"/>
+          <w:rtl/>
+        </w:rPr>
+        <w:t xml:space="preserve"> מכיל מופעים של </w:t>
+      </w:r>
+      <w:r>
+        <w:rPr>
+          <w:rFonts w:ascii="David" w:hAnsi="David" w:cs="David"/>
+        </w:rPr>
+        <w:t>DB</w:t>
+      </w:r>
+      <w:r>
+        <w:rPr>
+          <w:rFonts w:ascii="David" w:hAnsi="David" w:cs="David" w:hint="cs"/>
+          <w:rtl/>
+        </w:rPr>
+        <w:t>, צד-שרת וצד לקוח עם קונפיגורציה מתאימה להרצה קלה וחלקה (קיים מדריך נוסף לצורך הרצת הפרוייקט).</w:t>
+      </w:r>
+    </w:p>
+    <w:p>
+      <w:pPr>
+        <w:pStyle w:val="ListParagraph"/>
+        <w:bidi/>
+        <w:spacing w:line="276" w:lineRule="auto"/>
+        <w:rPr>
+          <w:rFonts w:ascii="David" w:hAnsi="David" w:cs="David" w:hint="cs"/>
+          <w:rtl/>
+        </w:rPr>
+      </w:pPr>
+      <w:r>
+        <w:rPr>
+          <w:rFonts w:ascii="David" w:hAnsi="David" w:cs="David" w:hint="cs"/>
+          <w:rtl/>
+        </w:rPr>
+        <w:t>בנוסף כאשר מריצים באמצעות ה</w:t>
+      </w:r>
+      <w:r>
+        <w:rPr>
+          <w:rFonts w:ascii="David" w:hAnsi="David" w:cs="David"/>
+        </w:rPr>
+        <w:t>DOCKER</w:t>
+      </w:r>
+      <w:r>
+        <w:rPr>
+          <w:rFonts w:ascii="David" w:hAnsi="David" w:cs="David" w:hint="cs"/>
+          <w:rtl/>
+        </w:rPr>
+        <w:t xml:space="preserve">, אנו מריצים עם </w:t>
+      </w:r>
+      <w:r>
+        <w:rPr>
+          <w:rFonts w:ascii="David" w:hAnsi="David" w:cs="David"/>
+        </w:rPr>
+        <w:t>REVERSE PROXY</w:t>
+      </w:r>
+      <w:r>
+        <w:rPr>
+          <w:rFonts w:ascii="David" w:hAnsi="David" w:cs="David" w:hint="cs"/>
+          <w:rtl/>
+        </w:rPr>
+        <w:t xml:space="preserve"> של </w:t>
+      </w:r>
+      <w:r>
+        <w:rPr>
+          <w:rFonts w:ascii="David" w:hAnsi="David" w:cs="David"/>
+        </w:rPr>
+        <w:t>CADDY</w:t>
+      </w:r>
+      <w:r>
+        <w:rPr>
+          <w:rFonts w:ascii="David" w:hAnsi="David" w:cs="David" w:hint="cs"/>
+          <w:rtl/>
+        </w:rPr>
+        <w:t xml:space="preserve"> המאפשר תקשורת באמצעות </w:t>
+      </w:r>
+      <w:r>
+        <w:rPr>
+          <w:rFonts w:ascii="David" w:hAnsi="David" w:cs="David"/>
+        </w:rPr>
+        <w:t>HTTPS</w:t>
+      </w:r>
+      <w:r>
+        <w:rPr>
+          <w:rFonts w:ascii="David" w:hAnsi="David" w:cs="David" w:hint="cs"/>
+          <w:rtl/>
+        </w:rPr>
+        <w:t xml:space="preserve"> </w:t>
+      </w:r>
+      <w:r>
+        <w:rPr>
+          <w:rFonts w:ascii="David" w:hAnsi="David" w:cs="David"/>
+          <w:rtl/>
+        </w:rPr>
+        <w:t>–</w:t>
+      </w:r>
+      <w:r>
+        <w:rPr>
+          <w:rFonts w:ascii="David" w:hAnsi="David" w:cs="David" w:hint="cs"/>
+          <w:rtl/>
+        </w:rPr>
+        <w:t xml:space="preserve"> חלק מהדפדפנים עשויים לתת הערת אזהרה לגבי </w:t>
+      </w:r>
+      <w:r>
+        <w:rPr>
+          <w:rFonts w:ascii="David" w:hAnsi="David" w:cs="David"/>
+        </w:rPr>
+        <w:t>SECURITY</w:t>
+      </w:r>
+      <w:r>
+        <w:rPr>
+          <w:rFonts w:ascii="David" w:hAnsi="David" w:cs="David" w:hint="cs"/>
+          <w:rtl/>
+        </w:rPr>
+        <w:t xml:space="preserve"> </w:t>
+      </w:r>
+      <w:r>
+        <w:rPr>
+          <w:rFonts w:ascii="David" w:hAnsi="David" w:cs="David"/>
+          <w:rtl/>
+        </w:rPr>
+        <w:t>–</w:t>
+      </w:r>
+      <w:r>
+        <w:rPr>
+          <w:rFonts w:ascii="David" w:hAnsi="David" w:cs="David" w:hint="cs"/>
+          <w:rtl/>
+        </w:rPr>
+        <w:t xml:space="preserve"> בראשית הקובץ בהערות כתוב כיצד ניתן להפעיל את האפליקציה </w:t>
+      </w:r>
+      <w:r>
+        <w:rPr>
+          <w:rFonts w:ascii="David" w:hAnsi="David" w:cs="David"/>
+        </w:rPr>
+        <w:t>END TO END</w:t>
+      </w:r>
+      <w:r>
+        <w:rPr>
+          <w:rFonts w:ascii="David" w:hAnsi="David" w:cs="David" w:hint="cs"/>
+          <w:rtl/>
+        </w:rPr>
+        <w:t xml:space="preserve"> וגם לסמוך על ה</w:t>
+      </w:r>
+      <w:r>
+        <w:rPr>
+          <w:rFonts w:ascii="David" w:hAnsi="David" w:cs="David"/>
+        </w:rPr>
+        <w:t>CERTIFICATIONS</w:t>
+      </w:r>
+      <w:r>
+        <w:rPr>
+          <w:rFonts w:ascii="David" w:hAnsi="David" w:cs="David" w:hint="cs"/>
+          <w:rtl/>
+        </w:rPr>
+        <w:t xml:space="preserve"> כדי לא לקבל את הערת האזהרה.</w:t>
+      </w:r>
+    </w:p>
+    <w:p>
+      <w:pPr>
+        <w:pStyle w:val="ListParagraph"/>
+        <w:bidi/>
+        <w:spacing w:line="276" w:lineRule="auto"/>
+        <w:rPr>
+          <w:rFonts w:ascii="David" w:hAnsi="David" w:cs="David" w:hint="cs"/>
+        </w:rPr>
+      </w:pPr>
+    </w:p>
+    <w:p>
+      <w:pPr>
+        <w:bidi/>
+        <w:spacing w:line="276" w:lineRule="auto"/>
+        <w:rPr>
+          <w:rFonts w:ascii="David" w:hAnsi="David" w:cs="David"/>
+        </w:rPr>
+      </w:pPr>
+    </w:p>
+    <w:p>
+      <w:pPr>
+        <w:bidi/>
+        <w:spacing w:line="276" w:lineRule="auto"/>
+        <w:rPr>
+          <w:rFonts w:ascii="David" w:hAnsi="David" w:cs="David"/>
+        </w:rPr>
+      </w:pPr>
+    </w:p>
+    <w:p>
+      <w:pPr>
+        <w:bidi/>
+        <w:spacing w:line="276" w:lineRule="auto"/>
+        <w:rPr>
+          <w:rFonts w:ascii="David" w:hAnsi="David" w:cs="David"/>
+        </w:rPr>
+      </w:pPr>
+    </w:p>
+    <w:p>
+      <w:pPr>
+        <w:bidi/>
+        <w:spacing w:line="276" w:lineRule="auto"/>
+        <w:rPr>
+          <w:rFonts w:ascii="David" w:hAnsi="David" w:cs="David"/>
+          <w:u w:val="single"/>
+          <w:rtl/>
+        </w:rPr>
+      </w:pPr>
+      <w:r>
+        <w:rPr>
+          <w:rFonts w:ascii="David" w:hAnsi="David" w:cs="David"/>
+          <w:u w:val="single"/>
+        </w:rPr>
+        <w:t>docs</w:t>
+      </w:r>
+      <w:r>
+        <w:rPr>
+          <w:rFonts w:ascii="David" w:hAnsi="David" w:cs="David" w:hint="cs"/>
+          <w:u w:val="single"/>
+          <w:rtl/>
+        </w:rPr>
+        <w:t>:</w:t>
+      </w:r>
+    </w:p>
+    <w:p>
+      <w:pPr>
+        <w:bidi/>
+        <w:spacing w:line="276" w:lineRule="auto"/>
+        <w:rPr>
+          <w:rFonts w:ascii="David" w:hAnsi="David" w:cs="David" w:hint="cs"/>
+        </w:rPr>
+      </w:pPr>
+      <w:r>
+        <w:rPr>
+          <w:rFonts w:ascii="David" w:hAnsi="David" w:cs="David" w:hint="cs"/>
+          <w:rtl/>
+        </w:rPr>
+        <w:t>מכיל את כל המסמכים הדרושים: מסמך תכנון, מדריך למשתמש, ומדריך התקנה והפעלה.</w:t>
+      </w:r>
+    </w:p>
+    <w:p>
+      <w:pPr>
+        <w:bidi/>
+        <w:spacing w:line="276" w:lineRule="auto"/>
+        <w:rPr>
+          <w:rFonts w:ascii="David" w:hAnsi="David" w:cs="David"/>
+        </w:rPr>
+      </w:pPr>
+    </w:p>
+    <w:p>
+      <w:pPr>
+        <w:bidi/>
+        <w:spacing w:line="276" w:lineRule="auto"/>
+        <w:rPr>
+          <w:rFonts w:ascii="David" w:hAnsi="David" w:cs="David"/>
+        </w:rPr>
+      </w:pPr>
+    </w:p>
+    <w:p>
+      <w:pPr>
+        <w:bidi/>
+        <w:spacing w:line="276" w:lineRule="auto"/>
+        <w:rPr>
+          <w:rFonts w:ascii="David" w:hAnsi="David" w:cs="David"/>
+        </w:rPr>
+      </w:pPr>
+    </w:p>
+    <w:p>
+      <w:pPr>
+        <w:bidi/>
+        <w:spacing w:line="276" w:lineRule="auto"/>
+        <w:rPr>
+          <w:rFonts w:ascii="David" w:hAnsi="David" w:cs="David"/>
+        </w:rPr>
+      </w:pPr>
     </w:p>
     <w:p>
       <w:pPr>
@@ -12805,6 +13398,95 @@
     </w:lvl>
   </w:abstractNum>
   <w:abstractNum w:abstractNumId="16" w15:restartNumberingAfterBreak="0">
+    <w:nsid w:val="6AB72C15"/>
+    <w:multiLevelType w:val="hybridMultilevel"/>
+    <w:tmpl w:val="704EC7A4"/>
+    <w:lvl w:ilvl="0" w:tplc="0409000F">
+      <w:start w:val="1"/>
+      <w:numFmt w:val="decimal"/>
+      <w:lvlText w:val="%1."/>
+      <w:lvlJc w:val="left"/>
+      <w:pPr>
+        <w:ind w:left="720" w:hanging="360"/>
+      </w:pPr>
+      <w:rPr>
+        <w:rFonts w:hint="default"/>
+      </w:rPr>
+    </w:lvl>
+    <w:lvl w:ilvl="1" w:tplc="04090019" w:tentative="1">
+      <w:start w:val="1"/>
+      <w:numFmt w:val="lowerLetter"/>
+      <w:lvlText w:val="%2."/>
+      <w:lvlJc w:val="left"/>
+      <w:pPr>
+        <w:ind w:left="1440" w:hanging="360"/>
+      </w:pPr>
+    </w:lvl>
+    <w:lvl w:ilvl="2" w:tplc="0409001B" w:tentative="1">
+      <w:start w:val="1"/>
+      <w:numFmt w:val="lowerRoman"/>
+      <w:lvlText w:val="%3."/>
+      <w:lvlJc w:val="right"/>
+      <w:pPr>
+        <w:ind w:left="2160" w:hanging="180"/>
+      </w:pPr>
+    </w:lvl>
+    <w:lvl w:ilvl="3" w:tplc="0409000F" w:tentative="1">
+      <w:start w:val="1"/>
+      <w:numFmt w:val="decimal"/>
+      <w:lvlText w:val="%4."/>
+      <w:lvlJc w:val="left"/>
+      <w:pPr>
+        <w:ind w:left="2880" w:hanging="360"/>
+      </w:pPr>
+    </w:lvl>
+    <w:lvl w:ilvl="4" w:tplc="04090019" w:tentative="1">
+      <w:start w:val="1"/>
+      <w:numFmt w:val="lowerLetter"/>
+      <w:lvlText w:val="%5."/>
+      <w:lvlJc w:val="left"/>
+      <w:pPr>
+        <w:ind w:left="3600" w:hanging="360"/>
+      </w:pPr>
+    </w:lvl>
+    <w:lvl w:ilvl="5" w:tplc="0409001B" w:tentative="1">
+      <w:start w:val="1"/>
+      <w:numFmt w:val="lowerRoman"/>
+      <w:lvlText w:val="%6."/>
+      <w:lvlJc w:val="right"/>
+      <w:pPr>
+        <w:ind w:left="4320" w:hanging="180"/>
+      </w:pPr>
+    </w:lvl>
+    <w:lvl w:ilvl="6" w:tplc="0409000F" w:tentative="1">
+      <w:start w:val="1"/>
+      <w:numFmt w:val="decimal"/>
+      <w:lvlText w:val="%7."/>
+      <w:lvlJc w:val="left"/>
+      <w:pPr>
+        <w:ind w:left="5040" w:hanging="360"/>
+      </w:pPr>
+    </w:lvl>
+    <w:lvl w:ilvl="7" w:tplc="04090019" w:tentative="1">
+      <w:start w:val="1"/>
+      <w:numFmt w:val="lowerLetter"/>
+      <w:lvlText w:val="%8."/>
+      <w:lvlJc w:val="left"/>
+      <w:pPr>
+        <w:ind w:left="5760" w:hanging="360"/>
+      </w:pPr>
+    </w:lvl>
+    <w:lvl w:ilvl="8" w:tplc="0409001B" w:tentative="1">
+      <w:start w:val="1"/>
+      <w:numFmt w:val="lowerRoman"/>
+      <w:lvlText w:val="%9."/>
+      <w:lvlJc w:val="right"/>
+      <w:pPr>
+        <w:ind w:left="6480" w:hanging="180"/>
+      </w:pPr>
+    </w:lvl>
+  </w:abstractNum>
+  <w:abstractNum w:abstractNumId="17" w15:restartNumberingAfterBreak="0">
     <w:nsid w:val="7AB84668"/>
     <w:multiLevelType w:val="hybridMultilevel"/>
     <w:tmpl w:val="4A6EF0E4"/>
@@ -12893,7 +13575,7 @@
       </w:pPr>
     </w:lvl>
   </w:abstractNum>
-  <w:abstractNum w:abstractNumId="17" w15:restartNumberingAfterBreak="0">
+  <w:abstractNum w:abstractNumId="18" w15:restartNumberingAfterBreak="0">
     <w:nsid w:val="7CC44EBA"/>
     <w:multiLevelType w:val="hybridMultilevel"/>
     <w:tmpl w:val="2E1C70EA"/>
@@ -13004,7 +13686,7 @@
     <w:abstractNumId w:val="10"/>
   </w:num>
   <w:num w:numId="8" w16cid:durableId="77866653">
-    <w:abstractNumId w:val="16"/>
+    <w:abstractNumId w:val="17"/>
   </w:num>
   <w:num w:numId="9" w16cid:durableId="918320725">
     <w:abstractNumId w:val="7"/>
@@ -13016,7 +13698,7 @@
     <w:abstractNumId w:val="9"/>
   </w:num>
   <w:num w:numId="12" w16cid:durableId="13505523">
-    <w:abstractNumId w:val="17"/>
+    <w:abstractNumId w:val="18"/>
   </w:num>
   <w:num w:numId="13" w16cid:durableId="1687749319">
     <w:abstractNumId w:val="5"/>
@@ -13035,6 +13717,9 @@
   </w:num>
   <w:num w:numId="18" w16cid:durableId="1609510136">
     <w:abstractNumId w:val="15"/>
+  </w:num>
+  <w:num w:numId="19" w16cid:durableId="1491406813">
+    <w:abstractNumId w:val="16"/>
   </w:num>
 </w:numbering>
 </file>
@@ -13439,7 +14124,7 @@
   <w:style w:type="paragraph" w:default="1" w:styleId="Normal">
     <w:name w:val="Normal"/>
     <w:qFormat/>
-    <w:rsid w:val="00A0549D"/>
+    <w:rsid w:val="00E74949"/>
   </w:style>
   <w:style w:type="paragraph" w:styleId="Heading1">
     <w:name w:val="heading 1"/>

</xml_diff>

<commit_message>
planning - adding diagrams
</commit_message>
<xml_diff>
--- a/planning.docx
+++ b/planning.docx
@@ -25,7 +25,7 @@
                     </pic:cNvPicPr>
                   </pic:nvPicPr>
                   <pic:blipFill>
-                    <a:blip r:embed="rId5">
+                    <a:blip r:embed="rId7">
                       <a:extLst>
                         <a:ext uri="{28A0092B-C50C-407E-A947-70E740481C1C}">
                           <a14:useLocalDpi xmlns:a14="http://schemas.microsoft.com/office/drawing/2010/main" val="0"/>
@@ -10999,7 +10999,7 @@
         <w:bidi/>
         <w:spacing w:line="276" w:lineRule="auto"/>
         <w:rPr>
-          <w:rFonts w:ascii="David" w:hAnsi="David" w:cs="David" w:hint="cs"/>
+          <w:rFonts w:ascii="David" w:hAnsi="David" w:cs="David"/>
           <w:rtl/>
         </w:rPr>
       </w:pPr>
@@ -11136,7 +11136,7 @@
         <w:bidi/>
         <w:spacing w:line="276" w:lineRule="auto"/>
         <w:rPr>
-          <w:rFonts w:ascii="David" w:hAnsi="David" w:cs="David" w:hint="cs"/>
+          <w:rFonts w:ascii="David" w:hAnsi="David" w:cs="David"/>
         </w:rPr>
       </w:pPr>
     </w:p>
@@ -11198,7 +11198,7 @@
         <w:bidi/>
         <w:spacing w:line="276" w:lineRule="auto"/>
         <w:rPr>
-          <w:rFonts w:ascii="David" w:hAnsi="David" w:cs="David" w:hint="cs"/>
+          <w:rFonts w:ascii="David" w:hAnsi="David" w:cs="David"/>
         </w:rPr>
       </w:pPr>
       <w:r>
@@ -11473,7 +11473,7 @@
                     </pic:cNvPicPr>
                   </pic:nvPicPr>
                   <pic:blipFill>
-                    <a:blip r:embed="rId6">
+                    <a:blip r:embed="rId8">
                       <a:extLst>
                         <a:ext uri="{28A0092B-C50C-407E-A947-70E740481C1C}">
                           <a14:useLocalDpi xmlns:a14="http://schemas.microsoft.com/office/drawing/2010/main" val="0"/>
@@ -11869,7 +11869,6 @@
         <w:spacing w:line="276" w:lineRule="auto"/>
         <w:rPr>
           <w:rFonts w:ascii="David" w:hAnsi="David" w:cs="David"/>
-          <w:rtl/>
         </w:rPr>
       </w:pPr>
       <w:r>
@@ -11933,6 +11932,649 @@
           <w:rtl/>
         </w:rPr>
         <w:t xml:space="preserve"> צריך לשמור היסטוריה של מה הוזמן ברגע ההזמנה בפועל).</w:t>
+      </w:r>
+    </w:p>
+    <w:p>
+      <w:pPr>
+        <w:bidi/>
+        <w:spacing w:line="276" w:lineRule="auto"/>
+        <w:rPr>
+          <w:rFonts w:ascii="David" w:hAnsi="David" w:cs="David"/>
+        </w:rPr>
+      </w:pPr>
+    </w:p>
+    <w:p>
+      <w:pPr>
+        <w:bidi/>
+        <w:spacing w:line="276" w:lineRule="auto"/>
+        <w:rPr>
+          <w:rFonts w:ascii="David" w:hAnsi="David" w:cs="David"/>
+          <w:b/>
+          <w:bCs/>
+          <w:sz w:val="32"/>
+          <w:szCs w:val="32"/>
+          <w:u w:val="single"/>
+        </w:rPr>
+      </w:pPr>
+      <w:r>
+        <w:rPr>
+          <w:rFonts w:ascii="David" w:hAnsi="David" w:cs="David"/>
+          <w:noProof/>
+        </w:rPr>
+        <w:lastRenderedPageBreak/>
+        <w:drawing>
+          <wp:anchor distT="0" distB="0" distL="114300" distR="114300" simplePos="0" relativeHeight="251659264" behindDoc="1" locked="0" layoutInCell="1" allowOverlap="1" wp14:anchorId="5A803DE8" wp14:editId="7847C2F3">
+            <wp:simplePos x="0" y="0"/>
+            <wp:positionH relativeFrom="page">
+              <wp:align>right</wp:align>
+            </wp:positionH>
+            <wp:positionV relativeFrom="paragraph">
+              <wp:posOffset>266700</wp:posOffset>
+            </wp:positionV>
+            <wp:extent cx="7754620" cy="4038600"/>
+            <wp:effectExtent l="0" t="0" r="0" b="0"/>
+            <wp:wrapTight wrapText="bothSides">
+              <wp:wrapPolygon edited="0">
+                <wp:start x="0" y="0"/>
+                <wp:lineTo x="0" y="1019"/>
+                <wp:lineTo x="10772" y="1834"/>
+                <wp:lineTo x="10772" y="3464"/>
+                <wp:lineTo x="0" y="4992"/>
+                <wp:lineTo x="0" y="7132"/>
+                <wp:lineTo x="849" y="8355"/>
+                <wp:lineTo x="0" y="8558"/>
+                <wp:lineTo x="0" y="13245"/>
+                <wp:lineTo x="637" y="13347"/>
+                <wp:lineTo x="637" y="21294"/>
+                <wp:lineTo x="902" y="21396"/>
+                <wp:lineTo x="8012" y="21498"/>
+                <wp:lineTo x="9021" y="21498"/>
+                <wp:lineTo x="16078" y="21396"/>
+                <wp:lineTo x="16556" y="21294"/>
+                <wp:lineTo x="16396" y="18136"/>
+                <wp:lineTo x="21543" y="17015"/>
+                <wp:lineTo x="21543" y="8558"/>
+                <wp:lineTo x="20694" y="8355"/>
+                <wp:lineTo x="21543" y="7132"/>
+                <wp:lineTo x="21543" y="4992"/>
+                <wp:lineTo x="10719" y="3464"/>
+                <wp:lineTo x="10719" y="1834"/>
+                <wp:lineTo x="3131" y="0"/>
+                <wp:lineTo x="0" y="0"/>
+              </wp:wrapPolygon>
+            </wp:wrapTight>
+            <wp:docPr id="846761611" name="Picture 1"/>
+            <wp:cNvGraphicFramePr>
+              <a:graphicFrameLocks xmlns:a="http://schemas.openxmlformats.org/drawingml/2006/main" noChangeAspect="1"/>
+            </wp:cNvGraphicFramePr>
+            <a:graphic xmlns:a="http://schemas.openxmlformats.org/drawingml/2006/main">
+              <a:graphicData uri="http://schemas.openxmlformats.org/drawingml/2006/picture">
+                <pic:pic xmlns:pic="http://schemas.openxmlformats.org/drawingml/2006/picture">
+                  <pic:nvPicPr>
+                    <pic:cNvPr id="0" name="Picture 1"/>
+                    <pic:cNvPicPr>
+                      <a:picLocks noChangeAspect="1" noChangeArrowheads="1"/>
+                    </pic:cNvPicPr>
+                  </pic:nvPicPr>
+                  <pic:blipFill>
+                    <a:blip r:embed="rId9">
+                      <a:extLst>
+                        <a:ext uri="{28A0092B-C50C-407E-A947-70E740481C1C}">
+                          <a14:useLocalDpi xmlns:a14="http://schemas.microsoft.com/office/drawing/2010/main" val="0"/>
+                        </a:ext>
+                      </a:extLst>
+                    </a:blip>
+                    <a:srcRect/>
+                    <a:stretch>
+                      <a:fillRect/>
+                    </a:stretch>
+                  </pic:blipFill>
+                  <pic:spPr bwMode="auto">
+                    <a:xfrm>
+                      <a:off x="0" y="0"/>
+                      <a:ext cx="7754620" cy="4038600"/>
+                    </a:xfrm>
+                    <a:prstGeom prst="rect">
+                      <a:avLst/>
+                    </a:prstGeom>
+                    <a:noFill/>
+                    <a:ln>
+                      <a:noFill/>
+                    </a:ln>
+                  </pic:spPr>
+                </pic:pic>
+              </a:graphicData>
+            </a:graphic>
+            <wp14:sizeRelH relativeFrom="margin">
+              <wp14:pctWidth>0</wp14:pctWidth>
+            </wp14:sizeRelH>
+            <wp14:sizeRelV relativeFrom="margin">
+              <wp14:pctHeight>0</wp14:pctHeight>
+            </wp14:sizeRelV>
+          </wp:anchor>
+        </w:drawing>
+      </w:r>
+      <w:r>
+        <w:rPr>
+          <w:rFonts w:ascii="David" w:hAnsi="David" w:cs="David" w:hint="cs"/>
+          <w:b/>
+          <w:bCs/>
+          <w:sz w:val="32"/>
+          <w:szCs w:val="32"/>
+          <w:u w:val="single"/>
+          <w:rtl/>
+        </w:rPr>
+        <w:t>תיאור</w:t>
+      </w:r>
+      <w:r>
+        <w:rPr>
+          <w:rFonts w:ascii="David" w:hAnsi="David" w:cs="David"/>
+          <w:b/>
+          <w:bCs/>
+          <w:sz w:val="32"/>
+          <w:szCs w:val="32"/>
+          <w:u w:val="single"/>
+          <w:rtl/>
+        </w:rPr>
+        <w:t xml:space="preserve"> </w:t>
+      </w:r>
+      <w:r>
+        <w:rPr>
+          <w:rFonts w:ascii="David" w:hAnsi="David" w:cs="David" w:hint="cs"/>
+          <w:b/>
+          <w:bCs/>
+          <w:sz w:val="32"/>
+          <w:szCs w:val="32"/>
+          <w:u w:val="single"/>
+          <w:rtl/>
+        </w:rPr>
+        <w:t>מעבר בין דפים</w:t>
+      </w:r>
+    </w:p>
+    <w:p>
+      <w:pPr>
+        <w:bidi/>
+        <w:spacing w:line="276" w:lineRule="auto"/>
+        <w:rPr>
+          <w:rFonts w:ascii="David" w:hAnsi="David" w:cs="David"/>
+        </w:rPr>
+      </w:pPr>
+    </w:p>
+    <w:p>
+      <w:pPr>
+        <w:bidi/>
+        <w:spacing w:line="276" w:lineRule="auto"/>
+        <w:rPr>
+          <w:rFonts w:ascii="David" w:hAnsi="David" w:cs="David"/>
+        </w:rPr>
+      </w:pPr>
+    </w:p>
+    <w:p>
+      <w:pPr>
+        <w:bidi/>
+        <w:spacing w:line="276" w:lineRule="auto"/>
+        <w:rPr>
+          <w:rFonts w:ascii="David" w:hAnsi="David" w:cs="David"/>
+        </w:rPr>
+      </w:pPr>
+    </w:p>
+    <w:p>
+      <w:pPr>
+        <w:bidi/>
+        <w:spacing w:line="276" w:lineRule="auto"/>
+        <w:rPr>
+          <w:rFonts w:ascii="David" w:hAnsi="David" w:cs="David"/>
+        </w:rPr>
+      </w:pPr>
+    </w:p>
+    <w:p>
+      <w:pPr>
+        <w:bidi/>
+        <w:spacing w:line="276" w:lineRule="auto"/>
+        <w:rPr>
+          <w:rFonts w:ascii="David" w:hAnsi="David" w:cs="David"/>
+        </w:rPr>
+      </w:pPr>
+    </w:p>
+    <w:p>
+      <w:pPr>
+        <w:bidi/>
+        <w:spacing w:line="276" w:lineRule="auto"/>
+        <w:rPr>
+          <w:rFonts w:ascii="David" w:hAnsi="David" w:cs="David"/>
+        </w:rPr>
+      </w:pPr>
+    </w:p>
+    <w:p>
+      <w:pPr>
+        <w:bidi/>
+        <w:spacing w:line="276" w:lineRule="auto"/>
+        <w:rPr>
+          <w:rFonts w:ascii="David" w:hAnsi="David" w:cs="David"/>
+          <w:rtl/>
+        </w:rPr>
+      </w:pPr>
+    </w:p>
+    <w:p>
+      <w:pPr>
+        <w:bidi/>
+        <w:spacing w:line="276" w:lineRule="auto"/>
+        <w:rPr>
+          <w:rFonts w:ascii="David" w:hAnsi="David" w:cs="David"/>
+          <w:rtl/>
+        </w:rPr>
+      </w:pPr>
+    </w:p>
+    <w:p>
+      <w:pPr>
+        <w:bidi/>
+        <w:spacing w:line="276" w:lineRule="auto"/>
+        <w:rPr>
+          <w:rFonts w:ascii="David" w:hAnsi="David" w:cs="David"/>
+          <w:rtl/>
+        </w:rPr>
+      </w:pPr>
+    </w:p>
+    <w:p>
+      <w:pPr>
+        <w:bidi/>
+        <w:spacing w:line="276" w:lineRule="auto"/>
+        <w:rPr>
+          <w:rFonts w:ascii="David" w:hAnsi="David" w:cs="David"/>
+          <w:rtl/>
+        </w:rPr>
+      </w:pPr>
+    </w:p>
+    <w:p>
+      <w:pPr>
+        <w:bidi/>
+        <w:spacing w:line="276" w:lineRule="auto"/>
+        <w:rPr>
+          <w:rFonts w:ascii="David" w:hAnsi="David" w:cs="David"/>
+          <w:rtl/>
+        </w:rPr>
+      </w:pPr>
+    </w:p>
+    <w:p>
+      <w:pPr>
+        <w:bidi/>
+        <w:spacing w:line="276" w:lineRule="auto"/>
+        <w:rPr>
+          <w:rFonts w:ascii="David" w:hAnsi="David" w:cs="David"/>
+          <w:rtl/>
+        </w:rPr>
+      </w:pPr>
+    </w:p>
+    <w:p>
+      <w:pPr>
+        <w:bidi/>
+        <w:spacing w:line="276" w:lineRule="auto"/>
+        <w:rPr>
+          <w:rFonts w:ascii="David" w:hAnsi="David" w:cs="David"/>
+          <w:rtl/>
+        </w:rPr>
+      </w:pPr>
+    </w:p>
+    <w:p>
+      <w:pPr>
+        <w:bidi/>
+        <w:spacing w:line="276" w:lineRule="auto"/>
+        <w:rPr>
+          <w:rFonts w:ascii="David" w:hAnsi="David" w:cs="David"/>
+          <w:rtl/>
+        </w:rPr>
+      </w:pPr>
+    </w:p>
+    <w:p>
+      <w:pPr>
+        <w:bidi/>
+        <w:spacing w:line="276" w:lineRule="auto"/>
+        <w:rPr>
+          <w:rFonts w:ascii="David" w:hAnsi="David" w:cs="David"/>
+          <w:rtl/>
+        </w:rPr>
+      </w:pPr>
+    </w:p>
+    <w:p>
+      <w:pPr>
+        <w:bidi/>
+        <w:spacing w:line="276" w:lineRule="auto"/>
+        <w:rPr>
+          <w:rFonts w:ascii="David" w:hAnsi="David" w:cs="David"/>
+          <w:rtl/>
+        </w:rPr>
+      </w:pPr>
+    </w:p>
+    <w:p>
+      <w:pPr>
+        <w:bidi/>
+        <w:spacing w:line="276" w:lineRule="auto"/>
+        <w:rPr>
+          <w:rFonts w:ascii="David" w:hAnsi="David" w:cs="David"/>
+          <w:rtl/>
+        </w:rPr>
+      </w:pPr>
+    </w:p>
+    <w:p>
+      <w:pPr>
+        <w:bidi/>
+        <w:spacing w:line="276" w:lineRule="auto"/>
+        <w:rPr>
+          <w:rFonts w:ascii="David" w:hAnsi="David" w:cs="David"/>
+          <w:rtl/>
+        </w:rPr>
+      </w:pPr>
+    </w:p>
+    <w:p>
+      <w:pPr>
+        <w:bidi/>
+        <w:spacing w:line="276" w:lineRule="auto"/>
+        <w:rPr>
+          <w:rFonts w:ascii="David" w:hAnsi="David" w:cs="David"/>
+        </w:rPr>
+      </w:pPr>
+    </w:p>
+    <w:p>
+      <w:pPr>
+        <w:bidi/>
+        <w:spacing w:line="276" w:lineRule="auto"/>
+        <w:rPr>
+          <w:rFonts w:ascii="David" w:hAnsi="David" w:cs="David"/>
+          <w:b/>
+          <w:bCs/>
+          <w:sz w:val="32"/>
+          <w:szCs w:val="32"/>
+          <w:u w:val="single"/>
+          <w:rtl/>
+        </w:rPr>
+      </w:pPr>
+      <w:r>
+        <w:rPr>
+          <w:rFonts w:ascii="David" w:hAnsi="David" w:cs="David"/>
+          <w:b/>
+          <w:bCs/>
+          <w:noProof/>
+          <w:sz w:val="32"/>
+          <w:szCs w:val="32"/>
+          <w:u w:val="single"/>
+        </w:rPr>
+        <w:lastRenderedPageBreak/>
+        <w:drawing>
+          <wp:anchor distT="0" distB="0" distL="114300" distR="114300" simplePos="0" relativeHeight="251660288" behindDoc="0" locked="0" layoutInCell="1" allowOverlap="1" wp14:anchorId="5E402E40" wp14:editId="36B952F0">
+            <wp:simplePos x="0" y="0"/>
+            <wp:positionH relativeFrom="column">
+              <wp:posOffset>-692150</wp:posOffset>
+            </wp:positionH>
+            <wp:positionV relativeFrom="paragraph">
+              <wp:posOffset>330200</wp:posOffset>
+            </wp:positionV>
+            <wp:extent cx="7352665" cy="4616450"/>
+            <wp:effectExtent l="0" t="0" r="635" b="0"/>
+            <wp:wrapSquare wrapText="bothSides"/>
+            <wp:docPr id="1074590659" name="Picture 2"/>
+            <wp:cNvGraphicFramePr>
+              <a:graphicFrameLocks xmlns:a="http://schemas.openxmlformats.org/drawingml/2006/main" noChangeAspect="1"/>
+            </wp:cNvGraphicFramePr>
+            <a:graphic xmlns:a="http://schemas.openxmlformats.org/drawingml/2006/main">
+              <a:graphicData uri="http://schemas.openxmlformats.org/drawingml/2006/picture">
+                <pic:pic xmlns:pic="http://schemas.openxmlformats.org/drawingml/2006/picture">
+                  <pic:nvPicPr>
+                    <pic:cNvPr id="0" name="Picture 2"/>
+                    <pic:cNvPicPr>
+                      <a:picLocks noChangeAspect="1" noChangeArrowheads="1"/>
+                    </pic:cNvPicPr>
+                  </pic:nvPicPr>
+                  <pic:blipFill>
+                    <a:blip r:embed="rId10" cstate="print">
+                      <a:extLst>
+                        <a:ext uri="{28A0092B-C50C-407E-A947-70E740481C1C}">
+                          <a14:useLocalDpi xmlns:a14="http://schemas.microsoft.com/office/drawing/2010/main" val="0"/>
+                        </a:ext>
+                      </a:extLst>
+                    </a:blip>
+                    <a:srcRect/>
+                    <a:stretch>
+                      <a:fillRect/>
+                    </a:stretch>
+                  </pic:blipFill>
+                  <pic:spPr bwMode="auto">
+                    <a:xfrm>
+                      <a:off x="0" y="0"/>
+                      <a:ext cx="7352665" cy="4616450"/>
+                    </a:xfrm>
+                    <a:prstGeom prst="rect">
+                      <a:avLst/>
+                    </a:prstGeom>
+                    <a:noFill/>
+                    <a:ln>
+                      <a:noFill/>
+                    </a:ln>
+                  </pic:spPr>
+                </pic:pic>
+              </a:graphicData>
+            </a:graphic>
+            <wp14:sizeRelH relativeFrom="margin">
+              <wp14:pctWidth>0</wp14:pctWidth>
+            </wp14:sizeRelH>
+            <wp14:sizeRelV relativeFrom="margin">
+              <wp14:pctHeight>0</wp14:pctHeight>
+            </wp14:sizeRelV>
+          </wp:anchor>
+        </w:drawing>
+      </w:r>
+      <w:r>
+        <w:rPr>
+          <w:rFonts w:ascii="David" w:hAnsi="David" w:cs="David" w:hint="cs"/>
+          <w:b/>
+          <w:bCs/>
+          <w:sz w:val="32"/>
+          <w:szCs w:val="32"/>
+          <w:u w:val="single"/>
+          <w:rtl/>
+        </w:rPr>
+        <w:t>תקשורת צד לקוח וצד שרת</w:t>
+      </w:r>
+    </w:p>
+    <w:p>
+      <w:pPr>
+        <w:bidi/>
+        <w:spacing w:line="276" w:lineRule="auto"/>
+        <w:rPr>
+          <w:rFonts w:ascii="David" w:hAnsi="David" w:cs="David"/>
+          <w:rtl/>
+        </w:rPr>
+      </w:pPr>
+    </w:p>
+    <w:p>
+      <w:pPr>
+        <w:bidi/>
+        <w:spacing w:line="276" w:lineRule="auto"/>
+        <w:rPr>
+          <w:rFonts w:ascii="David" w:hAnsi="David" w:cs="David"/>
+          <w:rtl/>
+        </w:rPr>
+      </w:pPr>
+    </w:p>
+    <w:p>
+      <w:pPr>
+        <w:bidi/>
+        <w:spacing w:line="276" w:lineRule="auto"/>
+        <w:rPr>
+          <w:rFonts w:ascii="David" w:hAnsi="David" w:cs="David"/>
+          <w:rtl/>
+        </w:rPr>
+      </w:pPr>
+    </w:p>
+    <w:p>
+      <w:pPr>
+        <w:bidi/>
+        <w:spacing w:line="276" w:lineRule="auto"/>
+        <w:rPr>
+          <w:rFonts w:ascii="David" w:hAnsi="David" w:cs="David"/>
+          <w:rtl/>
+        </w:rPr>
+      </w:pPr>
+    </w:p>
+    <w:p>
+      <w:pPr>
+        <w:bidi/>
+        <w:spacing w:line="276" w:lineRule="auto"/>
+        <w:rPr>
+          <w:rFonts w:ascii="David" w:hAnsi="David" w:cs="David"/>
+          <w:rtl/>
+        </w:rPr>
+      </w:pPr>
+    </w:p>
+    <w:p>
+      <w:pPr>
+        <w:bidi/>
+        <w:spacing w:line="276" w:lineRule="auto"/>
+        <w:rPr>
+          <w:rFonts w:ascii="David" w:hAnsi="David" w:cs="David"/>
+          <w:rtl/>
+        </w:rPr>
+      </w:pPr>
+    </w:p>
+    <w:p>
+      <w:pPr>
+        <w:bidi/>
+        <w:spacing w:line="276" w:lineRule="auto"/>
+        <w:rPr>
+          <w:rFonts w:ascii="David" w:hAnsi="David" w:cs="David"/>
+          <w:rtl/>
+        </w:rPr>
+      </w:pPr>
+    </w:p>
+    <w:p>
+      <w:pPr>
+        <w:bidi/>
+        <w:spacing w:line="276" w:lineRule="auto"/>
+        <w:rPr>
+          <w:rFonts w:ascii="David" w:hAnsi="David" w:cs="David"/>
+          <w:rtl/>
+        </w:rPr>
+      </w:pPr>
+    </w:p>
+    <w:p>
+      <w:pPr>
+        <w:bidi/>
+        <w:spacing w:line="276" w:lineRule="auto"/>
+        <w:rPr>
+          <w:rFonts w:ascii="David" w:hAnsi="David" w:cs="David"/>
+          <w:rtl/>
+        </w:rPr>
+      </w:pPr>
+    </w:p>
+    <w:p>
+      <w:pPr>
+        <w:bidi/>
+        <w:spacing w:line="276" w:lineRule="auto"/>
+        <w:rPr>
+          <w:rFonts w:ascii="David" w:hAnsi="David" w:cs="David"/>
+          <w:rtl/>
+        </w:rPr>
+      </w:pPr>
+    </w:p>
+    <w:p>
+      <w:pPr>
+        <w:bidi/>
+        <w:spacing w:line="276" w:lineRule="auto"/>
+        <w:rPr>
+          <w:rFonts w:ascii="David" w:hAnsi="David" w:cs="David"/>
+          <w:rtl/>
+        </w:rPr>
+      </w:pPr>
+    </w:p>
+    <w:p>
+      <w:pPr>
+        <w:bidi/>
+        <w:spacing w:line="276" w:lineRule="auto"/>
+        <w:rPr>
+          <w:rFonts w:ascii="David" w:hAnsi="David" w:cs="David"/>
+          <w:rtl/>
+        </w:rPr>
+      </w:pPr>
+    </w:p>
+    <w:p>
+      <w:pPr>
+        <w:bidi/>
+        <w:spacing w:line="276" w:lineRule="auto"/>
+        <w:rPr>
+          <w:rFonts w:ascii="David" w:hAnsi="David" w:cs="David" w:hint="cs"/>
+          <w:rtl/>
+        </w:rPr>
+      </w:pPr>
+      <w:r>
+        <w:rPr>
+          <w:rFonts w:ascii="David" w:hAnsi="David" w:cs="David" w:hint="cs"/>
+          <w:b/>
+          <w:bCs/>
+          <w:sz w:val="32"/>
+          <w:szCs w:val="32"/>
+          <w:u w:val="single"/>
+          <w:rtl/>
+        </w:rPr>
+        <w:lastRenderedPageBreak/>
+        <w:t>תרשים זרימה - צד שרת</w:t>
+      </w:r>
+      <w:r>
+        <w:rPr>
+          <w:rFonts w:ascii="David" w:hAnsi="David" w:cs="David"/>
+          <w:b/>
+          <w:bCs/>
+          <w:noProof/>
+          <w:sz w:val="32"/>
+          <w:szCs w:val="32"/>
+          <w:u w:val="single"/>
+        </w:rPr>
+        <w:drawing>
+          <wp:inline distT="0" distB="0" distL="0" distR="0" wp14:anchorId="11FC61A6" wp14:editId="1A3AD414">
+            <wp:extent cx="5937250" cy="6235700"/>
+            <wp:effectExtent l="0" t="0" r="6350" b="0"/>
+            <wp:docPr id="582266895" name="Picture 3"/>
+            <wp:cNvGraphicFramePr>
+              <a:graphicFrameLocks xmlns:a="http://schemas.openxmlformats.org/drawingml/2006/main" noChangeAspect="1"/>
+            </wp:cNvGraphicFramePr>
+            <a:graphic xmlns:a="http://schemas.openxmlformats.org/drawingml/2006/main">
+              <a:graphicData uri="http://schemas.openxmlformats.org/drawingml/2006/picture">
+                <pic:pic xmlns:pic="http://schemas.openxmlformats.org/drawingml/2006/picture">
+                  <pic:nvPicPr>
+                    <pic:cNvPr id="0" name="Picture 3"/>
+                    <pic:cNvPicPr>
+                      <a:picLocks noChangeAspect="1" noChangeArrowheads="1"/>
+                    </pic:cNvPicPr>
+                  </pic:nvPicPr>
+                  <pic:blipFill>
+                    <a:blip r:embed="rId11">
+                      <a:extLst>
+                        <a:ext uri="{28A0092B-C50C-407E-A947-70E740481C1C}">
+                          <a14:useLocalDpi xmlns:a14="http://schemas.microsoft.com/office/drawing/2010/main" val="0"/>
+                        </a:ext>
+                      </a:extLst>
+                    </a:blip>
+                    <a:srcRect/>
+                    <a:stretch>
+                      <a:fillRect/>
+                    </a:stretch>
+                  </pic:blipFill>
+                  <pic:spPr bwMode="auto">
+                    <a:xfrm>
+                      <a:off x="0" y="0"/>
+                      <a:ext cx="5937250" cy="6235700"/>
+                    </a:xfrm>
+                    <a:prstGeom prst="rect">
+                      <a:avLst/>
+                    </a:prstGeom>
+                    <a:noFill/>
+                    <a:ln>
+                      <a:noFill/>
+                    </a:ln>
+                  </pic:spPr>
+                </pic:pic>
+              </a:graphicData>
+            </a:graphic>
+          </wp:inline>
+        </w:drawing>
       </w:r>
     </w:p>
     <w:sectPr>
@@ -11943,6 +12585,56 @@
     </w:sectPr>
   </w:body>
 </w:document>
+</file>
+
+<file path=word/endnotes.xml><?xml version="1.0" encoding="utf-8"?>
+<w:endnotes xmlns:wpc="http://schemas.microsoft.com/office/word/2010/wordprocessingCanvas" xmlns:cx="http://schemas.microsoft.com/office/drawing/2014/chartex" xmlns:cx1="http://schemas.microsoft.com/office/drawing/2015/9/8/chartex" xmlns:cx2="http://schemas.microsoft.com/office/drawing/2015/10/21/chartex" xmlns:cx3="http://schemas.microsoft.com/office/drawing/2016/5/9/chartex" xmlns:cx4="http://schemas.microsoft.com/office/drawing/2016/5/10/chartex" xmlns:cx5="http://schemas.microsoft.com/office/drawing/2016/5/11/chartex" xmlns:cx6="http://schemas.microsoft.com/office/drawing/2016/5/12/chartex" xmlns:cx7="http://schemas.microsoft.com/office/drawing/2016/5/13/chartex" xmlns:cx8="http://schemas.microsoft.com/office/drawing/2016/5/14/chartex" xmlns:mc="http://schemas.openxmlformats.org/markup-compatibility/2006" xmlns:aink="http://schemas.microsoft.com/office/drawing/2016/ink" xmlns:am3d="http://schemas.microsoft.com/office/drawing/2017/model3d" xmlns:o="urn:schemas-microsoft-com:office:office" xmlns:oel="http://schemas.microsoft.com/office/2019/extlst" xmlns:r="http://schemas.openxmlformats.org/officeDocument/2006/relationships" xmlns:m="http://schemas.openxmlformats.org/officeDocument/2006/math" xmlns:v="urn:schemas-microsoft-com:vml" xmlns:wp14="http://schemas.microsoft.com/office/word/2010/wordprocessingDrawing" xmlns:wp="http://schemas.openxmlformats.org/drawingml/2006/wordprocessingDrawing" xmlns:w10="urn:schemas-microsoft-com:office:word" xmlns:w="http://schemas.openxmlformats.org/wordprocessingml/2006/main" xmlns:w14="http://schemas.microsoft.com/office/word/2010/wordml" xmlns:w15="http://schemas.microsoft.com/office/word/2012/wordml" xmlns:w16cex="http://schemas.microsoft.com/office/word/2018/wordml/cex" xmlns:w16cid="http://schemas.microsoft.com/office/word/2016/wordml/cid" xmlns:w16="http://schemas.microsoft.com/office/word/2018/wordml" xmlns:w16du="http://schemas.microsoft.com/office/word/2023/wordml/word16du" xmlns:w16sdtdh="http://schemas.microsoft.com/office/word/2020/wordml/sdtdatahash" xmlns:w16sdtfl="http://schemas.microsoft.com/office/word/2024/wordml/sdtformatlock" xmlns:w16se="http://schemas.microsoft.com/office/word/2015/wordml/symex" xmlns:wpg="http://schemas.microsoft.com/office/word/2010/wordprocessingGroup" xmlns:wpi="http://schemas.microsoft.com/office/word/2010/wordprocessingInk" xmlns:wne="http://schemas.microsoft.com/office/word/2006/wordml" xmlns:wps="http://schemas.microsoft.com/office/word/2010/wordprocessingShape" mc:Ignorable="w14 w15 w16se w16cid w16 w16cex w16sdtdh w16sdtfl w16du wp14">
+  <w:endnote w:type="separator" w:id="-1">
+    <w:p>
+      <w:pPr>
+        <w:spacing w:after="0" w:line="240" w:lineRule="auto"/>
+      </w:pPr>
+      <w:r>
+        <w:separator/>
+      </w:r>
+    </w:p>
+  </w:endnote>
+  <w:endnote w:type="continuationSeparator" w:id="0">
+    <w:p>
+      <w:pPr>
+        <w:spacing w:after="0" w:line="240" w:lineRule="auto"/>
+      </w:pPr>
+      <w:r>
+        <w:continuationSeparator/>
+      </w:r>
+    </w:p>
+  </w:endnote>
+</w:endnotes>
+</file>
+
+<file path=word/footnotes.xml><?xml version="1.0" encoding="utf-8"?>
+<w:footnotes xmlns:wpc="http://schemas.microsoft.com/office/word/2010/wordprocessingCanvas" xmlns:cx="http://schemas.microsoft.com/office/drawing/2014/chartex" xmlns:cx1="http://schemas.microsoft.com/office/drawing/2015/9/8/chartex" xmlns:cx2="http://schemas.microsoft.com/office/drawing/2015/10/21/chartex" xmlns:cx3="http://schemas.microsoft.com/office/drawing/2016/5/9/chartex" xmlns:cx4="http://schemas.microsoft.com/office/drawing/2016/5/10/chartex" xmlns:cx5="http://schemas.microsoft.com/office/drawing/2016/5/11/chartex" xmlns:cx6="http://schemas.microsoft.com/office/drawing/2016/5/12/chartex" xmlns:cx7="http://schemas.microsoft.com/office/drawing/2016/5/13/chartex" xmlns:cx8="http://schemas.microsoft.com/office/drawing/2016/5/14/chartex" xmlns:mc="http://schemas.openxmlformats.org/markup-compatibility/2006" xmlns:aink="http://schemas.microsoft.com/office/drawing/2016/ink" xmlns:am3d="http://schemas.microsoft.com/office/drawing/2017/model3d" xmlns:o="urn:schemas-microsoft-com:office:office" xmlns:oel="http://schemas.microsoft.com/office/2019/extlst" xmlns:r="http://schemas.openxmlformats.org/officeDocument/2006/relationships" xmlns:m="http://schemas.openxmlformats.org/officeDocument/2006/math" xmlns:v="urn:schemas-microsoft-com:vml" xmlns:wp14="http://schemas.microsoft.com/office/word/2010/wordprocessingDrawing" xmlns:wp="http://schemas.openxmlformats.org/drawingml/2006/wordprocessingDrawing" xmlns:w10="urn:schemas-microsoft-com:office:word" xmlns:w="http://schemas.openxmlformats.org/wordprocessingml/2006/main" xmlns:w14="http://schemas.microsoft.com/office/word/2010/wordml" xmlns:w15="http://schemas.microsoft.com/office/word/2012/wordml" xmlns:w16cex="http://schemas.microsoft.com/office/word/2018/wordml/cex" xmlns:w16cid="http://schemas.microsoft.com/office/word/2016/wordml/cid" xmlns:w16="http://schemas.microsoft.com/office/word/2018/wordml" xmlns:w16du="http://schemas.microsoft.com/office/word/2023/wordml/word16du" xmlns:w16sdtdh="http://schemas.microsoft.com/office/word/2020/wordml/sdtdatahash" xmlns:w16sdtfl="http://schemas.microsoft.com/office/word/2024/wordml/sdtformatlock" xmlns:w16se="http://schemas.microsoft.com/office/word/2015/wordml/symex" xmlns:wpg="http://schemas.microsoft.com/office/word/2010/wordprocessingGroup" xmlns:wpi="http://schemas.microsoft.com/office/word/2010/wordprocessingInk" xmlns:wne="http://schemas.microsoft.com/office/word/2006/wordml" xmlns:wps="http://schemas.microsoft.com/office/word/2010/wordprocessingShape" mc:Ignorable="w14 w15 w16se w16cid w16 w16cex w16sdtdh w16sdtfl w16du wp14">
+  <w:footnote w:type="separator" w:id="-1">
+    <w:p>
+      <w:pPr>
+        <w:spacing w:after="0" w:line="240" w:lineRule="auto"/>
+      </w:pPr>
+      <w:r>
+        <w:separator/>
+      </w:r>
+    </w:p>
+  </w:footnote>
+  <w:footnote w:type="continuationSeparator" w:id="0">
+    <w:p>
+      <w:pPr>
+        <w:spacing w:after="0" w:line="240" w:lineRule="auto"/>
+      </w:pPr>
+      <w:r>
+        <w:continuationSeparator/>
+      </w:r>
+    </w:p>
+  </w:footnote>
+</w:footnotes>
 </file>
 
 <file path=word/numbering.xml><?xml version="1.0" encoding="utf-8"?>
@@ -14124,7 +14816,7 @@
   <w:style w:type="paragraph" w:default="1" w:styleId="Normal">
     <w:name w:val="Normal"/>
     <w:qFormat/>
-    <w:rsid w:val="00E74949"/>
+    <w:rsid w:val="00222CC4"/>
   </w:style>
   <w:style w:type="paragraph" w:styleId="Heading1">
     <w:name w:val="heading 1"/>
@@ -14642,6 +15334,50 @@
       <w:spacing w:val="5"/>
     </w:rPr>
   </w:style>
+  <w:style w:type="paragraph" w:styleId="Header">
+    <w:name w:val="header"/>
+    <w:basedOn w:val="Normal"/>
+    <w:link w:val="HeaderChar"/>
+    <w:uiPriority w:val="99"/>
+    <w:unhideWhenUsed/>
+    <w:rsid w:val="0065187E"/>
+    <w:pPr>
+      <w:tabs>
+        <w:tab w:val="center" w:pos="4680"/>
+        <w:tab w:val="right" w:pos="9360"/>
+      </w:tabs>
+      <w:spacing w:after="0" w:line="240" w:lineRule="auto"/>
+    </w:pPr>
+  </w:style>
+  <w:style w:type="character" w:customStyle="1" w:styleId="HeaderChar">
+    <w:name w:val="Header Char"/>
+    <w:basedOn w:val="DefaultParagraphFont"/>
+    <w:link w:val="Header"/>
+    <w:uiPriority w:val="99"/>
+    <w:rsid w:val="0065187E"/>
+  </w:style>
+  <w:style w:type="paragraph" w:styleId="Footer">
+    <w:name w:val="footer"/>
+    <w:basedOn w:val="Normal"/>
+    <w:link w:val="FooterChar"/>
+    <w:uiPriority w:val="99"/>
+    <w:unhideWhenUsed/>
+    <w:rsid w:val="0065187E"/>
+    <w:pPr>
+      <w:tabs>
+        <w:tab w:val="center" w:pos="4680"/>
+        <w:tab w:val="right" w:pos="9360"/>
+      </w:tabs>
+      <w:spacing w:after="0" w:line="240" w:lineRule="auto"/>
+    </w:pPr>
+  </w:style>
+  <w:style w:type="character" w:customStyle="1" w:styleId="FooterChar">
+    <w:name w:val="Footer Char"/>
+    <w:basedOn w:val="DefaultParagraphFont"/>
+    <w:link w:val="Footer"/>
+    <w:uiPriority w:val="99"/>
+    <w:rsid w:val="0065187E"/>
+  </w:style>
 </w:styles>
 </file>
 

</xml_diff>

<commit_message>
planning - add cache
</commit_message>
<xml_diff>
--- a/planning.docx
+++ b/planning.docx
@@ -5164,6 +5164,62 @@
         <w:rPr>
           <w:rFonts w:ascii="David" w:hAnsi="David" w:cs="David"/>
         </w:rPr>
+        <w:t>CacheConfig</w:t>
+      </w:r>
+      <w:proofErr w:type="spellEnd"/>
+      <w:r>
+        <w:rPr>
+          <w:rFonts w:ascii="David" w:hAnsi="David" w:cs="David" w:hint="cs"/>
+          <w:rtl/>
+        </w:rPr>
+        <w:t xml:space="preserve"> </w:t>
+      </w:r>
+      <w:r>
+        <w:rPr>
+          <w:rFonts w:ascii="David" w:hAnsi="David" w:cs="David"/>
+          <w:rtl/>
+        </w:rPr>
+        <w:t>–</w:t>
+      </w:r>
+      <w:r>
+        <w:rPr>
+          <w:rFonts w:ascii="David" w:hAnsi="David" w:cs="David" w:hint="cs"/>
+          <w:rtl/>
+        </w:rPr>
+        <w:t xml:space="preserve"> כוללת קונפיגורציה עבור </w:t>
+      </w:r>
+      <w:r>
+        <w:rPr>
+          <w:rFonts w:ascii="David" w:hAnsi="David" w:cs="David"/>
+        </w:rPr>
+        <w:t>CACHING</w:t>
+      </w:r>
+      <w:r>
+        <w:rPr>
+          <w:rFonts w:ascii="David" w:hAnsi="David" w:cs="David" w:hint="cs"/>
+          <w:rtl/>
+        </w:rPr>
+        <w:t>.</w:t>
+      </w:r>
+    </w:p>
+    <w:p>
+      <w:pPr>
+        <w:pStyle w:val="ListParagraph"/>
+        <w:numPr>
+          <w:ilvl w:val="0"/>
+          <w:numId w:val="8"/>
+        </w:numPr>
+        <w:bidi/>
+        <w:spacing w:line="276" w:lineRule="auto"/>
+        <w:rPr>
+          <w:rFonts w:ascii="David" w:hAnsi="David" w:cs="David"/>
+        </w:rPr>
+      </w:pPr>
+      <w:proofErr w:type="spellStart"/>
+      <w:r>
+        <w:rPr>
+          <w:rFonts w:ascii="David" w:hAnsi="David" w:cs="David"/>
+        </w:rPr>
         <w:t>WebMvcConfig</w:t>
       </w:r>
       <w:proofErr w:type="spellEnd"/>
@@ -6704,6 +6760,7 @@
         <w:rPr>
           <w:rFonts w:ascii="David" w:hAnsi="David" w:cs="David"/>
         </w:rPr>
+        <w:lastRenderedPageBreak/>
         <w:t>CartService</w:t>
       </w:r>
       <w:proofErr w:type="spellEnd"/>
@@ -6740,15 +6797,7 @@
           <w:rFonts w:ascii="David" w:hAnsi="David" w:cs="David" w:hint="cs"/>
           <w:rtl/>
         </w:rPr>
-        <w:t xml:space="preserve"> בעצם מעדכן את הגרסאות של כלל המוצרים בסל אל הגרסא </w:t>
-      </w:r>
-      <w:r>
-        <w:rPr>
-          <w:rFonts w:ascii="David" w:hAnsi="David" w:cs="David" w:hint="cs"/>
-          <w:rtl/>
-        </w:rPr>
-        <w:lastRenderedPageBreak/>
-        <w:t xml:space="preserve">העדכנית </w:t>
+        <w:t xml:space="preserve"> בעצם מעדכן את הגרסאות של כלל המוצרים בסל אל הגרסא העדכנית </w:t>
       </w:r>
       <w:r>
         <w:rPr>
@@ -7746,18 +7795,6 @@
     </w:p>
     <w:p>
       <w:pPr>
-        <w:pStyle w:val="ListParagraph"/>
-        <w:bidi/>
-        <w:spacing w:line="276" w:lineRule="auto"/>
-        <w:rPr>
-          <w:rFonts w:ascii="David" w:hAnsi="David" w:cs="David"/>
-          <w:rtl/>
-        </w:rPr>
-      </w:pPr>
-    </w:p>
-    <w:p>
-      <w:pPr>
-        <w:pStyle w:val="ListParagraph"/>
         <w:bidi/>
         <w:spacing w:line="276" w:lineRule="auto"/>
         <w:rPr>
@@ -8055,15 +8092,6 @@
         </w:rPr>
         <w:t>.</w:t>
       </w:r>
-    </w:p>
-    <w:p>
-      <w:pPr>
-        <w:bidi/>
-        <w:spacing w:line="276" w:lineRule="auto"/>
-        <w:rPr>
-          <w:rFonts w:ascii="David" w:hAnsi="David" w:cs="David"/>
-        </w:rPr>
-      </w:pPr>
     </w:p>
     <w:p>
       <w:pPr>
@@ -12500,7 +12528,7 @@
         <w:bidi/>
         <w:spacing w:line="276" w:lineRule="auto"/>
         <w:rPr>
-          <w:rFonts w:ascii="David" w:hAnsi="David" w:cs="David" w:hint="cs"/>
+          <w:rFonts w:ascii="David" w:hAnsi="David" w:cs="David"/>
           <w:rtl/>
         </w:rPr>
       </w:pPr>

</xml_diff>

<commit_message>
add sales dashborad screen
</commit_message>
<xml_diff>
--- a/planning.docx
+++ b/planning.docx
@@ -4294,7 +4294,6 @@
           <w:rFonts w:ascii="David" w:hAnsi="David" w:cs="David"/>
         </w:rPr>
       </w:pPr>
-      <w:proofErr w:type="gramStart"/>
       <w:r>
         <w:rPr>
           <w:rFonts w:ascii="David" w:hAnsi="David" w:cs="David"/>
@@ -4306,14 +4305,7 @@
         <w:rPr>
           <w:rFonts w:ascii="David" w:hAnsi="David" w:cs="David"/>
         </w:rPr>
-        <w:t>env</w:t>
-      </w:r>
-      <w:proofErr w:type="gramEnd"/>
-      <w:r>
-        <w:rPr>
-          <w:rFonts w:ascii="David" w:hAnsi="David" w:cs="David"/>
-        </w:rPr>
-        <w:t>.example</w:t>
+        <w:t>env.example</w:t>
       </w:r>
       <w:proofErr w:type="spellEnd"/>
       <w:r>
@@ -5255,41 +5247,26 @@
           <w:rFonts w:ascii="David" w:hAnsi="David" w:cs="David" w:hint="cs"/>
           <w:rtl/>
         </w:rPr>
-        <w:t xml:space="preserve"> </w:t>
-      </w:r>
-      <w:proofErr w:type="gramStart"/>
-      <w:r>
-        <w:rPr>
-          <w:rFonts w:ascii="David" w:hAnsi="David" w:cs="David" w:hint="cs"/>
-          <w:rtl/>
-        </w:rPr>
-        <w:t>+</w:t>
-      </w:r>
-      <w:r>
-        <w:rPr>
-          <w:rFonts w:ascii="David" w:hAnsi="David" w:cs="David"/>
-        </w:rPr>
-        <w:t xml:space="preserve"> </w:t>
-      </w:r>
-      <w:r>
-        <w:rPr>
-          <w:rFonts w:ascii="David" w:hAnsi="David" w:cs="David" w:hint="cs"/>
-          <w:rtl/>
-        </w:rPr>
-        <w:t xml:space="preserve"> </w:t>
-      </w:r>
-      <w:r>
-        <w:rPr>
-          <w:rFonts w:ascii="David" w:hAnsi="David" w:cs="David"/>
-        </w:rPr>
-        <w:t>RESOURCE</w:t>
-      </w:r>
-      <w:proofErr w:type="gramEnd"/>
-      <w:r>
-        <w:rPr>
-          <w:rFonts w:ascii="David" w:hAnsi="David" w:cs="David"/>
-        </w:rPr>
-        <w:t xml:space="preserve"> HANDLER</w:t>
+        <w:t xml:space="preserve"> +</w:t>
+      </w:r>
+      <w:r>
+        <w:rPr>
+          <w:rFonts w:ascii="David" w:hAnsi="David" w:cs="David"/>
+        </w:rPr>
+        <w:t xml:space="preserve"> </w:t>
+      </w:r>
+      <w:r>
+        <w:rPr>
+          <w:rFonts w:ascii="David" w:hAnsi="David" w:cs="David" w:hint="cs"/>
+          <w:rtl/>
+        </w:rPr>
+        <w:t xml:space="preserve"> </w:t>
+      </w:r>
+      <w:r>
+        <w:rPr>
+          <w:rFonts w:ascii="David" w:hAnsi="David" w:cs="David"/>
+        </w:rPr>
+        <w:t>RESOURCE HANDLER</w:t>
       </w:r>
       <w:r>
         <w:rPr>
@@ -7714,6 +7691,76 @@
     </w:p>
     <w:p>
       <w:pPr>
+        <w:pStyle w:val="ListParagraph"/>
+        <w:numPr>
+          <w:ilvl w:val="0"/>
+          <w:numId w:val="11"/>
+        </w:numPr>
+        <w:bidi/>
+        <w:spacing w:line="276" w:lineRule="auto"/>
+        <w:rPr>
+          <w:rFonts w:ascii="David" w:hAnsi="David" w:cs="David"/>
+        </w:rPr>
+      </w:pPr>
+      <w:proofErr w:type="spellStart"/>
+      <w:r>
+        <w:rPr>
+          <w:rFonts w:ascii="David" w:hAnsi="David" w:cs="David"/>
+        </w:rPr>
+        <w:t>SalesService</w:t>
+      </w:r>
+      <w:proofErr w:type="spellEnd"/>
+      <w:r>
+        <w:rPr>
+          <w:rFonts w:ascii="David" w:hAnsi="David" w:cs="David" w:hint="cs"/>
+          <w:rtl/>
+        </w:rPr>
+        <w:t xml:space="preserve"> </w:t>
+      </w:r>
+      <w:r>
+        <w:rPr>
+          <w:rFonts w:ascii="David" w:hAnsi="David" w:cs="David"/>
+          <w:rtl/>
+        </w:rPr>
+        <w:t>–</w:t>
+      </w:r>
+      <w:r>
+        <w:rPr>
+          <w:rFonts w:ascii="David" w:hAnsi="David" w:cs="David" w:hint="cs"/>
+          <w:rtl/>
+        </w:rPr>
+        <w:t xml:space="preserve"> מכילה טיפול בנושא ה</w:t>
+      </w:r>
+      <w:r>
+        <w:rPr>
+          <w:rFonts w:ascii="David" w:hAnsi="David" w:cs="David"/>
+        </w:rPr>
+        <w:t>DASHBOARD</w:t>
+      </w:r>
+      <w:r>
+        <w:rPr>
+          <w:rFonts w:ascii="David" w:hAnsi="David" w:cs="David" w:hint="cs"/>
+          <w:rtl/>
+        </w:rPr>
+        <w:t xml:space="preserve"> </w:t>
+      </w:r>
+      <w:r>
+        <w:rPr>
+          <w:rFonts w:ascii="David" w:hAnsi="David" w:cs="David"/>
+          <w:rtl/>
+        </w:rPr>
+        <w:t>–</w:t>
+      </w:r>
+      <w:r>
+        <w:rPr>
+          <w:rFonts w:ascii="David" w:hAnsi="David" w:cs="David" w:hint="cs"/>
+          <w:rtl/>
+        </w:rPr>
+        <w:t xml:space="preserve"> סיכום נתונים לגבי מכירות, הזמנות, מוצרים נמכרים וכדומה בטווח תאריכים נבחר.</w:t>
+      </w:r>
+    </w:p>
+    <w:p>
+      <w:pPr>
         <w:bidi/>
         <w:spacing w:line="276" w:lineRule="auto"/>
         <w:rPr>
@@ -7782,7 +7829,6 @@
         <w:spacing w:line="276" w:lineRule="auto"/>
         <w:rPr>
           <w:rFonts w:ascii="David" w:hAnsi="David" w:cs="David"/>
-          <w:rtl/>
         </w:rPr>
       </w:pPr>
       <w:r>
@@ -7792,25 +7838,6 @@
         </w:rPr>
         <w:t>מכילה את המתודה שמריצה את הפרוייקט.</w:t>
       </w:r>
-    </w:p>
-    <w:p>
-      <w:pPr>
-        <w:bidi/>
-        <w:spacing w:line="276" w:lineRule="auto"/>
-        <w:rPr>
-          <w:rFonts w:ascii="David" w:hAnsi="David" w:cs="David"/>
-          <w:rtl/>
-        </w:rPr>
-      </w:pPr>
-    </w:p>
-    <w:p>
-      <w:pPr>
-        <w:bidi/>
-        <w:spacing w:line="276" w:lineRule="auto"/>
-        <w:rPr>
-          <w:rFonts w:ascii="David" w:hAnsi="David" w:cs="David"/>
-        </w:rPr>
-      </w:pPr>
     </w:p>
     <w:p>
       <w:pPr>
@@ -8152,7 +8179,6 @@
         </w:rPr>
       </w:pPr>
       <w:proofErr w:type="spellStart"/>
-      <w:proofErr w:type="gramStart"/>
       <w:r>
         <w:rPr>
           <w:rFonts w:ascii="David" w:hAnsi="David" w:cs="David"/>
@@ -8160,7 +8186,6 @@
         <w:t>package.json</w:t>
       </w:r>
       <w:proofErr w:type="spellEnd"/>
-      <w:proofErr w:type="gramEnd"/>
       <w:r>
         <w:rPr>
           <w:rFonts w:ascii="David" w:hAnsi="David" w:cs="David"/>
@@ -8168,7 +8193,6 @@
         <w:t xml:space="preserve"> + package-</w:t>
       </w:r>
       <w:proofErr w:type="spellStart"/>
-      <w:proofErr w:type="gramStart"/>
       <w:r>
         <w:rPr>
           <w:rFonts w:ascii="David" w:hAnsi="David" w:cs="David"/>
@@ -8176,7 +8200,6 @@
         <w:t>lock.json</w:t>
       </w:r>
       <w:proofErr w:type="spellEnd"/>
-      <w:proofErr w:type="gramEnd"/>
       <w:r>
         <w:rPr>
           <w:rFonts w:ascii="David" w:hAnsi="David" w:cs="David" w:hint="cs"/>
@@ -8455,7 +8478,6 @@
           <w:rFonts w:ascii="David" w:hAnsi="David" w:cs="David"/>
         </w:rPr>
       </w:pPr>
-      <w:proofErr w:type="gramStart"/>
       <w:r>
         <w:rPr>
           <w:rFonts w:ascii="David" w:hAnsi="David" w:cs="David"/>
@@ -8467,14 +8489,7 @@
         <w:rPr>
           <w:rFonts w:ascii="David" w:hAnsi="David" w:cs="David"/>
         </w:rPr>
-        <w:t>env</w:t>
-      </w:r>
-      <w:proofErr w:type="gramEnd"/>
-      <w:r>
-        <w:rPr>
-          <w:rFonts w:ascii="David" w:hAnsi="David" w:cs="David"/>
-        </w:rPr>
-        <w:t>.example</w:t>
+        <w:t>env.example</w:t>
       </w:r>
       <w:proofErr w:type="spellEnd"/>
       <w:r>
@@ -10321,6 +10336,46 @@
     <w:p>
       <w:pPr>
         <w:pStyle w:val="ListParagraph"/>
+        <w:numPr>
+          <w:ilvl w:val="1"/>
+          <w:numId w:val="17"/>
+        </w:numPr>
+        <w:bidi/>
+        <w:spacing w:line="276" w:lineRule="auto"/>
+        <w:rPr>
+          <w:rFonts w:ascii="David" w:hAnsi="David" w:cs="David"/>
+        </w:rPr>
+      </w:pPr>
+      <w:r>
+        <w:rPr>
+          <w:rFonts w:ascii="David" w:hAnsi="David" w:cs="David"/>
+        </w:rPr>
+        <w:t>sales</w:t>
+      </w:r>
+      <w:r>
+        <w:rPr>
+          <w:rFonts w:ascii="David" w:hAnsi="David" w:cs="David" w:hint="cs"/>
+          <w:rtl/>
+        </w:rPr>
+        <w:t>: מכיל את כל הדברים הרלוונטים לגבי מסך המכירות (</w:t>
+      </w:r>
+      <w:r>
+        <w:rPr>
+          <w:rFonts w:ascii="David" w:hAnsi="David" w:cs="David"/>
+        </w:rPr>
+        <w:t>DASHBOARD</w:t>
+      </w:r>
+      <w:r>
+        <w:rPr>
+          <w:rFonts w:ascii="David" w:hAnsi="David" w:cs="David" w:hint="cs"/>
+          <w:rtl/>
+        </w:rPr>
+        <w:t>): נתוני מכירות לפי פילוח סטטוס הזמנה, כמות מכירות, מוצרים הכי נמכרים, רווח כספי, אחוזי ביטול, ועוד.</w:t>
+      </w:r>
+    </w:p>
+    <w:p>
+      <w:pPr>
+        <w:pStyle w:val="ListParagraph"/>
         <w:bidi/>
         <w:spacing w:line="276" w:lineRule="auto"/>
         <w:ind w:left="1080"/>
@@ -10749,25 +10804,7 @@
         <w:spacing w:line="276" w:lineRule="auto"/>
         <w:rPr>
           <w:rFonts w:ascii="David" w:hAnsi="David" w:cs="David"/>
-        </w:rPr>
-      </w:pPr>
-    </w:p>
-    <w:p>
-      <w:pPr>
-        <w:bidi/>
-        <w:spacing w:line="276" w:lineRule="auto"/>
-        <w:rPr>
-          <w:rFonts w:ascii="David" w:hAnsi="David" w:cs="David"/>
-          <w:rtl/>
-        </w:rPr>
-      </w:pPr>
-    </w:p>
-    <w:p>
-      <w:pPr>
-        <w:bidi/>
-        <w:spacing w:line="276" w:lineRule="auto"/>
-        <w:rPr>
-          <w:rFonts w:ascii="David" w:hAnsi="David" w:cs="David"/>
+          <w:rtl/>
         </w:rPr>
       </w:pPr>
     </w:p>
@@ -10822,7 +10859,6 @@
           <w:bCs/>
         </w:rPr>
       </w:pPr>
-      <w:proofErr w:type="gramStart"/>
       <w:r>
         <w:rPr>
           <w:rFonts w:ascii="David" w:hAnsi="David" w:cs="David"/>
@@ -10838,16 +10874,7 @@
           <w:b/>
           <w:bCs/>
         </w:rPr>
-        <w:t>env</w:t>
-      </w:r>
-      <w:proofErr w:type="gramEnd"/>
-      <w:r>
-        <w:rPr>
-          <w:rFonts w:ascii="David" w:hAnsi="David" w:cs="David"/>
-          <w:b/>
-          <w:bCs/>
-        </w:rPr>
-        <w:t>.prod.db.example</w:t>
+        <w:t>env.prod.db.example</w:t>
       </w:r>
       <w:proofErr w:type="spellEnd"/>
       <w:r>
@@ -11982,6 +12009,28 @@
           <w:sz w:val="32"/>
           <w:szCs w:val="32"/>
           <w:u w:val="single"/>
+          <w:rtl/>
+        </w:rPr>
+        <w:sectPr>
+          <w:pgSz w:w="12240" w:h="15840"/>
+          <w:pgMar w:top="1440" w:right="1440" w:bottom="1440" w:left="1440" w:header="720" w:footer="720" w:gutter="0"/>
+          <w:cols w:space="720"/>
+          <w:docGrid w:linePitch="360"/>
+        </w:sectPr>
+      </w:pPr>
+    </w:p>
+    <w:p>
+      <w:pPr>
+        <w:bidi/>
+        <w:spacing w:line="276" w:lineRule="auto"/>
+        <w:rPr>
+          <w:rFonts w:ascii="David" w:hAnsi="David" w:cs="David"/>
+          <w:b/>
+          <w:bCs/>
+          <w:sz w:val="32"/>
+          <w:szCs w:val="32"/>
+          <w:u w:val="single"/>
+          <w:rtl/>
         </w:rPr>
       </w:pPr>
       <w:r>
@@ -11991,47 +12040,45 @@
         </w:rPr>
         <w:lastRenderedPageBreak/>
         <w:drawing>
-          <wp:anchor distT="0" distB="0" distL="114300" distR="114300" simplePos="0" relativeHeight="251659264" behindDoc="1" locked="0" layoutInCell="1" allowOverlap="1" wp14:anchorId="5A803DE8" wp14:editId="7847C2F3">
+          <wp:anchor distT="0" distB="0" distL="114300" distR="114300" simplePos="0" relativeHeight="251661312" behindDoc="0" locked="0" layoutInCell="1" allowOverlap="1" wp14:anchorId="424DAA3B" wp14:editId="214DDC0B">
             <wp:simplePos x="0" y="0"/>
-            <wp:positionH relativeFrom="page">
-              <wp:align>right</wp:align>
+            <wp:positionH relativeFrom="margin">
+              <wp:align>center</wp:align>
             </wp:positionH>
             <wp:positionV relativeFrom="paragraph">
-              <wp:posOffset>266700</wp:posOffset>
+              <wp:posOffset>368300</wp:posOffset>
             </wp:positionV>
-            <wp:extent cx="7754620" cy="4038600"/>
-            <wp:effectExtent l="0" t="0" r="0" b="0"/>
-            <wp:wrapTight wrapText="bothSides">
+            <wp:extent cx="9614535" cy="5080000"/>
+            <wp:effectExtent l="0" t="0" r="5715" b="6350"/>
+            <wp:wrapThrough wrapText="bothSides">
               <wp:wrapPolygon edited="0">
-                <wp:start x="0" y="0"/>
-                <wp:lineTo x="0" y="1019"/>
-                <wp:lineTo x="10772" y="1834"/>
-                <wp:lineTo x="10772" y="3464"/>
-                <wp:lineTo x="0" y="4992"/>
-                <wp:lineTo x="0" y="7132"/>
-                <wp:lineTo x="849" y="8355"/>
-                <wp:lineTo x="0" y="8558"/>
-                <wp:lineTo x="0" y="13245"/>
-                <wp:lineTo x="637" y="13347"/>
-                <wp:lineTo x="637" y="21294"/>
-                <wp:lineTo x="902" y="21396"/>
-                <wp:lineTo x="8012" y="21498"/>
-                <wp:lineTo x="9021" y="21498"/>
-                <wp:lineTo x="16078" y="21396"/>
-                <wp:lineTo x="16556" y="21294"/>
-                <wp:lineTo x="16396" y="18136"/>
-                <wp:lineTo x="21543" y="17015"/>
-                <wp:lineTo x="21543" y="8558"/>
-                <wp:lineTo x="20694" y="8355"/>
-                <wp:lineTo x="21543" y="7132"/>
-                <wp:lineTo x="21543" y="4992"/>
-                <wp:lineTo x="10719" y="3464"/>
-                <wp:lineTo x="10719" y="1834"/>
-                <wp:lineTo x="3131" y="0"/>
-                <wp:lineTo x="0" y="0"/>
+                <wp:start x="0" y="81"/>
+                <wp:lineTo x="0" y="1053"/>
+                <wp:lineTo x="10785" y="1539"/>
+                <wp:lineTo x="10785" y="4131"/>
+                <wp:lineTo x="0" y="5022"/>
+                <wp:lineTo x="0" y="7128"/>
+                <wp:lineTo x="813" y="8019"/>
+                <wp:lineTo x="0" y="8586"/>
+                <wp:lineTo x="0" y="12231"/>
+                <wp:lineTo x="599" y="13203"/>
+                <wp:lineTo x="599" y="21384"/>
+                <wp:lineTo x="7361" y="21546"/>
+                <wp:lineTo x="8217" y="21546"/>
+                <wp:lineTo x="15065" y="21384"/>
+                <wp:lineTo x="15108" y="17172"/>
+                <wp:lineTo x="21570" y="17010"/>
+                <wp:lineTo x="21570" y="8586"/>
+                <wp:lineTo x="20757" y="8019"/>
+                <wp:lineTo x="21570" y="7128"/>
+                <wp:lineTo x="21570" y="5022"/>
+                <wp:lineTo x="10742" y="4131"/>
+                <wp:lineTo x="10742" y="1539"/>
+                <wp:lineTo x="2867" y="81"/>
+                <wp:lineTo x="0" y="81"/>
               </wp:wrapPolygon>
-            </wp:wrapTight>
-            <wp:docPr id="846761611" name="Picture 1"/>
+            </wp:wrapThrough>
+            <wp:docPr id="1899330564" name="Picture 5"/>
             <wp:cNvGraphicFramePr>
               <a:graphicFrameLocks xmlns:a="http://schemas.openxmlformats.org/drawingml/2006/main" noChangeAspect="1"/>
             </wp:cNvGraphicFramePr>
@@ -12060,7 +12107,7 @@
                   <pic:spPr bwMode="auto">
                     <a:xfrm>
                       <a:off x="0" y="0"/>
-                      <a:ext cx="7754620" cy="4038600"/>
+                      <a:ext cx="9614535" cy="5080000"/>
                     </a:xfrm>
                     <a:prstGeom prst="rect">
                       <a:avLst/>
@@ -12084,7 +12131,7 @@
       </w:r>
       <w:r>
         <w:rPr>
-          <w:rFonts w:ascii="David" w:hAnsi="David" w:cs="David" w:hint="cs"/>
+          <w:rFonts w:ascii="David" w:hAnsi="David" w:cs="David"/>
           <w:b/>
           <w:bCs/>
           <w:sz w:val="32"/>
@@ -12092,9 +12139,13 @@
           <w:u w:val="single"/>
           <w:rtl/>
         </w:rPr>
-        <w:t>תיאור</w:t>
-      </w:r>
-      <w:r>
+        <w:t>תיאור מעבר בין דפים</w:t>
+      </w:r>
+    </w:p>
+    <w:p>
+      <w:pPr>
+        <w:bidi/>
+        <w:spacing w:line="276" w:lineRule="auto"/>
         <w:rPr>
           <w:rFonts w:ascii="David" w:hAnsi="David" w:cs="David"/>
           <w:b/>
@@ -12102,204 +12153,112 @@
           <w:sz w:val="32"/>
           <w:szCs w:val="32"/>
           <w:u w:val="single"/>
-          <w:rtl/>
-        </w:rPr>
-        <w:t xml:space="preserve"> </w:t>
-      </w:r>
-      <w:r>
-        <w:rPr>
-          <w:rFonts w:ascii="David" w:hAnsi="David" w:cs="David" w:hint="cs"/>
+        </w:rPr>
+      </w:pPr>
+    </w:p>
+    <w:p>
+      <w:pPr>
+        <w:bidi/>
+        <w:spacing w:line="276" w:lineRule="auto"/>
+        <w:rPr>
+          <w:rFonts w:ascii="David" w:hAnsi="David" w:cs="David"/>
           <w:b/>
           <w:bCs/>
           <w:sz w:val="32"/>
           <w:szCs w:val="32"/>
           <w:u w:val="single"/>
-          <w:rtl/>
-        </w:rPr>
-        <w:t>מעבר בין דפים</w:t>
-      </w:r>
-    </w:p>
-    <w:p>
-      <w:pPr>
-        <w:bidi/>
-        <w:spacing w:line="276" w:lineRule="auto"/>
-        <w:rPr>
-          <w:rFonts w:ascii="David" w:hAnsi="David" w:cs="David"/>
-        </w:rPr>
-      </w:pPr>
-    </w:p>
-    <w:p>
-      <w:pPr>
-        <w:bidi/>
-        <w:spacing w:line="276" w:lineRule="auto"/>
-        <w:rPr>
-          <w:rFonts w:ascii="David" w:hAnsi="David" w:cs="David"/>
-        </w:rPr>
-      </w:pPr>
-    </w:p>
-    <w:p>
-      <w:pPr>
-        <w:bidi/>
-        <w:spacing w:line="276" w:lineRule="auto"/>
-        <w:rPr>
-          <w:rFonts w:ascii="David" w:hAnsi="David" w:cs="David"/>
-        </w:rPr>
-      </w:pPr>
-    </w:p>
-    <w:p>
-      <w:pPr>
-        <w:bidi/>
-        <w:spacing w:line="276" w:lineRule="auto"/>
-        <w:rPr>
-          <w:rFonts w:ascii="David" w:hAnsi="David" w:cs="David"/>
-        </w:rPr>
-      </w:pPr>
-    </w:p>
-    <w:p>
-      <w:pPr>
-        <w:bidi/>
-        <w:spacing w:line="276" w:lineRule="auto"/>
-        <w:rPr>
-          <w:rFonts w:ascii="David" w:hAnsi="David" w:cs="David"/>
-        </w:rPr>
-      </w:pPr>
-    </w:p>
-    <w:p>
-      <w:pPr>
-        <w:bidi/>
-        <w:spacing w:line="276" w:lineRule="auto"/>
-        <w:rPr>
-          <w:rFonts w:ascii="David" w:hAnsi="David" w:cs="David"/>
-        </w:rPr>
-      </w:pPr>
-    </w:p>
-    <w:p>
-      <w:pPr>
-        <w:bidi/>
-        <w:spacing w:line="276" w:lineRule="auto"/>
-        <w:rPr>
-          <w:rFonts w:ascii="David" w:hAnsi="David" w:cs="David"/>
-          <w:rtl/>
-        </w:rPr>
-      </w:pPr>
-    </w:p>
-    <w:p>
-      <w:pPr>
-        <w:bidi/>
-        <w:spacing w:line="276" w:lineRule="auto"/>
-        <w:rPr>
-          <w:rFonts w:ascii="David" w:hAnsi="David" w:cs="David"/>
-          <w:rtl/>
-        </w:rPr>
-      </w:pPr>
-    </w:p>
-    <w:p>
-      <w:pPr>
-        <w:bidi/>
-        <w:spacing w:line="276" w:lineRule="auto"/>
-        <w:rPr>
-          <w:rFonts w:ascii="David" w:hAnsi="David" w:cs="David"/>
-          <w:rtl/>
-        </w:rPr>
-      </w:pPr>
-    </w:p>
-    <w:p>
-      <w:pPr>
-        <w:bidi/>
-        <w:spacing w:line="276" w:lineRule="auto"/>
-        <w:rPr>
-          <w:rFonts w:ascii="David" w:hAnsi="David" w:cs="David"/>
-          <w:rtl/>
-        </w:rPr>
-      </w:pPr>
-    </w:p>
-    <w:p>
-      <w:pPr>
-        <w:bidi/>
-        <w:spacing w:line="276" w:lineRule="auto"/>
-        <w:rPr>
-          <w:rFonts w:ascii="David" w:hAnsi="David" w:cs="David"/>
-          <w:rtl/>
-        </w:rPr>
-      </w:pPr>
-    </w:p>
-    <w:p>
-      <w:pPr>
-        <w:bidi/>
-        <w:spacing w:line="276" w:lineRule="auto"/>
-        <w:rPr>
-          <w:rFonts w:ascii="David" w:hAnsi="David" w:cs="David"/>
-          <w:rtl/>
-        </w:rPr>
-      </w:pPr>
-    </w:p>
-    <w:p>
-      <w:pPr>
-        <w:bidi/>
-        <w:spacing w:line="276" w:lineRule="auto"/>
-        <w:rPr>
-          <w:rFonts w:ascii="David" w:hAnsi="David" w:cs="David"/>
-          <w:rtl/>
-        </w:rPr>
-      </w:pPr>
-    </w:p>
-    <w:p>
-      <w:pPr>
-        <w:bidi/>
-        <w:spacing w:line="276" w:lineRule="auto"/>
-        <w:rPr>
-          <w:rFonts w:ascii="David" w:hAnsi="David" w:cs="David"/>
-          <w:rtl/>
-        </w:rPr>
-      </w:pPr>
-    </w:p>
-    <w:p>
-      <w:pPr>
-        <w:bidi/>
-        <w:spacing w:line="276" w:lineRule="auto"/>
-        <w:rPr>
-          <w:rFonts w:ascii="David" w:hAnsi="David" w:cs="David"/>
-          <w:rtl/>
-        </w:rPr>
-      </w:pPr>
-    </w:p>
-    <w:p>
-      <w:pPr>
-        <w:bidi/>
-        <w:spacing w:line="276" w:lineRule="auto"/>
-        <w:rPr>
-          <w:rFonts w:ascii="David" w:hAnsi="David" w:cs="David"/>
-          <w:rtl/>
-        </w:rPr>
-      </w:pPr>
-    </w:p>
-    <w:p>
-      <w:pPr>
-        <w:bidi/>
-        <w:spacing w:line="276" w:lineRule="auto"/>
-        <w:rPr>
-          <w:rFonts w:ascii="David" w:hAnsi="David" w:cs="David"/>
-          <w:rtl/>
-        </w:rPr>
-      </w:pPr>
-    </w:p>
-    <w:p>
-      <w:pPr>
-        <w:bidi/>
-        <w:spacing w:line="276" w:lineRule="auto"/>
-        <w:rPr>
-          <w:rFonts w:ascii="David" w:hAnsi="David" w:cs="David"/>
-          <w:rtl/>
-        </w:rPr>
-      </w:pPr>
-    </w:p>
-    <w:p>
-      <w:pPr>
-        <w:bidi/>
-        <w:spacing w:line="276" w:lineRule="auto"/>
-        <w:rPr>
-          <w:rFonts w:ascii="David" w:hAnsi="David" w:cs="David"/>
-        </w:rPr>
+        </w:rPr>
+      </w:pPr>
+    </w:p>
+    <w:p>
+      <w:pPr>
+        <w:bidi/>
+        <w:spacing w:line="276" w:lineRule="auto"/>
+        <w:rPr>
+          <w:rFonts w:ascii="David" w:hAnsi="David" w:cs="David"/>
+          <w:b/>
+          <w:bCs/>
+          <w:sz w:val="32"/>
+          <w:szCs w:val="32"/>
+          <w:u w:val="single"/>
+        </w:rPr>
+      </w:pPr>
+    </w:p>
+    <w:p>
+      <w:pPr>
+        <w:bidi/>
+        <w:spacing w:line="276" w:lineRule="auto"/>
+        <w:rPr>
+          <w:rFonts w:ascii="David" w:hAnsi="David" w:cs="David"/>
+          <w:b/>
+          <w:bCs/>
+          <w:sz w:val="32"/>
+          <w:szCs w:val="32"/>
+          <w:u w:val="single"/>
+        </w:rPr>
+      </w:pPr>
+    </w:p>
+    <w:p>
+      <w:pPr>
+        <w:bidi/>
+        <w:spacing w:line="276" w:lineRule="auto"/>
+        <w:rPr>
+          <w:rFonts w:ascii="David" w:hAnsi="David" w:cs="David"/>
+          <w:b/>
+          <w:bCs/>
+          <w:sz w:val="32"/>
+          <w:szCs w:val="32"/>
+          <w:u w:val="single"/>
+        </w:rPr>
+      </w:pPr>
+    </w:p>
+    <w:p>
+      <w:pPr>
+        <w:bidi/>
+        <w:spacing w:line="276" w:lineRule="auto"/>
+        <w:rPr>
+          <w:rFonts w:ascii="David" w:hAnsi="David" w:cs="David"/>
+          <w:b/>
+          <w:bCs/>
+          <w:sz w:val="32"/>
+          <w:szCs w:val="32"/>
+          <w:u w:val="single"/>
+        </w:rPr>
+      </w:pPr>
+    </w:p>
+    <w:p>
+      <w:pPr>
+        <w:bidi/>
+        <w:spacing w:line="276" w:lineRule="auto"/>
+        <w:rPr>
+          <w:rFonts w:ascii="David" w:hAnsi="David" w:cs="David"/>
+          <w:b/>
+          <w:bCs/>
+          <w:sz w:val="32"/>
+          <w:szCs w:val="32"/>
+          <w:u w:val="single"/>
+        </w:rPr>
+      </w:pPr>
+    </w:p>
+    <w:p>
+      <w:pPr>
+        <w:bidi/>
+        <w:spacing w:line="276" w:lineRule="auto"/>
+        <w:rPr>
+          <w:rFonts w:ascii="David" w:hAnsi="David" w:cs="David"/>
+          <w:b/>
+          <w:bCs/>
+          <w:sz w:val="32"/>
+          <w:szCs w:val="32"/>
+          <w:u w:val="single"/>
+          <w:rtl/>
+        </w:rPr>
+        <w:sectPr>
+          <w:pgSz w:w="15840" w:h="12240" w:orient="landscape"/>
+          <w:pgMar w:top="1440" w:right="1440" w:bottom="1440" w:left="1440" w:header="720" w:footer="720" w:gutter="0"/>
+          <w:cols w:space="720"/>
+          <w:docGrid w:linePitch="360"/>
+        </w:sectPr>
       </w:pPr>
     </w:p>
     <w:p>
@@ -12402,16 +12361,6 @@
         </w:rPr>
         <w:t>תקשורת צד לקוח וצד שרת</w:t>
       </w:r>
-    </w:p>
-    <w:p>
-      <w:pPr>
-        <w:bidi/>
-        <w:spacing w:line="276" w:lineRule="auto"/>
-        <w:rPr>
-          <w:rFonts w:ascii="David" w:hAnsi="David" w:cs="David"/>
-          <w:rtl/>
-        </w:rPr>
-      </w:pPr>
     </w:p>
     <w:p>
       <w:pPr>
@@ -15048,7 +14997,6 @@
   <w:style w:type="character" w:default="1" w:styleId="DefaultParagraphFont">
     <w:name w:val="Default Paragraph Font"/>
     <w:uiPriority w:val="1"/>
-    <w:semiHidden/>
     <w:unhideWhenUsed/>
   </w:style>
   <w:style w:type="table" w:default="1" w:styleId="TableNormal">

</xml_diff>